<commit_message>
docs: 整理安全传感器、DM4与架构资料并移除WirelessHost旧工程（CPU2 V1.36.2.0 / CPU3 V1.36.0.0）
版本：
- CPU2：保持 V1.36.2.0
- CPU3：保持 V1.36.0.0

协议版本/兼容性：
- 未修改 CPU2/CPU3 固件、共享协议版本或参数存储版本；安全传感器 LTD 协议内容仍是前期需求沟通记录，不代表已实现或已确认兼容性。

本次修改：
- 补充安全传感器前期 LTD 协议需求沟通记录，更新安全通信落地方案和需求目录。
- 归档 CG01 V1.3、ER02 二代软件架构编制工作包、评审记录、架构文档及 Visio 源文件，并同步 CPU2 详细设计编制计划。
- 更新 DM4 四代数字驱动 V6.0 原理图详细分析及硬件资料索引。
- 删除不再保留的 WirelessHost_V4.1_init 旧工程及其 STM32F1 HAL/CMSIS 随附源码。

验证：
- 核对提交范围为 135 个文件、1711 行新增和 110037 行删除；重写提交时保持原提交 tree 完全一致。
- 本提交为资料整理与旧工程移除，未执行 CPU2/CPU3 固件构建、目标板、通信、传感器、DM4 或现场验证；文档和静态核对不替代硬件证据。
</commit_message>
<xml_diff>
--- a/docs/06_SIL功能安全认证/02_软件架构/CG01.系统架构设计-V1.2.docx
+++ b/docs/06_SIL功能安全认证/02_软件架构/CG01.系统架构设计-V1.2.docx
@@ -1,6 +1,6 @@
 
 <file path=word/document.xml><?xml version="1.0" encoding="utf-8"?>
-<w:document xmlns:wpc="http://schemas.microsoft.com/office/word/2010/wordprocessingCanvas" xmlns:mc="http://schemas.openxmlformats.org/markup-compatibility/2006" xmlns:o="urn:schemas-microsoft-com:office:office" xmlns:r="http://schemas.openxmlformats.org/officeDocument/2006/relationships" xmlns:m="http://schemas.openxmlformats.org/officeDocument/2006/math" xmlns:v="urn:schemas-microsoft-com:vml" xmlns:wp14="http://schemas.microsoft.com/office/word/2010/wordprocessingDrawing" xmlns:wp="http://schemas.openxmlformats.org/drawingml/2006/wordprocessingDrawing" xmlns:w="http://schemas.openxmlformats.org/wordprocessingml/2006/main" xmlns:w14="http://schemas.microsoft.com/office/word/2010/wordml" xmlns:w10="urn:schemas-microsoft-com:office:word" xmlns:w15="http://schemas.microsoft.com/office/word/2012/wordml" xmlns:wpg="http://schemas.microsoft.com/office/word/2010/wordprocessingGroup" xmlns:wpi="http://schemas.microsoft.com/office/word/2010/wordprocessingInk" xmlns:wne="http://schemas.microsoft.com/office/word/2006/wordml" xmlns:wps="http://schemas.microsoft.com/office/word/2010/wordprocessingShape" xmlns:wpsCustomData="http://www.wps.cn/officeDocument/2013/wpsCustomData" mc:Ignorable="w14 w15 wp14">
+<w:document xmlns:wpc="http://schemas.microsoft.com/office/word/2010/wordprocessingCanvas" xmlns:cx="http://schemas.microsoft.com/office/drawing/2014/chartex" xmlns:cx1="http://schemas.microsoft.com/office/drawing/2015/9/8/chartex" xmlns:cx2="http://schemas.microsoft.com/office/drawing/2015/10/21/chartex" xmlns:cx3="http://schemas.microsoft.com/office/drawing/2016/5/9/chartex" xmlns:cx4="http://schemas.microsoft.com/office/drawing/2016/5/10/chartex" xmlns:cx5="http://schemas.microsoft.com/office/drawing/2016/5/11/chartex" xmlns:cx6="http://schemas.microsoft.com/office/drawing/2016/5/12/chartex" xmlns:cx7="http://schemas.microsoft.com/office/drawing/2016/5/13/chartex" xmlns:cx8="http://schemas.microsoft.com/office/drawing/2016/5/14/chartex" xmlns:mc="http://schemas.openxmlformats.org/markup-compatibility/2006" xmlns:o="urn:schemas-microsoft-com:office:office" xmlns:r="http://schemas.openxmlformats.org/officeDocument/2006/relationships" xmlns:m="http://schemas.openxmlformats.org/officeDocument/2006/math" xmlns:v="urn:schemas-microsoft-com:vml" xmlns:wp14="http://schemas.microsoft.com/office/word/2010/wordprocessingDrawing" xmlns:wp="http://schemas.openxmlformats.org/drawingml/2006/wordprocessingDrawing" xmlns:w="http://schemas.openxmlformats.org/wordprocessingml/2006/main" xmlns:w14="http://schemas.microsoft.com/office/word/2010/wordml" xmlns:w10="urn:schemas-microsoft-com:office:word" xmlns:w15="http://schemas.microsoft.com/office/word/2012/wordml" xmlns:wpg="http://schemas.microsoft.com/office/word/2010/wordprocessingGroup" xmlns:wpi="http://schemas.microsoft.com/office/word/2010/wordprocessingInk" xmlns:wne="http://schemas.microsoft.com/office/word/2006/wordml" xmlns:wps="http://schemas.microsoft.com/office/word/2010/wordprocessingShape" xmlns:wpsCustomData="http://www.wps.cn/officeDocument/2013/wpsCustomData" mc:Ignorable="w14 w15 wp14">
   <w:body>
     <w:p>
       <w:pPr>
@@ -2769,7 +2769,7 @@
         <w:rPr>
           <w:szCs w:val="24"/>
         </w:rPr>
-        <w:instrText xml:space="preserve"> HYPERLINK \l _Toc7682 </w:instrText>
+        <w:instrText xml:space="preserve"> HYPERLINK \l _Toc21736 </w:instrText>
       </w:r>
       <w:r>
         <w:rPr>
@@ -2790,7 +2790,7 @@
         <w:fldChar w:fldCharType="begin"/>
       </w:r>
       <w:r>
-        <w:instrText xml:space="preserve"> PAGEREF _Toc7682 \h </w:instrText>
+        <w:instrText xml:space="preserve"> PAGEREF _Toc21736 \h </w:instrText>
       </w:r>
       <w:r>
         <w:fldChar w:fldCharType="separate"/>
@@ -2827,7 +2827,7 @@
         <w:rPr>
           <w:szCs w:val="24"/>
         </w:rPr>
-        <w:instrText xml:space="preserve"> HYPERLINK \l _Toc18638 </w:instrText>
+        <w:instrText xml:space="preserve"> HYPERLINK \l _Toc23495 </w:instrText>
       </w:r>
       <w:r>
         <w:rPr>
@@ -2848,7 +2848,7 @@
         <w:fldChar w:fldCharType="begin"/>
       </w:r>
       <w:r>
-        <w:instrText xml:space="preserve"> PAGEREF _Toc18638 \h </w:instrText>
+        <w:instrText xml:space="preserve"> PAGEREF _Toc23495 \h </w:instrText>
       </w:r>
       <w:r>
         <w:fldChar w:fldCharType="separate"/>
@@ -2885,7 +2885,7 @@
         <w:rPr>
           <w:szCs w:val="24"/>
         </w:rPr>
-        <w:instrText xml:space="preserve"> HYPERLINK \l _Toc23918 </w:instrText>
+        <w:instrText xml:space="preserve"> HYPERLINK \l _Toc9607 </w:instrText>
       </w:r>
       <w:r>
         <w:rPr>
@@ -2906,7 +2906,7 @@
         <w:fldChar w:fldCharType="begin"/>
       </w:r>
       <w:r>
-        <w:instrText xml:space="preserve"> PAGEREF _Toc23918 \h </w:instrText>
+        <w:instrText xml:space="preserve"> PAGEREF _Toc9607 \h </w:instrText>
       </w:r>
       <w:r>
         <w:fldChar w:fldCharType="separate"/>
@@ -2943,7 +2943,7 @@
         <w:rPr>
           <w:szCs w:val="24"/>
         </w:rPr>
-        <w:instrText xml:space="preserve"> HYPERLINK \l _Toc1393 </w:instrText>
+        <w:instrText xml:space="preserve"> HYPERLINK \l _Toc12832 </w:instrText>
       </w:r>
       <w:r>
         <w:rPr>
@@ -2964,7 +2964,7 @@
         <w:fldChar w:fldCharType="begin"/>
       </w:r>
       <w:r>
-        <w:instrText xml:space="preserve"> PAGEREF _Toc1393 \h </w:instrText>
+        <w:instrText xml:space="preserve"> PAGEREF _Toc12832 \h </w:instrText>
       </w:r>
       <w:r>
         <w:fldChar w:fldCharType="separate"/>
@@ -2999,7 +2999,7 @@
         <w:rPr>
           <w:szCs w:val="24"/>
         </w:rPr>
-        <w:instrText xml:space="preserve"> HYPERLINK \l _Toc11506 </w:instrText>
+        <w:instrText xml:space="preserve"> HYPERLINK \l _Toc32759 </w:instrText>
       </w:r>
       <w:r>
         <w:rPr>
@@ -3020,7 +3020,7 @@
         <w:fldChar w:fldCharType="begin"/>
       </w:r>
       <w:r>
-        <w:instrText xml:space="preserve"> PAGEREF _Toc11506 \h </w:instrText>
+        <w:instrText xml:space="preserve"> PAGEREF _Toc32759 \h </w:instrText>
       </w:r>
       <w:r>
         <w:fldChar w:fldCharType="separate"/>
@@ -3057,7 +3057,7 @@
         <w:rPr>
           <w:szCs w:val="24"/>
         </w:rPr>
-        <w:instrText xml:space="preserve"> HYPERLINK \l _Toc9284 </w:instrText>
+        <w:instrText xml:space="preserve"> HYPERLINK \l _Toc26624 </w:instrText>
       </w:r>
       <w:r>
         <w:rPr>
@@ -3079,7 +3079,7 @@
         <w:fldChar w:fldCharType="begin"/>
       </w:r>
       <w:r>
-        <w:instrText xml:space="preserve"> PAGEREF _Toc9284 \h </w:instrText>
+        <w:instrText xml:space="preserve"> PAGEREF _Toc26624 \h </w:instrText>
       </w:r>
       <w:r>
         <w:fldChar w:fldCharType="separate"/>
@@ -3116,7 +3116,7 @@
         <w:rPr>
           <w:szCs w:val="24"/>
         </w:rPr>
-        <w:instrText xml:space="preserve"> HYPERLINK \l _Toc20347 </w:instrText>
+        <w:instrText xml:space="preserve"> HYPERLINK \l _Toc30185 </w:instrText>
       </w:r>
       <w:r>
         <w:rPr>
@@ -3138,7 +3138,7 @@
         <w:fldChar w:fldCharType="begin"/>
       </w:r>
       <w:r>
-        <w:instrText xml:space="preserve"> PAGEREF _Toc20347 \h </w:instrText>
+        <w:instrText xml:space="preserve"> PAGEREF _Toc30185 \h </w:instrText>
       </w:r>
       <w:r>
         <w:fldChar w:fldCharType="separate"/>
@@ -3175,7 +3175,7 @@
         <w:rPr>
           <w:szCs w:val="24"/>
         </w:rPr>
-        <w:instrText xml:space="preserve"> HYPERLINK \l _Toc19013 </w:instrText>
+        <w:instrText xml:space="preserve"> HYPERLINK \l _Toc2581 </w:instrText>
       </w:r>
       <w:r>
         <w:rPr>
@@ -3197,13 +3197,13 @@
         <w:fldChar w:fldCharType="begin"/>
       </w:r>
       <w:r>
-        <w:instrText xml:space="preserve"> PAGEREF _Toc19013 \h </w:instrText>
+        <w:instrText xml:space="preserve"> PAGEREF _Toc2581 \h </w:instrText>
       </w:r>
       <w:r>
         <w:fldChar w:fldCharType="separate"/>
       </w:r>
       <w:r>
-        <w:t>4</w:t>
+        <w:t>5</w:t>
       </w:r>
       <w:r>
         <w:fldChar w:fldCharType="end"/>
@@ -3234,7 +3234,7 @@
         <w:rPr>
           <w:szCs w:val="24"/>
         </w:rPr>
-        <w:instrText xml:space="preserve"> HYPERLINK \l _Toc5324 </w:instrText>
+        <w:instrText xml:space="preserve"> HYPERLINK \l _Toc9230 </w:instrText>
       </w:r>
       <w:r>
         <w:rPr>
@@ -3256,13 +3256,13 @@
         <w:fldChar w:fldCharType="begin"/>
       </w:r>
       <w:r>
-        <w:instrText xml:space="preserve"> PAGEREF _Toc5324 \h </w:instrText>
+        <w:instrText xml:space="preserve"> PAGEREF _Toc9230 \h </w:instrText>
       </w:r>
       <w:r>
         <w:fldChar w:fldCharType="separate"/>
       </w:r>
       <w:r>
-        <w:t>5</w:t>
+        <w:t>6</w:t>
       </w:r>
       <w:r>
         <w:fldChar w:fldCharType="end"/>
@@ -3291,7 +3291,7 @@
         <w:rPr>
           <w:szCs w:val="24"/>
         </w:rPr>
-        <w:instrText xml:space="preserve"> HYPERLINK \l _Toc13302 </w:instrText>
+        <w:instrText xml:space="preserve"> HYPERLINK \l _Toc25114 </w:instrText>
       </w:r>
       <w:r>
         <w:rPr>
@@ -3313,7 +3313,7 @@
         <w:fldChar w:fldCharType="begin"/>
       </w:r>
       <w:r>
-        <w:instrText xml:space="preserve"> PAGEREF _Toc13302 \h </w:instrText>
+        <w:instrText xml:space="preserve"> PAGEREF _Toc25114 \h </w:instrText>
       </w:r>
       <w:r>
         <w:fldChar w:fldCharType="separate"/>
@@ -3350,7 +3350,7 @@
         <w:rPr>
           <w:szCs w:val="24"/>
         </w:rPr>
-        <w:instrText xml:space="preserve"> HYPERLINK \l _Toc3046 </w:instrText>
+        <w:instrText xml:space="preserve"> HYPERLINK \l _Toc5563 </w:instrText>
       </w:r>
       <w:r>
         <w:rPr>
@@ -3372,7 +3372,7 @@
         <w:fldChar w:fldCharType="begin"/>
       </w:r>
       <w:r>
-        <w:instrText xml:space="preserve"> PAGEREF _Toc3046 \h </w:instrText>
+        <w:instrText xml:space="preserve"> PAGEREF _Toc5563 \h </w:instrText>
       </w:r>
       <w:r>
         <w:fldChar w:fldCharType="separate"/>
@@ -3409,7 +3409,7 @@
         <w:rPr>
           <w:szCs w:val="24"/>
         </w:rPr>
-        <w:instrText xml:space="preserve"> HYPERLINK \l _Toc3773 </w:instrText>
+        <w:instrText xml:space="preserve"> HYPERLINK \l _Toc15479 </w:instrText>
       </w:r>
       <w:r>
         <w:rPr>
@@ -3431,7 +3431,7 @@
         <w:fldChar w:fldCharType="begin"/>
       </w:r>
       <w:r>
-        <w:instrText xml:space="preserve"> PAGEREF _Toc3773 \h </w:instrText>
+        <w:instrText xml:space="preserve"> PAGEREF _Toc15479 \h </w:instrText>
       </w:r>
       <w:r>
         <w:fldChar w:fldCharType="separate"/>
@@ -3468,7 +3468,7 @@
         <w:rPr>
           <w:szCs w:val="24"/>
         </w:rPr>
-        <w:instrText xml:space="preserve"> HYPERLINK \l _Toc9588 </w:instrText>
+        <w:instrText xml:space="preserve"> HYPERLINK \l _Toc8858 </w:instrText>
       </w:r>
       <w:r>
         <w:rPr>
@@ -3490,7 +3490,7 @@
         <w:fldChar w:fldCharType="begin"/>
       </w:r>
       <w:r>
-        <w:instrText xml:space="preserve"> PAGEREF _Toc9588 \h </w:instrText>
+        <w:instrText xml:space="preserve"> PAGEREF _Toc8858 \h </w:instrText>
       </w:r>
       <w:r>
         <w:fldChar w:fldCharType="separate"/>
@@ -3527,7 +3527,7 @@
         <w:rPr>
           <w:szCs w:val="24"/>
         </w:rPr>
-        <w:instrText xml:space="preserve"> HYPERLINK \l _Toc1542 </w:instrText>
+        <w:instrText xml:space="preserve"> HYPERLINK \l _Toc17311 </w:instrText>
       </w:r>
       <w:r>
         <w:rPr>
@@ -3549,13 +3549,76 @@
         <w:fldChar w:fldCharType="begin"/>
       </w:r>
       <w:r>
-        <w:instrText xml:space="preserve"> PAGEREF _Toc1542 \h </w:instrText>
+        <w:instrText xml:space="preserve"> PAGEREF _Toc17311 \h </w:instrText>
       </w:r>
       <w:r>
         <w:fldChar w:fldCharType="separate"/>
       </w:r>
       <w:r>
-        <w:t>7</w:t>
+        <w:t>8</w:t>
+      </w:r>
+      <w:r>
+        <w:fldChar w:fldCharType="end"/>
+      </w:r>
+      <w:r>
+        <w:rPr>
+          <w:szCs w:val="24"/>
+        </w:rPr>
+        <w:fldChar w:fldCharType="end"/>
+      </w:r>
+    </w:p>
+    <w:p>
+      <w:pPr>
+        <w:pStyle w:val="15"/>
+        <w:tabs>
+          <w:tab w:val="right" w:leader="dot" w:pos="8312"/>
+        </w:tabs>
+      </w:pPr>
+      <w:r>
+        <w:rPr>
+          <w:szCs w:val="24"/>
+        </w:rPr>
+        <w:fldChar w:fldCharType="begin"/>
+      </w:r>
+      <w:r>
+        <w:rPr>
+          <w:szCs w:val="24"/>
+        </w:rPr>
+        <w:instrText xml:space="preserve"> HYPERLINK \l _Toc32502 </w:instrText>
+      </w:r>
+      <w:r>
+        <w:rPr>
+          <w:szCs w:val="24"/>
+        </w:rPr>
+        <w:fldChar w:fldCharType="separate"/>
+      </w:r>
+      <w:r>
+        <w:rPr>
+          <w:rFonts w:hint="eastAsia"/>
+          <w:lang w:val="en-US" w:eastAsia="zh-CN"/>
+        </w:rPr>
+        <w:t>4. 模块通信</w:t>
+      </w:r>
+      <w:r>
+        <w:rPr>
+          <w:rFonts w:hint="eastAsia"/>
+        </w:rPr>
+        <w:t>接口</w:t>
+      </w:r>
+      <w:r>
+        <w:tab/>
+      </w:r>
+      <w:r>
+        <w:fldChar w:fldCharType="begin"/>
+      </w:r>
+      <w:r>
+        <w:instrText xml:space="preserve"> PAGEREF _Toc32502 \h </w:instrText>
+      </w:r>
+      <w:r>
+        <w:fldChar w:fldCharType="separate"/>
+      </w:r>
+      <w:r>
+        <w:t>9</w:t>
       </w:r>
       <w:r>
         <w:fldChar w:fldCharType="end"/>
@@ -3586,48 +3649,20 @@
         <w:rPr>
           <w:szCs w:val="24"/>
         </w:rPr>
-        <w:instrText xml:space="preserve"> HYPERLINK \l _Toc11998 </w:instrText>
+        <w:instrText xml:space="preserve"> HYPERLINK \l _Toc26546 </w:instrText>
       </w:r>
       <w:r>
         <w:rPr>
           <w:szCs w:val="24"/>
         </w:rPr>
         <w:fldChar w:fldCharType="separate"/>
-      </w:r>
-      <w:r>
-        <w:rPr>
-          <w:rFonts w:hint="eastAsia"/>
-          <w:lang w:val="de-DE"/>
-        </w:rPr>
-        <w:t xml:space="preserve">3.5. </w:t>
       </w:r>
       <w:r>
         <w:rPr>
           <w:rFonts w:hint="eastAsia"/>
           <w:lang w:val="en-US" w:eastAsia="zh-CN"/>
         </w:rPr>
-        <w:t>M</w:t>
-      </w:r>
-      <w:r>
-        <w:rPr>
-          <w:rFonts w:hint="eastAsia"/>
-          <w:lang w:val="de-DE"/>
-        </w:rPr>
-        <w:t>oo</w:t>
-      </w:r>
-      <w:r>
-        <w:rPr>
-          <w:rFonts w:hint="eastAsia"/>
-          <w:lang w:val="en-US" w:eastAsia="zh-CN"/>
-        </w:rPr>
-        <w:t>N</w:t>
-      </w:r>
-      <w:r>
-        <w:rPr>
-          <w:rFonts w:hint="eastAsia"/>
-          <w:lang w:val="de-DE"/>
-        </w:rPr>
-        <w:t>结构</w:t>
+        <w:t>4.1. 传感器电压采集AD转换接口</w:t>
       </w:r>
       <w:r>
         <w:tab/>
@@ -3636,82 +3671,13 @@
         <w:fldChar w:fldCharType="begin"/>
       </w:r>
       <w:r>
-        <w:instrText xml:space="preserve"> PAGEREF _Toc11998 \h </w:instrText>
+        <w:instrText xml:space="preserve"> PAGEREF _Toc26546 \h </w:instrText>
       </w:r>
       <w:r>
         <w:fldChar w:fldCharType="separate"/>
       </w:r>
       <w:r>
-        <w:t>8</w:t>
-      </w:r>
-      <w:r>
-        <w:fldChar w:fldCharType="end"/>
-      </w:r>
-      <w:r>
-        <w:rPr>
-          <w:szCs w:val="24"/>
-        </w:rPr>
-        <w:fldChar w:fldCharType="end"/>
-      </w:r>
-    </w:p>
-    <w:p>
-      <w:pPr>
-        <w:pStyle w:val="15"/>
-        <w:tabs>
-          <w:tab w:val="right" w:leader="dot" w:pos="8312"/>
-        </w:tabs>
-      </w:pPr>
-      <w:r>
-        <w:rPr>
-          <w:szCs w:val="24"/>
-        </w:rPr>
-        <w:fldChar w:fldCharType="begin"/>
-      </w:r>
-      <w:r>
-        <w:rPr>
-          <w:szCs w:val="24"/>
-        </w:rPr>
-        <w:instrText xml:space="preserve"> HYPERLINK \l _Toc27294 </w:instrText>
-      </w:r>
-      <w:r>
-        <w:rPr>
-          <w:szCs w:val="24"/>
-        </w:rPr>
-        <w:fldChar w:fldCharType="separate"/>
-      </w:r>
-      <w:r>
-        <w:rPr>
-          <w:rFonts w:hint="eastAsia"/>
-        </w:rPr>
-        <w:t xml:space="preserve">4. </w:t>
-      </w:r>
-      <w:r>
-        <w:rPr>
-          <w:rFonts w:hint="eastAsia"/>
-          <w:lang w:val="en-US" w:eastAsia="zh-CN"/>
-        </w:rPr>
-        <w:t>模块通信</w:t>
-      </w:r>
-      <w:r>
-        <w:rPr>
-          <w:rFonts w:hint="eastAsia"/>
-        </w:rPr>
-        <w:t>接口</w:t>
-      </w:r>
-      <w:r>
-        <w:tab/>
-      </w:r>
-      <w:r>
-        <w:fldChar w:fldCharType="begin"/>
-      </w:r>
-      <w:r>
-        <w:instrText xml:space="preserve"> PAGEREF _Toc27294 \h </w:instrText>
-      </w:r>
-      <w:r>
-        <w:fldChar w:fldCharType="separate"/>
-      </w:r>
-      <w:r>
-        <w:t>8</w:t>
+        <w:t>9</w:t>
       </w:r>
       <w:r>
         <w:fldChar w:fldCharType="end"/>
@@ -3742,7 +3708,7 @@
         <w:rPr>
           <w:szCs w:val="24"/>
         </w:rPr>
-        <w:instrText xml:space="preserve"> HYPERLINK \l _Toc4785 </w:instrText>
+        <w:instrText xml:space="preserve"> HYPERLINK \l _Toc15209 </w:instrText>
       </w:r>
       <w:r>
         <w:rPr>
@@ -3755,7 +3721,7 @@
           <w:rFonts w:hint="eastAsia"/>
           <w:lang w:val="en-US" w:eastAsia="zh-CN"/>
         </w:rPr>
-        <w:t>4.1. 超声传感器AD转换接口</w:t>
+        <w:t>4.2. 铁电存储器通信接口</w:t>
       </w:r>
       <w:r>
         <w:tab/>
@@ -3764,7 +3730,7 @@
         <w:fldChar w:fldCharType="begin"/>
       </w:r>
       <w:r>
-        <w:instrText xml:space="preserve"> PAGEREF _Toc4785 \h </w:instrText>
+        <w:instrText xml:space="preserve"> PAGEREF _Toc15209 \h </w:instrText>
       </w:r>
       <w:r>
         <w:fldChar w:fldCharType="separate"/>
@@ -3801,20 +3767,26 @@
         <w:rPr>
           <w:szCs w:val="24"/>
         </w:rPr>
-        <w:instrText xml:space="preserve"> HYPERLINK \l _Toc19954 </w:instrText>
+        <w:instrText xml:space="preserve"> HYPERLINK \l _Toc15348 </w:instrText>
       </w:r>
       <w:r>
         <w:rPr>
           <w:szCs w:val="24"/>
         </w:rPr>
         <w:fldChar w:fldCharType="separate"/>
+      </w:r>
+      <w:r>
+        <w:rPr>
+          <w:rFonts w:hint="eastAsia"/>
+        </w:rPr>
+        <w:t xml:space="preserve">4.3. </w:t>
       </w:r>
       <w:r>
         <w:rPr>
           <w:rFonts w:hint="eastAsia"/>
           <w:lang w:val="en-US" w:eastAsia="zh-CN"/>
         </w:rPr>
-        <w:t>4.2. 水位采集AD转换接口</w:t>
+        <w:t>4~20mA模块通信接口</w:t>
       </w:r>
       <w:r>
         <w:tab/>
@@ -3823,7 +3795,7 @@
         <w:fldChar w:fldCharType="begin"/>
       </w:r>
       <w:r>
-        <w:instrText xml:space="preserve"> PAGEREF _Toc19954 \h </w:instrText>
+        <w:instrText xml:space="preserve"> PAGEREF _Toc15348 \h </w:instrText>
       </w:r>
       <w:r>
         <w:fldChar w:fldCharType="separate"/>
@@ -3860,20 +3832,26 @@
         <w:rPr>
           <w:szCs w:val="24"/>
         </w:rPr>
-        <w:instrText xml:space="preserve"> HYPERLINK \l _Toc29045 </w:instrText>
+        <w:instrText xml:space="preserve"> HYPERLINK \l _Toc5874 </w:instrText>
       </w:r>
       <w:r>
         <w:rPr>
           <w:szCs w:val="24"/>
         </w:rPr>
         <w:fldChar w:fldCharType="separate"/>
+      </w:r>
+      <w:r>
+        <w:rPr>
+          <w:rFonts w:hint="eastAsia"/>
+        </w:rPr>
+        <w:t xml:space="preserve">4.4. </w:t>
       </w:r>
       <w:r>
         <w:rPr>
           <w:rFonts w:hint="eastAsia"/>
           <w:lang w:val="en-US" w:eastAsia="zh-CN"/>
         </w:rPr>
-        <w:t>4.3. 零点采集AD转换接口</w:t>
+        <w:t>步进电机的控制接口</w:t>
       </w:r>
       <w:r>
         <w:tab/>
@@ -3882,13 +3860,13 @@
         <w:fldChar w:fldCharType="begin"/>
       </w:r>
       <w:r>
-        <w:instrText xml:space="preserve"> PAGEREF _Toc29045 \h </w:instrText>
+        <w:instrText xml:space="preserve"> PAGEREF _Toc5874 \h </w:instrText>
       </w:r>
       <w:r>
         <w:fldChar w:fldCharType="separate"/>
       </w:r>
       <w:r>
-        <w:t>10</w:t>
+        <w:t>9</w:t>
       </w:r>
       <w:r>
         <w:fldChar w:fldCharType="end"/>
@@ -3919,20 +3897,26 @@
         <w:rPr>
           <w:szCs w:val="24"/>
         </w:rPr>
-        <w:instrText xml:space="preserve"> HYPERLINK \l _Toc30725 </w:instrText>
+        <w:instrText xml:space="preserve"> HYPERLINK \l _Toc16650 </w:instrText>
       </w:r>
       <w:r>
         <w:rPr>
           <w:szCs w:val="24"/>
         </w:rPr>
         <w:fldChar w:fldCharType="separate"/>
+      </w:r>
+      <w:r>
+        <w:rPr>
+          <w:rFonts w:hint="eastAsia"/>
+        </w:rPr>
+        <w:t xml:space="preserve">4.5. </w:t>
       </w:r>
       <w:r>
         <w:rPr>
           <w:rFonts w:hint="eastAsia"/>
           <w:lang w:val="en-US" w:eastAsia="zh-CN"/>
         </w:rPr>
-        <w:t>4.4. 传感器电压采集AD转换接口</w:t>
+        <w:t>编码器的采集接口</w:t>
       </w:r>
       <w:r>
         <w:tab/>
@@ -3941,7 +3925,7 @@
         <w:fldChar w:fldCharType="begin"/>
       </w:r>
       <w:r>
-        <w:instrText xml:space="preserve"> PAGEREF _Toc30725 \h </w:instrText>
+        <w:instrText xml:space="preserve"> PAGEREF _Toc16650 \h </w:instrText>
       </w:r>
       <w:r>
         <w:fldChar w:fldCharType="separate"/>
@@ -3978,20 +3962,26 @@
         <w:rPr>
           <w:szCs w:val="24"/>
         </w:rPr>
-        <w:instrText xml:space="preserve"> HYPERLINK \l _Toc32315 </w:instrText>
+        <w:instrText xml:space="preserve"> HYPERLINK \l _Toc24252 </w:instrText>
       </w:r>
       <w:r>
         <w:rPr>
           <w:szCs w:val="24"/>
         </w:rPr>
         <w:fldChar w:fldCharType="separate"/>
+      </w:r>
+      <w:r>
+        <w:rPr>
+          <w:rFonts w:hint="eastAsia"/>
+        </w:rPr>
+        <w:t xml:space="preserve">4.6. </w:t>
       </w:r>
       <w:r>
         <w:rPr>
           <w:rFonts w:hint="eastAsia"/>
           <w:lang w:val="en-US" w:eastAsia="zh-CN"/>
         </w:rPr>
-        <w:t>4.5. 陀螺仪通信接口</w:t>
+        <w:t>继电器输出接口</w:t>
       </w:r>
       <w:r>
         <w:tab/>
@@ -4000,7 +3990,7 @@
         <w:fldChar w:fldCharType="begin"/>
       </w:r>
       <w:r>
-        <w:instrText xml:space="preserve"> PAGEREF _Toc32315 \h </w:instrText>
+        <w:instrText xml:space="preserve"> PAGEREF _Toc24252 \h </w:instrText>
       </w:r>
       <w:r>
         <w:fldChar w:fldCharType="separate"/>
@@ -4037,20 +4027,26 @@
         <w:rPr>
           <w:szCs w:val="24"/>
         </w:rPr>
-        <w:instrText xml:space="preserve"> HYPERLINK \l _Toc5726 </w:instrText>
+        <w:instrText xml:space="preserve"> HYPERLINK \l _Toc2598 </w:instrText>
       </w:r>
       <w:r>
         <w:rPr>
           <w:szCs w:val="24"/>
         </w:rPr>
         <w:fldChar w:fldCharType="separate"/>
+      </w:r>
+      <w:r>
+        <w:rPr>
+          <w:rFonts w:hint="eastAsia"/>
+        </w:rPr>
+        <w:t xml:space="preserve">4.7. </w:t>
       </w:r>
       <w:r>
         <w:rPr>
           <w:rFonts w:hint="eastAsia"/>
           <w:lang w:val="en-US" w:eastAsia="zh-CN"/>
         </w:rPr>
-        <w:t>4.6. 铁电存储器通信接口</w:t>
+        <w:t>继电器状态采集接口</w:t>
       </w:r>
       <w:r>
         <w:tab/>
@@ -4059,7 +4055,7 @@
         <w:fldChar w:fldCharType="begin"/>
       </w:r>
       <w:r>
-        <w:instrText xml:space="preserve"> PAGEREF _Toc5726 \h </w:instrText>
+        <w:instrText xml:space="preserve"> PAGEREF _Toc2598 \h </w:instrText>
       </w:r>
       <w:r>
         <w:fldChar w:fldCharType="separate"/>
@@ -4096,7 +4092,7 @@
         <w:rPr>
           <w:szCs w:val="24"/>
         </w:rPr>
-        <w:instrText xml:space="preserve"> HYPERLINK \l _Toc9299 </w:instrText>
+        <w:instrText xml:space="preserve"> HYPERLINK \l _Toc12574 </w:instrText>
       </w:r>
       <w:r>
         <w:rPr>
@@ -4108,29 +4104,31 @@
         <w:rPr>
           <w:rFonts w:hint="eastAsia"/>
         </w:rPr>
-        <w:t xml:space="preserve">4.7. </w:t>
+        <w:t xml:space="preserve">4.8. </w:t>
       </w:r>
       <w:r>
         <w:rPr>
           <w:rFonts w:hint="eastAsia"/>
           <w:lang w:val="en-US" w:eastAsia="zh-CN"/>
         </w:rPr>
-        <w:t>4~20mA模块通信接口</w:t>
+        <w:t>主电源电压采集接口</w:t>
       </w:r>
       <w:r>
         <w:tab/>
       </w:r>
+      <w:bookmarkStart w:id="34" w:name="_GoBack"/>
+      <w:bookmarkEnd w:id="34"/>
       <w:r>
         <w:fldChar w:fldCharType="begin"/>
       </w:r>
       <w:r>
-        <w:instrText xml:space="preserve"> PAGEREF _Toc9299 \h </w:instrText>
+        <w:instrText xml:space="preserve"> PAGEREF _Toc12574 \h </w:instrText>
       </w:r>
       <w:r>
         <w:fldChar w:fldCharType="separate"/>
       </w:r>
       <w:r>
-        <w:t>11</w:t>
+        <w:t>10</w:t>
       </w:r>
       <w:r>
         <w:fldChar w:fldCharType="end"/>
@@ -4161,7 +4159,7 @@
         <w:rPr>
           <w:szCs w:val="24"/>
         </w:rPr>
-        <w:instrText xml:space="preserve"> HYPERLINK \l _Toc13130 </w:instrText>
+        <w:instrText xml:space="preserve"> HYPERLINK \l _Toc23682 </w:instrText>
       </w:r>
       <w:r>
         <w:rPr>
@@ -4173,14 +4171,14 @@
         <w:rPr>
           <w:rFonts w:hint="eastAsia"/>
         </w:rPr>
-        <w:t xml:space="preserve">4.8. </w:t>
+        <w:t xml:space="preserve">4.9. </w:t>
       </w:r>
       <w:r>
         <w:rPr>
           <w:rFonts w:hint="eastAsia"/>
           <w:lang w:val="en-US" w:eastAsia="zh-CN"/>
         </w:rPr>
-        <w:t>步进电机的控制接口</w:t>
+        <w:t>CPU1与CPU2通信串口</w:t>
       </w:r>
       <w:r>
         <w:tab/>
@@ -4189,7 +4187,7 @@
         <w:fldChar w:fldCharType="begin"/>
       </w:r>
       <w:r>
-        <w:instrText xml:space="preserve"> PAGEREF _Toc13130 \h </w:instrText>
+        <w:instrText xml:space="preserve"> PAGEREF _Toc23682 \h </w:instrText>
       </w:r>
       <w:r>
         <w:fldChar w:fldCharType="separate"/>
@@ -4226,7 +4224,7 @@
         <w:rPr>
           <w:szCs w:val="24"/>
         </w:rPr>
-        <w:instrText xml:space="preserve"> HYPERLINK \l _Toc26645 </w:instrText>
+        <w:instrText xml:space="preserve"> HYPERLINK \l _Toc26013 </w:instrText>
       </w:r>
       <w:r>
         <w:rPr>
@@ -4238,14 +4236,14 @@
         <w:rPr>
           <w:rFonts w:hint="eastAsia"/>
         </w:rPr>
-        <w:t xml:space="preserve">4.9. </w:t>
+        <w:t xml:space="preserve">4.10. </w:t>
       </w:r>
       <w:r>
         <w:rPr>
           <w:rFonts w:hint="eastAsia"/>
           <w:lang w:val="en-US" w:eastAsia="zh-CN"/>
         </w:rPr>
-        <w:t>编码器的采集接口</w:t>
+        <w:t>CPU2与CPU3通信串口</w:t>
       </w:r>
       <w:r>
         <w:tab/>
@@ -4254,7 +4252,7 @@
         <w:fldChar w:fldCharType="begin"/>
       </w:r>
       <w:r>
-        <w:instrText xml:space="preserve"> PAGEREF _Toc26645 \h </w:instrText>
+        <w:instrText xml:space="preserve"> PAGEREF _Toc26013 \h </w:instrText>
       </w:r>
       <w:r>
         <w:fldChar w:fldCharType="separate"/>
@@ -4291,7 +4289,7 @@
         <w:rPr>
           <w:szCs w:val="24"/>
         </w:rPr>
-        <w:instrText xml:space="preserve"> HYPERLINK \l _Toc16404 </w:instrText>
+        <w:instrText xml:space="preserve"> HYPERLINK \l _Toc9189 </w:instrText>
       </w:r>
       <w:r>
         <w:rPr>
@@ -4303,14 +4301,14 @@
         <w:rPr>
           <w:rFonts w:hint="eastAsia"/>
         </w:rPr>
-        <w:t xml:space="preserve">4.10. </w:t>
+        <w:t xml:space="preserve">4.11. </w:t>
       </w:r>
       <w:r>
         <w:rPr>
           <w:rFonts w:hint="eastAsia"/>
           <w:lang w:val="en-US" w:eastAsia="zh-CN"/>
         </w:rPr>
-        <w:t>继电器输出接口</w:t>
+        <w:t>CPU3与CPU4通信串口</w:t>
       </w:r>
       <w:r>
         <w:tab/>
@@ -4319,7 +4317,7 @@
         <w:fldChar w:fldCharType="begin"/>
       </w:r>
       <w:r>
-        <w:instrText xml:space="preserve"> PAGEREF _Toc16404 \h </w:instrText>
+        <w:instrText xml:space="preserve"> PAGEREF _Toc9189 \h </w:instrText>
       </w:r>
       <w:r>
         <w:fldChar w:fldCharType="separate"/>
@@ -4356,26 +4354,20 @@
         <w:rPr>
           <w:szCs w:val="24"/>
         </w:rPr>
-        <w:instrText xml:space="preserve"> HYPERLINK \l _Toc17063 </w:instrText>
+        <w:instrText xml:space="preserve"> HYPERLINK \l _Toc10740 </w:instrText>
       </w:r>
       <w:r>
         <w:rPr>
           <w:szCs w:val="24"/>
         </w:rPr>
         <w:fldChar w:fldCharType="separate"/>
-      </w:r>
-      <w:r>
-        <w:rPr>
-          <w:rFonts w:hint="eastAsia"/>
-        </w:rPr>
-        <w:t xml:space="preserve">4.11. </w:t>
       </w:r>
       <w:r>
         <w:rPr>
           <w:rFonts w:hint="eastAsia"/>
           <w:lang w:val="en-US" w:eastAsia="zh-CN"/>
         </w:rPr>
-        <w:t>继电器状态采集接口</w:t>
+        <w:t>4.12. 显示屏幕通信接口</w:t>
       </w:r>
       <w:r>
         <w:tab/>
@@ -4384,7 +4376,7 @@
         <w:fldChar w:fldCharType="begin"/>
       </w:r>
       <w:r>
-        <w:instrText xml:space="preserve"> PAGEREF _Toc17063 \h </w:instrText>
+        <w:instrText xml:space="preserve"> PAGEREF _Toc10740 \h </w:instrText>
       </w:r>
       <w:r>
         <w:fldChar w:fldCharType="separate"/>
@@ -4421,26 +4413,20 @@
         <w:rPr>
           <w:szCs w:val="24"/>
         </w:rPr>
-        <w:instrText xml:space="preserve"> HYPERLINK \l _Toc4649 </w:instrText>
+        <w:instrText xml:space="preserve"> HYPERLINK \l _Toc11261 </w:instrText>
       </w:r>
       <w:r>
         <w:rPr>
           <w:szCs w:val="24"/>
         </w:rPr>
         <w:fldChar w:fldCharType="separate"/>
-      </w:r>
-      <w:r>
-        <w:rPr>
-          <w:rFonts w:hint="eastAsia"/>
-        </w:rPr>
-        <w:t xml:space="preserve">4.12. </w:t>
       </w:r>
       <w:r>
         <w:rPr>
           <w:rFonts w:hint="eastAsia"/>
           <w:lang w:val="en-US" w:eastAsia="zh-CN"/>
         </w:rPr>
-        <w:t>主电源电压采集接口</w:t>
+        <w:t>4.13. 按键通信接口</w:t>
       </w:r>
       <w:r>
         <w:tab/>
@@ -4449,7 +4435,7 @@
         <w:fldChar w:fldCharType="begin"/>
       </w:r>
       <w:r>
-        <w:instrText xml:space="preserve"> PAGEREF _Toc4649 \h </w:instrText>
+        <w:instrText xml:space="preserve"> PAGEREF _Toc11261 \h </w:instrText>
       </w:r>
       <w:r>
         <w:fldChar w:fldCharType="separate"/>
@@ -4486,7 +4472,7 @@
         <w:rPr>
           <w:szCs w:val="24"/>
         </w:rPr>
-        <w:instrText xml:space="preserve"> HYPERLINK \l _Toc31004 </w:instrText>
+        <w:instrText xml:space="preserve"> HYPERLINK \l _Toc9330 </w:instrText>
       </w:r>
       <w:r>
         <w:rPr>
@@ -4498,14 +4484,14 @@
         <w:rPr>
           <w:rFonts w:hint="eastAsia"/>
         </w:rPr>
-        <w:t xml:space="preserve">4.13. </w:t>
+        <w:t xml:space="preserve">4.14. </w:t>
       </w:r>
       <w:r>
         <w:rPr>
           <w:rFonts w:hint="eastAsia"/>
           <w:lang w:val="en-US" w:eastAsia="zh-CN"/>
         </w:rPr>
-        <w:t>电机电流采集接口</w:t>
+        <w:t>RS485数字信号通信工程师站</w:t>
       </w:r>
       <w:r>
         <w:tab/>
@@ -4514,7 +4500,7 @@
         <w:fldChar w:fldCharType="begin"/>
       </w:r>
       <w:r>
-        <w:instrText xml:space="preserve"> PAGEREF _Toc31004 \h </w:instrText>
+        <w:instrText xml:space="preserve"> PAGEREF _Toc9330 \h </w:instrText>
       </w:r>
       <w:r>
         <w:fldChar w:fldCharType="separate"/>
@@ -4551,7 +4537,7 @@
         <w:rPr>
           <w:szCs w:val="24"/>
         </w:rPr>
-        <w:instrText xml:space="preserve"> HYPERLINK \l _Toc29257 </w:instrText>
+        <w:instrText xml:space="preserve"> HYPERLINK \l _Toc19921 </w:instrText>
       </w:r>
       <w:r>
         <w:rPr>
@@ -4563,14 +4549,14 @@
         <w:rPr>
           <w:rFonts w:hint="eastAsia"/>
         </w:rPr>
-        <w:t xml:space="preserve">4.14. </w:t>
+        <w:t xml:space="preserve">4.15. </w:t>
       </w:r>
       <w:r>
         <w:rPr>
           <w:rFonts w:hint="eastAsia"/>
           <w:lang w:val="en-US" w:eastAsia="zh-CN"/>
         </w:rPr>
-        <w:t>变送器输入接口</w:t>
+        <w:t>CPU2_Hart 数字信号通信</w:t>
       </w:r>
       <w:r>
         <w:tab/>
@@ -4579,7 +4565,7 @@
         <w:fldChar w:fldCharType="begin"/>
       </w:r>
       <w:r>
-        <w:instrText xml:space="preserve"> PAGEREF _Toc29257 \h </w:instrText>
+        <w:instrText xml:space="preserve"> PAGEREF _Toc19921 \h </w:instrText>
       </w:r>
       <w:r>
         <w:fldChar w:fldCharType="separate"/>
@@ -4616,7 +4602,7 @@
         <w:rPr>
           <w:szCs w:val="24"/>
         </w:rPr>
-        <w:instrText xml:space="preserve"> HYPERLINK \l _Toc12644 </w:instrText>
+        <w:instrText xml:space="preserve"> HYPERLINK \l _Toc11820 </w:instrText>
       </w:r>
       <w:r>
         <w:rPr>
@@ -4628,14 +4614,14 @@
         <w:rPr>
           <w:rFonts w:hint="eastAsia"/>
         </w:rPr>
-        <w:t xml:space="preserve">4.15. </w:t>
+        <w:t xml:space="preserve">4.16. </w:t>
       </w:r>
       <w:r>
         <w:rPr>
           <w:rFonts w:hint="eastAsia"/>
           <w:lang w:val="en-US" w:eastAsia="zh-CN"/>
         </w:rPr>
-        <w:t>CPU0与CPU1通信串口</w:t>
+        <w:t>CPU3_Hart 数字信号通信</w:t>
       </w:r>
       <w:r>
         <w:tab/>
@@ -4644,456 +4630,13 @@
         <w:fldChar w:fldCharType="begin"/>
       </w:r>
       <w:r>
-        <w:instrText xml:space="preserve"> PAGEREF _Toc12644 \h </w:instrText>
+        <w:instrText xml:space="preserve"> PAGEREF _Toc11820 \h </w:instrText>
       </w:r>
       <w:r>
         <w:fldChar w:fldCharType="separate"/>
       </w:r>
       <w:r>
         <w:t>13</w:t>
-      </w:r>
-      <w:r>
-        <w:fldChar w:fldCharType="end"/>
-      </w:r>
-      <w:r>
-        <w:rPr>
-          <w:szCs w:val="24"/>
-        </w:rPr>
-        <w:fldChar w:fldCharType="end"/>
-      </w:r>
-    </w:p>
-    <w:p>
-      <w:pPr>
-        <w:pStyle w:val="19"/>
-        <w:tabs>
-          <w:tab w:val="right" w:leader="dot" w:pos="8312"/>
-          <w:tab w:val="clear" w:pos="1260"/>
-          <w:tab w:val="clear" w:pos="8296"/>
-        </w:tabs>
-      </w:pPr>
-      <w:r>
-        <w:rPr>
-          <w:szCs w:val="24"/>
-        </w:rPr>
-        <w:fldChar w:fldCharType="begin"/>
-      </w:r>
-      <w:r>
-        <w:rPr>
-          <w:szCs w:val="24"/>
-        </w:rPr>
-        <w:instrText xml:space="preserve"> HYPERLINK \l _Toc5668 </w:instrText>
-      </w:r>
-      <w:r>
-        <w:rPr>
-          <w:szCs w:val="24"/>
-        </w:rPr>
-        <w:fldChar w:fldCharType="separate"/>
-      </w:r>
-      <w:r>
-        <w:rPr>
-          <w:rFonts w:hint="eastAsia"/>
-        </w:rPr>
-        <w:t xml:space="preserve">4.16. </w:t>
-      </w:r>
-      <w:r>
-        <w:rPr>
-          <w:rFonts w:hint="eastAsia"/>
-          <w:lang w:val="en-US" w:eastAsia="zh-CN"/>
-        </w:rPr>
-        <w:t>CPU1与CPU2通信串口</w:t>
-      </w:r>
-      <w:r>
-        <w:tab/>
-      </w:r>
-      <w:r>
-        <w:fldChar w:fldCharType="begin"/>
-      </w:r>
-      <w:r>
-        <w:instrText xml:space="preserve"> PAGEREF _Toc5668 \h </w:instrText>
-      </w:r>
-      <w:r>
-        <w:fldChar w:fldCharType="separate"/>
-      </w:r>
-      <w:r>
-        <w:t>13</w:t>
-      </w:r>
-      <w:r>
-        <w:fldChar w:fldCharType="end"/>
-      </w:r>
-      <w:r>
-        <w:rPr>
-          <w:szCs w:val="24"/>
-        </w:rPr>
-        <w:fldChar w:fldCharType="end"/>
-      </w:r>
-    </w:p>
-    <w:p>
-      <w:pPr>
-        <w:pStyle w:val="19"/>
-        <w:tabs>
-          <w:tab w:val="right" w:leader="dot" w:pos="8312"/>
-          <w:tab w:val="clear" w:pos="1260"/>
-          <w:tab w:val="clear" w:pos="8296"/>
-        </w:tabs>
-      </w:pPr>
-      <w:r>
-        <w:rPr>
-          <w:szCs w:val="24"/>
-        </w:rPr>
-        <w:fldChar w:fldCharType="begin"/>
-      </w:r>
-      <w:r>
-        <w:rPr>
-          <w:szCs w:val="24"/>
-        </w:rPr>
-        <w:instrText xml:space="preserve"> HYPERLINK \l _Toc23521 </w:instrText>
-      </w:r>
-      <w:r>
-        <w:rPr>
-          <w:szCs w:val="24"/>
-        </w:rPr>
-        <w:fldChar w:fldCharType="separate"/>
-      </w:r>
-      <w:r>
-        <w:rPr>
-          <w:rFonts w:hint="eastAsia"/>
-        </w:rPr>
-        <w:t xml:space="preserve">4.17. </w:t>
-      </w:r>
-      <w:r>
-        <w:rPr>
-          <w:rFonts w:hint="eastAsia"/>
-          <w:lang w:val="en-US" w:eastAsia="zh-CN"/>
-        </w:rPr>
-        <w:t>CPU2与CPU3通信串口</w:t>
-      </w:r>
-      <w:r>
-        <w:tab/>
-      </w:r>
-      <w:r>
-        <w:fldChar w:fldCharType="begin"/>
-      </w:r>
-      <w:r>
-        <w:instrText xml:space="preserve"> PAGEREF _Toc23521 \h </w:instrText>
-      </w:r>
-      <w:r>
-        <w:fldChar w:fldCharType="separate"/>
-      </w:r>
-      <w:r>
-        <w:t>13</w:t>
-      </w:r>
-      <w:r>
-        <w:fldChar w:fldCharType="end"/>
-      </w:r>
-      <w:r>
-        <w:rPr>
-          <w:szCs w:val="24"/>
-        </w:rPr>
-        <w:fldChar w:fldCharType="end"/>
-      </w:r>
-    </w:p>
-    <w:p>
-      <w:pPr>
-        <w:pStyle w:val="19"/>
-        <w:tabs>
-          <w:tab w:val="right" w:leader="dot" w:pos="8312"/>
-          <w:tab w:val="clear" w:pos="1260"/>
-          <w:tab w:val="clear" w:pos="8296"/>
-        </w:tabs>
-      </w:pPr>
-      <w:r>
-        <w:rPr>
-          <w:szCs w:val="24"/>
-        </w:rPr>
-        <w:fldChar w:fldCharType="begin"/>
-      </w:r>
-      <w:r>
-        <w:rPr>
-          <w:szCs w:val="24"/>
-        </w:rPr>
-        <w:instrText xml:space="preserve"> HYPERLINK \l _Toc24610 </w:instrText>
-      </w:r>
-      <w:r>
-        <w:rPr>
-          <w:szCs w:val="24"/>
-        </w:rPr>
-        <w:fldChar w:fldCharType="separate"/>
-      </w:r>
-      <w:r>
-        <w:rPr>
-          <w:rFonts w:hint="eastAsia"/>
-          <w:lang w:val="en-US" w:eastAsia="zh-CN"/>
-        </w:rPr>
-        <w:t>4.18. 显示屏幕通信接口</w:t>
-      </w:r>
-      <w:r>
-        <w:tab/>
-      </w:r>
-      <w:r>
-        <w:fldChar w:fldCharType="begin"/>
-      </w:r>
-      <w:r>
-        <w:instrText xml:space="preserve"> PAGEREF _Toc24610 \h </w:instrText>
-      </w:r>
-      <w:r>
-        <w:fldChar w:fldCharType="separate"/>
-      </w:r>
-      <w:r>
-        <w:t>13</w:t>
-      </w:r>
-      <w:r>
-        <w:fldChar w:fldCharType="end"/>
-      </w:r>
-      <w:r>
-        <w:rPr>
-          <w:szCs w:val="24"/>
-        </w:rPr>
-        <w:fldChar w:fldCharType="end"/>
-      </w:r>
-    </w:p>
-    <w:p>
-      <w:pPr>
-        <w:pStyle w:val="19"/>
-        <w:tabs>
-          <w:tab w:val="right" w:leader="dot" w:pos="8312"/>
-          <w:tab w:val="clear" w:pos="1260"/>
-          <w:tab w:val="clear" w:pos="8296"/>
-        </w:tabs>
-      </w:pPr>
-      <w:r>
-        <w:rPr>
-          <w:szCs w:val="24"/>
-        </w:rPr>
-        <w:fldChar w:fldCharType="begin"/>
-      </w:r>
-      <w:r>
-        <w:rPr>
-          <w:szCs w:val="24"/>
-        </w:rPr>
-        <w:instrText xml:space="preserve"> HYPERLINK \l _Toc32425 </w:instrText>
-      </w:r>
-      <w:r>
-        <w:rPr>
-          <w:szCs w:val="24"/>
-        </w:rPr>
-        <w:fldChar w:fldCharType="separate"/>
-      </w:r>
-      <w:r>
-        <w:rPr>
-          <w:rFonts w:hint="eastAsia"/>
-          <w:lang w:val="en-US" w:eastAsia="zh-CN"/>
-        </w:rPr>
-        <w:t>4.19. 按键通信接口</w:t>
-      </w:r>
-      <w:r>
-        <w:tab/>
-      </w:r>
-      <w:r>
-        <w:fldChar w:fldCharType="begin"/>
-      </w:r>
-      <w:r>
-        <w:instrText xml:space="preserve"> PAGEREF _Toc32425 \h </w:instrText>
-      </w:r>
-      <w:r>
-        <w:fldChar w:fldCharType="separate"/>
-      </w:r>
-      <w:r>
-        <w:t>14</w:t>
-      </w:r>
-      <w:r>
-        <w:fldChar w:fldCharType="end"/>
-      </w:r>
-      <w:r>
-        <w:rPr>
-          <w:szCs w:val="24"/>
-        </w:rPr>
-        <w:fldChar w:fldCharType="end"/>
-      </w:r>
-    </w:p>
-    <w:p>
-      <w:pPr>
-        <w:pStyle w:val="19"/>
-        <w:tabs>
-          <w:tab w:val="right" w:leader="dot" w:pos="8312"/>
-          <w:tab w:val="clear" w:pos="1260"/>
-          <w:tab w:val="clear" w:pos="8296"/>
-        </w:tabs>
-      </w:pPr>
-      <w:r>
-        <w:rPr>
-          <w:szCs w:val="24"/>
-        </w:rPr>
-        <w:fldChar w:fldCharType="begin"/>
-      </w:r>
-      <w:r>
-        <w:rPr>
-          <w:szCs w:val="24"/>
-        </w:rPr>
-        <w:instrText xml:space="preserve"> HYPERLINK \l _Toc24099 </w:instrText>
-      </w:r>
-      <w:r>
-        <w:rPr>
-          <w:szCs w:val="24"/>
-        </w:rPr>
-        <w:fldChar w:fldCharType="separate"/>
-      </w:r>
-      <w:r>
-        <w:rPr>
-          <w:rFonts w:hint="eastAsia"/>
-        </w:rPr>
-        <w:t xml:space="preserve">4.20. </w:t>
-      </w:r>
-      <w:r>
-        <w:rPr>
-          <w:rFonts w:hint="eastAsia"/>
-          <w:lang w:val="en-US" w:eastAsia="zh-CN"/>
-        </w:rPr>
-        <w:t>多点温度采集的接口</w:t>
-      </w:r>
-      <w:r>
-        <w:tab/>
-      </w:r>
-      <w:r>
-        <w:fldChar w:fldCharType="begin"/>
-      </w:r>
-      <w:r>
-        <w:instrText xml:space="preserve"> PAGEREF _Toc24099 \h </w:instrText>
-      </w:r>
-      <w:r>
-        <w:fldChar w:fldCharType="separate"/>
-      </w:r>
-      <w:r>
-        <w:t>14</w:t>
-      </w:r>
-      <w:r>
-        <w:fldChar w:fldCharType="end"/>
-      </w:r>
-      <w:r>
-        <w:rPr>
-          <w:szCs w:val="24"/>
-        </w:rPr>
-        <w:fldChar w:fldCharType="end"/>
-      </w:r>
-    </w:p>
-    <w:p>
-      <w:pPr>
-        <w:pStyle w:val="19"/>
-        <w:tabs>
-          <w:tab w:val="right" w:leader="dot" w:pos="8312"/>
-          <w:tab w:val="clear" w:pos="1260"/>
-          <w:tab w:val="clear" w:pos="8296"/>
-        </w:tabs>
-      </w:pPr>
-      <w:r>
-        <w:rPr>
-          <w:szCs w:val="24"/>
-        </w:rPr>
-        <w:fldChar w:fldCharType="begin"/>
-      </w:r>
-      <w:r>
-        <w:rPr>
-          <w:szCs w:val="24"/>
-        </w:rPr>
-        <w:instrText xml:space="preserve"> HYPERLINK \l _Toc6068 </w:instrText>
-      </w:r>
-      <w:r>
-        <w:rPr>
-          <w:szCs w:val="24"/>
-        </w:rPr>
-        <w:fldChar w:fldCharType="separate"/>
-      </w:r>
-      <w:r>
-        <w:rPr>
-          <w:rFonts w:hint="eastAsia"/>
-        </w:rPr>
-        <w:t xml:space="preserve">4.21. </w:t>
-      </w:r>
-      <w:r>
-        <w:rPr>
-          <w:rFonts w:hint="eastAsia"/>
-          <w:lang w:val="en-US" w:eastAsia="zh-CN"/>
-        </w:rPr>
-        <w:t>RS485数字信号通信工程师站</w:t>
-      </w:r>
-      <w:r>
-        <w:tab/>
-      </w:r>
-      <w:r>
-        <w:fldChar w:fldCharType="begin"/>
-      </w:r>
-      <w:r>
-        <w:instrText xml:space="preserve"> PAGEREF _Toc6068 \h </w:instrText>
-      </w:r>
-      <w:r>
-        <w:fldChar w:fldCharType="separate"/>
-      </w:r>
-      <w:r>
-        <w:t>14</w:t>
-      </w:r>
-      <w:r>
-        <w:fldChar w:fldCharType="end"/>
-      </w:r>
-      <w:r>
-        <w:rPr>
-          <w:szCs w:val="24"/>
-        </w:rPr>
-        <w:fldChar w:fldCharType="end"/>
-      </w:r>
-    </w:p>
-    <w:p>
-      <w:pPr>
-        <w:pStyle w:val="19"/>
-        <w:tabs>
-          <w:tab w:val="right" w:leader="dot" w:pos="8312"/>
-          <w:tab w:val="clear" w:pos="1260"/>
-          <w:tab w:val="clear" w:pos="8296"/>
-        </w:tabs>
-      </w:pPr>
-      <w:r>
-        <w:rPr>
-          <w:szCs w:val="24"/>
-        </w:rPr>
-        <w:fldChar w:fldCharType="begin"/>
-      </w:r>
-      <w:r>
-        <w:rPr>
-          <w:szCs w:val="24"/>
-        </w:rPr>
-        <w:instrText xml:space="preserve"> HYPERLINK \l _Toc1910 </w:instrText>
-      </w:r>
-      <w:r>
-        <w:rPr>
-          <w:szCs w:val="24"/>
-        </w:rPr>
-        <w:fldChar w:fldCharType="separate"/>
-      </w:r>
-      <w:r>
-        <w:rPr>
-          <w:rFonts w:hint="eastAsia"/>
-        </w:rPr>
-        <w:t xml:space="preserve">4.22. </w:t>
-      </w:r>
-      <w:r>
-        <w:rPr>
-          <w:rFonts w:hint="eastAsia"/>
-          <w:lang w:val="en-US" w:eastAsia="zh-CN"/>
-        </w:rPr>
-        <w:t>Hart HO及Hart SL数字信号通信</w:t>
-      </w:r>
-      <w:r>
-        <w:tab/>
-      </w:r>
-      <w:r>
-        <w:fldChar w:fldCharType="begin"/>
-      </w:r>
-      <w:r>
-        <w:instrText xml:space="preserve"> PAGEREF _Toc1910 \h </w:instrText>
-      </w:r>
-      <w:r>
-        <w:fldChar w:fldCharType="separate"/>
-      </w:r>
-      <w:r>
-        <w:t>14</w:t>
       </w:r>
       <w:r>
         <w:fldChar w:fldCharType="end"/>
@@ -5122,7 +4665,7 @@
         <w:rPr>
           <w:szCs w:val="24"/>
         </w:rPr>
-        <w:instrText xml:space="preserve"> HYPERLINK \l _Toc13696 </w:instrText>
+        <w:instrText xml:space="preserve"> HYPERLINK \l _Toc31140 </w:instrText>
       </w:r>
       <w:r>
         <w:rPr>
@@ -5150,13 +4693,13 @@
         <w:fldChar w:fldCharType="begin"/>
       </w:r>
       <w:r>
-        <w:instrText xml:space="preserve"> PAGEREF _Toc13696 \h </w:instrText>
+        <w:instrText xml:space="preserve"> PAGEREF _Toc31140 \h </w:instrText>
       </w:r>
       <w:r>
         <w:fldChar w:fldCharType="separate"/>
       </w:r>
       <w:r>
-        <w:t>15</w:t>
+        <w:t>13</w:t>
       </w:r>
       <w:r>
         <w:fldChar w:fldCharType="end"/>
@@ -5223,7 +4766,7 @@
           <w:rFonts w:hint="eastAsia"/>
         </w:rPr>
       </w:pPr>
-      <w:bookmarkStart w:id="0" w:name="_Toc7682"/>
+      <w:bookmarkStart w:id="0" w:name="_Toc21736"/>
       <w:r>
         <w:rPr>
           <w:rFonts w:hint="eastAsia"/>
@@ -5239,7 +4782,7 @@
           <w:rFonts w:hint="eastAsia"/>
         </w:rPr>
       </w:pPr>
-      <w:bookmarkStart w:id="1" w:name="_Toc18638"/>
+      <w:bookmarkStart w:id="1" w:name="_Toc23495"/>
       <w:r>
         <w:rPr>
           <w:rFonts w:hint="eastAsia"/>
@@ -5320,7 +4863,7 @@
           <w:rFonts w:hint="eastAsia"/>
         </w:rPr>
       </w:pPr>
-      <w:bookmarkStart w:id="2" w:name="_Toc23918"/>
+      <w:bookmarkStart w:id="2" w:name="_Toc9607"/>
       <w:r>
         <w:rPr>
           <w:rFonts w:hint="eastAsia"/>
@@ -5812,7 +5355,7 @@
           <w:rFonts w:hint="eastAsia"/>
         </w:rPr>
       </w:pPr>
-      <w:bookmarkStart w:id="3" w:name="_Toc1393"/>
+      <w:bookmarkStart w:id="3" w:name="_Toc12832"/>
       <w:r>
         <w:rPr>
           <w:rFonts w:hint="eastAsia"/>
@@ -5852,7 +5395,7 @@
           <w:rFonts w:hint="eastAsia"/>
         </w:rPr>
       </w:pPr>
-      <w:bookmarkStart w:id="4" w:name="_Toc11506"/>
+      <w:bookmarkStart w:id="4" w:name="_Toc32759"/>
       <w:r>
         <w:rPr>
           <w:rFonts w:hint="eastAsia"/>
@@ -5870,7 +5413,7 @@
           <w:lang w:val="en-US" w:eastAsia="zh-CN"/>
         </w:rPr>
       </w:pPr>
-      <w:bookmarkStart w:id="5" w:name="_Toc9284"/>
+      <w:bookmarkStart w:id="5" w:name="_Toc26624"/>
       <w:r>
         <w:rPr>
           <w:rFonts w:hint="eastAsia"/>
@@ -6435,7 +5978,7 @@
           <w:lang w:val="en-US" w:eastAsia="zh-CN"/>
         </w:rPr>
       </w:pPr>
-      <w:bookmarkStart w:id="6" w:name="_Toc20347"/>
+      <w:bookmarkStart w:id="6" w:name="_Toc30185"/>
       <w:r>
         <w:rPr>
           <w:rFonts w:hint="eastAsia"/>
@@ -6861,7 +6404,7 @@
             </w:pPr>
             <w:r>
               <w:object>
-                <v:shape id="_x0000_i1026" o:spt="75" alt="" type="#_x0000_t75" style="height:596.5pt;width:350.3pt;" o:ole="t" filled="f" o:preferrelative="t" stroked="f" coordsize="21600,21600">
+                <v:shape id="_x0000_i1026" o:spt="75" type="#_x0000_t75" style="height:650.05pt;width:353pt;" o:ole="t" filled="f" o:preferrelative="t" stroked="f" coordsize="21600,21600">
                   <v:path/>
                   <v:fill on="f" focussize="0,0"/>
                   <v:stroke on="f"/>
@@ -6979,18 +6522,7 @@
                 <w:szCs w:val="21"/>
                 <w:lang w:val="en-US" w:eastAsia="zh-CN"/>
               </w:rPr>
-              <w:t>安全功能部分：电源(PWOER)、电压采集(V ACQ)、处理器（CPU2）、铁电（FRAM1）、模拟输出（AO）、数字输出（DO1、DO2</w:t>
-            </w:r>
-            <w:bookmarkStart w:id="32" w:name="_GoBack"/>
-            <w:bookmarkEnd w:id="32"/>
-            <w:r>
-              <w:rPr>
-                <w:rFonts w:hint="eastAsia"/>
-                <w:sz w:val="21"/>
-                <w:szCs w:val="21"/>
-                <w:lang w:val="en-US" w:eastAsia="zh-CN"/>
-              </w:rPr>
-              <w:t>）、编码器（ENCODE）、电机和驱动(DRIVER)、电机电流检测（CUR ACQ）、液位/压力的采集（AI）、液位测量（DR/ACQ1、2）、水位测量（WATER）；</w:t>
+              <w:t>安全功能部分：电源(PWOER)、电压采集(V ACQ)、处理器（CPU2）、铁电（FRAM1）、模拟输出（AO）、数字输出（DO1、DO2）、编码器（ENCODE）、电机和驱动(DRIVER)、电机电流检测（CUR ACQ）、液位/压力的采集（AI）、液位测量（DR/ACQ1、2）、水位测量（WATER）；</w:t>
             </w:r>
           </w:p>
           <w:p>
@@ -7072,6 +6604,7 @@
                   <w:insideH w:val="none" w:color="auto" w:sz="0" w:space="0"/>
                   <w:insideV w:val="none" w:color="auto" w:sz="0" w:space="0"/>
                 </w:tblBorders>
+                <w:shd w:val="clear" w:color="auto" w:fill="auto"/>
                 <w:tblCellMar>
                   <w:top w:w="0" w:type="dxa"/>
                   <w:left w:w="108" w:type="dxa"/>
@@ -8995,6 +8528,20 @@
                       <w:lang w:val="en-US" w:eastAsia="zh-CN" w:bidi="ar"/>
                     </w:rPr>
                   </w:pPr>
+                  <w:r>
+                    <w:rPr>
+                      <w:rFonts w:hint="eastAsia" w:ascii="华文楷体" w:hAnsi="华文楷体" w:cs="华文楷体"/>
+                      <w:i w:val="0"/>
+                      <w:iCs w:val="0"/>
+                      <w:color w:val="000000"/>
+                      <w:kern w:val="0"/>
+                      <w:sz w:val="21"/>
+                      <w:szCs w:val="21"/>
+                      <w:u w:val="none"/>
+                      <w:lang w:val="en-US" w:eastAsia="zh-CN" w:bidi="ar"/>
+                    </w:rPr>
+                    <w:t>主控板电压监测</w:t>
+                  </w:r>
                 </w:p>
               </w:tc>
             </w:tr>
@@ -9103,6 +8650,20 @@
                       <w:lang w:val="en-US" w:eastAsia="zh-CN" w:bidi="ar"/>
                     </w:rPr>
                   </w:pPr>
+                  <w:r>
+                    <w:rPr>
+                      <w:rFonts w:hint="eastAsia" w:ascii="华文楷体" w:hAnsi="华文楷体" w:cs="华文楷体"/>
+                      <w:i w:val="0"/>
+                      <w:iCs w:val="0"/>
+                      <w:color w:val="000000"/>
+                      <w:kern w:val="0"/>
+                      <w:sz w:val="21"/>
+                      <w:szCs w:val="21"/>
+                      <w:u w:val="none"/>
+                      <w:lang w:val="en-US" w:eastAsia="zh-CN" w:bidi="ar"/>
+                    </w:rPr>
+                    <w:t>传感器电压监测</w:t>
+                  </w:r>
                 </w:p>
               </w:tc>
             </w:tr>
@@ -10244,6 +9805,372 @@
                     <w:jc w:val="center"/>
                     <w:textAlignment w:val="center"/>
                     <w:rPr>
+                      <w:rFonts w:hint="default" w:ascii="华文楷体" w:hAnsi="华文楷体" w:eastAsia="华文楷体" w:cs="华文楷体"/>
+                      <w:b/>
+                      <w:bCs/>
+                      <w:i w:val="0"/>
+                      <w:iCs w:val="0"/>
+                      <w:color w:val="000000"/>
+                      <w:kern w:val="0"/>
+                      <w:sz w:val="21"/>
+                      <w:szCs w:val="21"/>
+                      <w:u w:val="none"/>
+                      <w:lang w:val="en-US" w:eastAsia="zh-CN" w:bidi="ar"/>
+                    </w:rPr>
+                  </w:pPr>
+                  <w:r>
+                    <w:rPr>
+                      <w:rFonts w:hint="eastAsia" w:ascii="华文楷体" w:hAnsi="华文楷体" w:cs="华文楷体"/>
+                      <w:b/>
+                      <w:bCs/>
+                      <w:i w:val="0"/>
+                      <w:iCs w:val="0"/>
+                      <w:color w:val="000000"/>
+                      <w:kern w:val="0"/>
+                      <w:sz w:val="21"/>
+                      <w:szCs w:val="21"/>
+                      <w:u w:val="none"/>
+                      <w:lang w:val="en-US" w:eastAsia="zh-CN" w:bidi="ar"/>
+                    </w:rPr>
+                    <w:t>HALL</w:t>
+                  </w:r>
+                </w:p>
+              </w:tc>
+              <w:tc>
+                <w:tcPr>
+                  <w:tcW w:w="5884" w:type="dxa"/>
+                  <w:tcBorders>
+                    <w:top w:val="single" w:color="000000" w:sz="4" w:space="0"/>
+                    <w:left w:val="single" w:color="000000" w:sz="4" w:space="0"/>
+                    <w:bottom w:val="single" w:color="000000" w:sz="4" w:space="0"/>
+                    <w:right w:val="single" w:color="000000" w:sz="4" w:space="0"/>
+                  </w:tcBorders>
+                  <w:shd w:val="clear" w:color="auto" w:fill="auto"/>
+                  <w:vAlign w:val="center"/>
+                </w:tcPr>
+                <w:p>
+                  <w:pPr>
+                    <w:keepNext w:val="0"/>
+                    <w:keepLines w:val="0"/>
+                    <w:widowControl/>
+                    <w:suppressLineNumbers w:val="0"/>
+                    <w:jc w:val="left"/>
+                    <w:textAlignment w:val="center"/>
+                    <w:rPr>
+                      <w:rFonts w:hint="default" w:ascii="华文楷体" w:hAnsi="华文楷体" w:cs="华文楷体"/>
+                      <w:i w:val="0"/>
+                      <w:iCs w:val="0"/>
+                      <w:color w:val="000000"/>
+                      <w:kern w:val="0"/>
+                      <w:sz w:val="21"/>
+                      <w:szCs w:val="21"/>
+                      <w:u w:val="none"/>
+                      <w:lang w:val="en-US" w:eastAsia="zh-CN" w:bidi="ar"/>
+                    </w:rPr>
+                  </w:pPr>
+                  <w:r>
+                    <w:rPr>
+                      <w:rFonts w:hint="eastAsia" w:ascii="华文楷体" w:hAnsi="华文楷体" w:cs="华文楷体"/>
+                      <w:i w:val="0"/>
+                      <w:iCs w:val="0"/>
+                      <w:color w:val="000000"/>
+                      <w:kern w:val="0"/>
+                      <w:sz w:val="21"/>
+                      <w:szCs w:val="21"/>
+                      <w:u w:val="none"/>
+                      <w:lang w:val="en-US" w:eastAsia="zh-CN" w:bidi="ar"/>
+                    </w:rPr>
+                    <w:t>感知磁场强度，用于磁零点检测</w:t>
+                  </w:r>
+                </w:p>
+              </w:tc>
+            </w:tr>
+            <w:tr>
+              <w:tblPrEx>
+                <w:tblBorders>
+                  <w:top w:val="none" w:color="auto" w:sz="0" w:space="0"/>
+                  <w:left w:val="none" w:color="auto" w:sz="0" w:space="0"/>
+                  <w:bottom w:val="none" w:color="auto" w:sz="0" w:space="0"/>
+                  <w:right w:val="none" w:color="auto" w:sz="0" w:space="0"/>
+                  <w:insideH w:val="none" w:color="auto" w:sz="0" w:space="0"/>
+                  <w:insideV w:val="none" w:color="auto" w:sz="0" w:space="0"/>
+                </w:tblBorders>
+                <w:shd w:val="clear" w:color="auto" w:fill="auto"/>
+                <w:tblCellMar>
+                  <w:top w:w="0" w:type="dxa"/>
+                  <w:left w:w="108" w:type="dxa"/>
+                  <w:bottom w:w="0" w:type="dxa"/>
+                  <w:right w:w="108" w:type="dxa"/>
+                </w:tblCellMar>
+              </w:tblPrEx>
+              <w:trPr>
+                <w:trHeight w:val="300" w:hRule="atLeast"/>
+              </w:trPr>
+              <w:tc>
+                <w:tcPr>
+                  <w:tcW w:w="1420" w:type="dxa"/>
+                  <w:tcBorders>
+                    <w:top w:val="single" w:color="000000" w:sz="4" w:space="0"/>
+                    <w:left w:val="single" w:color="000000" w:sz="4" w:space="0"/>
+                    <w:bottom w:val="single" w:color="000000" w:sz="4" w:space="0"/>
+                    <w:right w:val="single" w:color="000000" w:sz="4" w:space="0"/>
+                  </w:tcBorders>
+                  <w:shd w:val="clear" w:color="auto" w:fill="auto"/>
+                  <w:vAlign w:val="center"/>
+                </w:tcPr>
+                <w:p>
+                  <w:pPr>
+                    <w:keepNext w:val="0"/>
+                    <w:keepLines w:val="0"/>
+                    <w:widowControl/>
+                    <w:suppressLineNumbers w:val="0"/>
+                    <w:jc w:val="center"/>
+                    <w:textAlignment w:val="center"/>
+                    <w:rPr>
+                      <w:rFonts w:hint="default" w:ascii="华文楷体" w:hAnsi="华文楷体" w:eastAsia="华文楷体" w:cs="华文楷体"/>
+                      <w:b/>
+                      <w:bCs/>
+                      <w:i w:val="0"/>
+                      <w:iCs w:val="0"/>
+                      <w:color w:val="000000"/>
+                      <w:kern w:val="0"/>
+                      <w:sz w:val="21"/>
+                      <w:szCs w:val="21"/>
+                      <w:u w:val="none"/>
+                      <w:lang w:val="en-US" w:eastAsia="zh-CN" w:bidi="ar"/>
+                    </w:rPr>
+                  </w:pPr>
+                  <w:r>
+                    <w:rPr>
+                      <w:rFonts w:hint="eastAsia" w:ascii="华文楷体" w:hAnsi="华文楷体" w:cs="华文楷体"/>
+                      <w:b/>
+                      <w:bCs/>
+                      <w:i w:val="0"/>
+                      <w:iCs w:val="0"/>
+                      <w:color w:val="000000"/>
+                      <w:kern w:val="0"/>
+                      <w:sz w:val="21"/>
+                      <w:szCs w:val="21"/>
+                      <w:u w:val="none"/>
+                      <w:lang w:val="en-US" w:eastAsia="zh-CN" w:bidi="ar"/>
+                    </w:rPr>
+                    <w:t>WATER SEN</w:t>
+                  </w:r>
+                </w:p>
+              </w:tc>
+              <w:tc>
+                <w:tcPr>
+                  <w:tcW w:w="5884" w:type="dxa"/>
+                  <w:tcBorders>
+                    <w:top w:val="single" w:color="000000" w:sz="4" w:space="0"/>
+                    <w:left w:val="single" w:color="000000" w:sz="4" w:space="0"/>
+                    <w:bottom w:val="single" w:color="000000" w:sz="4" w:space="0"/>
+                    <w:right w:val="single" w:color="000000" w:sz="4" w:space="0"/>
+                  </w:tcBorders>
+                  <w:shd w:val="clear" w:color="auto" w:fill="auto"/>
+                  <w:vAlign w:val="center"/>
+                </w:tcPr>
+                <w:p>
+                  <w:pPr>
+                    <w:keepNext w:val="0"/>
+                    <w:keepLines w:val="0"/>
+                    <w:widowControl/>
+                    <w:suppressLineNumbers w:val="0"/>
+                    <w:jc w:val="left"/>
+                    <w:textAlignment w:val="center"/>
+                    <w:rPr>
+                      <w:rFonts w:hint="eastAsia" w:ascii="华文楷体" w:hAnsi="华文楷体" w:cs="华文楷体"/>
+                      <w:i w:val="0"/>
+                      <w:iCs w:val="0"/>
+                      <w:color w:val="000000"/>
+                      <w:kern w:val="0"/>
+                      <w:sz w:val="21"/>
+                      <w:szCs w:val="21"/>
+                      <w:u w:val="none"/>
+                      <w:lang w:val="en-US" w:eastAsia="zh-CN" w:bidi="ar"/>
+                    </w:rPr>
+                  </w:pPr>
+                  <w:r>
+                    <w:rPr>
+                      <w:rFonts w:hint="eastAsia" w:ascii="华文楷体" w:hAnsi="华文楷体" w:cs="华文楷体"/>
+                      <w:i w:val="0"/>
+                      <w:iCs w:val="0"/>
+                      <w:color w:val="000000"/>
+                      <w:kern w:val="0"/>
+                      <w:sz w:val="21"/>
+                      <w:szCs w:val="21"/>
+                      <w:u w:val="none"/>
+                      <w:lang w:val="en-US" w:eastAsia="zh-CN" w:bidi="ar"/>
+                    </w:rPr>
+                    <w:t>通过电容原理测水。</w:t>
+                  </w:r>
+                </w:p>
+              </w:tc>
+            </w:tr>
+            <w:tr>
+              <w:tblPrEx>
+                <w:tblBorders>
+                  <w:top w:val="none" w:color="auto" w:sz="0" w:space="0"/>
+                  <w:left w:val="none" w:color="auto" w:sz="0" w:space="0"/>
+                  <w:bottom w:val="none" w:color="auto" w:sz="0" w:space="0"/>
+                  <w:right w:val="none" w:color="auto" w:sz="0" w:space="0"/>
+                  <w:insideH w:val="none" w:color="auto" w:sz="0" w:space="0"/>
+                  <w:insideV w:val="none" w:color="auto" w:sz="0" w:space="0"/>
+                </w:tblBorders>
+                <w:shd w:val="clear" w:color="auto" w:fill="auto"/>
+                <w:tblCellMar>
+                  <w:top w:w="0" w:type="dxa"/>
+                  <w:left w:w="108" w:type="dxa"/>
+                  <w:bottom w:w="0" w:type="dxa"/>
+                  <w:right w:w="108" w:type="dxa"/>
+                </w:tblCellMar>
+              </w:tblPrEx>
+              <w:trPr>
+                <w:trHeight w:val="300" w:hRule="atLeast"/>
+              </w:trPr>
+              <w:tc>
+                <w:tcPr>
+                  <w:tcW w:w="1420" w:type="dxa"/>
+                  <w:tcBorders>
+                    <w:top w:val="single" w:color="000000" w:sz="4" w:space="0"/>
+                    <w:left w:val="single" w:color="000000" w:sz="4" w:space="0"/>
+                    <w:bottom w:val="single" w:color="000000" w:sz="4" w:space="0"/>
+                    <w:right w:val="single" w:color="000000" w:sz="4" w:space="0"/>
+                  </w:tcBorders>
+                  <w:shd w:val="clear" w:color="auto" w:fill="auto"/>
+                  <w:vAlign w:val="center"/>
+                </w:tcPr>
+                <w:p>
+                  <w:pPr>
+                    <w:keepNext w:val="0"/>
+                    <w:keepLines w:val="0"/>
+                    <w:widowControl/>
+                    <w:suppressLineNumbers w:val="0"/>
+                    <w:jc w:val="center"/>
+                    <w:textAlignment w:val="center"/>
+                    <w:rPr>
+                      <w:rFonts w:hint="default" w:ascii="华文楷体" w:hAnsi="华文楷体" w:eastAsia="华文楷体" w:cs="华文楷体"/>
+                      <w:b/>
+                      <w:bCs/>
+                      <w:i w:val="0"/>
+                      <w:iCs w:val="0"/>
+                      <w:color w:val="000000"/>
+                      <w:kern w:val="0"/>
+                      <w:sz w:val="21"/>
+                      <w:szCs w:val="21"/>
+                      <w:u w:val="none"/>
+                      <w:lang w:val="en-US" w:eastAsia="zh-CN" w:bidi="ar"/>
+                    </w:rPr>
+                  </w:pPr>
+                  <w:r>
+                    <w:rPr>
+                      <w:rFonts w:hint="eastAsia" w:ascii="华文楷体" w:hAnsi="华文楷体" w:cs="华文楷体"/>
+                      <w:b/>
+                      <w:bCs/>
+                      <w:i w:val="0"/>
+                      <w:iCs w:val="0"/>
+                      <w:color w:val="000000"/>
+                      <w:kern w:val="0"/>
+                      <w:sz w:val="21"/>
+                      <w:szCs w:val="21"/>
+                      <w:u w:val="none"/>
+                      <w:lang w:val="en-US" w:eastAsia="zh-CN" w:bidi="ar"/>
+                    </w:rPr>
+                    <w:t>AAM</w:t>
+                  </w:r>
+                </w:p>
+              </w:tc>
+              <w:tc>
+                <w:tcPr>
+                  <w:tcW w:w="5884" w:type="dxa"/>
+                  <w:tcBorders>
+                    <w:top w:val="single" w:color="000000" w:sz="4" w:space="0"/>
+                    <w:left w:val="single" w:color="000000" w:sz="4" w:space="0"/>
+                    <w:bottom w:val="single" w:color="000000" w:sz="4" w:space="0"/>
+                    <w:right w:val="single" w:color="000000" w:sz="4" w:space="0"/>
+                  </w:tcBorders>
+                  <w:shd w:val="clear" w:color="auto" w:fill="auto"/>
+                  <w:vAlign w:val="center"/>
+                </w:tcPr>
+                <w:p>
+                  <w:pPr>
+                    <w:keepNext w:val="0"/>
+                    <w:keepLines w:val="0"/>
+                    <w:widowControl/>
+                    <w:suppressLineNumbers w:val="0"/>
+                    <w:jc w:val="left"/>
+                    <w:textAlignment w:val="center"/>
+                    <w:rPr>
+                      <w:rFonts w:hint="eastAsia" w:ascii="华文楷体" w:hAnsi="华文楷体" w:cs="华文楷体"/>
+                      <w:i w:val="0"/>
+                      <w:iCs w:val="0"/>
+                      <w:color w:val="000000"/>
+                      <w:kern w:val="0"/>
+                      <w:sz w:val="21"/>
+                      <w:szCs w:val="21"/>
+                      <w:u w:val="none"/>
+                      <w:lang w:val="en-US" w:eastAsia="zh-CN" w:bidi="ar"/>
+                    </w:rPr>
+                  </w:pPr>
+                  <w:r>
+                    <w:rPr>
+                      <w:rFonts w:hint="eastAsia" w:ascii="华文楷体" w:hAnsi="华文楷体" w:cs="华文楷体"/>
+                      <w:i w:val="0"/>
+                      <w:iCs w:val="0"/>
+                      <w:color w:val="000000"/>
+                      <w:kern w:val="0"/>
+                      <w:sz w:val="21"/>
+                      <w:szCs w:val="21"/>
+                      <w:u w:val="none"/>
+                      <w:lang w:val="en-US" w:eastAsia="zh-CN" w:bidi="ar"/>
+                    </w:rPr>
+                    <w:t>基于加速度计的姿态监测,用于传感器倾角姿态异常监测</w:t>
+                  </w:r>
+                </w:p>
+              </w:tc>
+            </w:tr>
+            <w:tr>
+              <w:tblPrEx>
+                <w:tblBorders>
+                  <w:top w:val="none" w:color="auto" w:sz="0" w:space="0"/>
+                  <w:left w:val="none" w:color="auto" w:sz="0" w:space="0"/>
+                  <w:bottom w:val="none" w:color="auto" w:sz="0" w:space="0"/>
+                  <w:right w:val="none" w:color="auto" w:sz="0" w:space="0"/>
+                  <w:insideH w:val="none" w:color="auto" w:sz="0" w:space="0"/>
+                  <w:insideV w:val="none" w:color="auto" w:sz="0" w:space="0"/>
+                </w:tblBorders>
+                <w:shd w:val="clear" w:color="auto" w:fill="auto"/>
+                <w:tblCellMar>
+                  <w:top w:w="0" w:type="dxa"/>
+                  <w:left w:w="108" w:type="dxa"/>
+                  <w:bottom w:w="0" w:type="dxa"/>
+                  <w:right w:w="108" w:type="dxa"/>
+                </w:tblCellMar>
+              </w:tblPrEx>
+              <w:trPr>
+                <w:trHeight w:val="300" w:hRule="atLeast"/>
+              </w:trPr>
+              <w:tc>
+                <w:tcPr>
+                  <w:tcW w:w="1420" w:type="dxa"/>
+                  <w:tcBorders>
+                    <w:top w:val="single" w:color="000000" w:sz="4" w:space="0"/>
+                    <w:left w:val="single" w:color="000000" w:sz="4" w:space="0"/>
+                    <w:bottom w:val="single" w:color="000000" w:sz="4" w:space="0"/>
+                    <w:right w:val="single" w:color="000000" w:sz="4" w:space="0"/>
+                  </w:tcBorders>
+                  <w:shd w:val="clear" w:color="auto" w:fill="auto"/>
+                  <w:vAlign w:val="center"/>
+                </w:tcPr>
+                <w:p>
+                  <w:pPr>
+                    <w:keepNext w:val="0"/>
+                    <w:keepLines w:val="0"/>
+                    <w:widowControl/>
+                    <w:suppressLineNumbers w:val="0"/>
+                    <w:jc w:val="center"/>
+                    <w:textAlignment w:val="center"/>
+                    <w:rPr>
                       <w:rFonts w:hint="eastAsia" w:ascii="华文楷体" w:hAnsi="华文楷体" w:eastAsia="华文楷体" w:cs="华文楷体"/>
                       <w:b/>
                       <w:bCs/>
@@ -10790,7 +10717,7 @@
           <w:lang w:val="en-US" w:eastAsia="zh-CN"/>
         </w:rPr>
       </w:pPr>
-      <w:bookmarkStart w:id="7" w:name="_Toc19013"/>
+      <w:bookmarkStart w:id="7" w:name="_Toc2581"/>
       <w:r>
         <w:rPr>
           <w:rFonts w:hint="eastAsia"/>
@@ -12039,7 +11966,7 @@
           <w:lang w:val="en-US" w:eastAsia="zh-CN"/>
         </w:rPr>
       </w:pPr>
-      <w:bookmarkStart w:id="8" w:name="_Toc5324"/>
+      <w:bookmarkStart w:id="8" w:name="_Toc9230"/>
       <w:r>
         <w:rPr>
           <w:rFonts w:hint="eastAsia"/>
@@ -12485,7 +12412,7 @@
           <w:lang w:val="de-DE"/>
         </w:rPr>
       </w:pPr>
-      <w:bookmarkStart w:id="9" w:name="_Toc13302"/>
+      <w:bookmarkStart w:id="9" w:name="_Toc25114"/>
       <w:r>
         <w:rPr>
           <w:rFonts w:hint="eastAsia"/>
@@ -12503,7 +12430,7 @@
           <w:lang w:val="de-DE"/>
         </w:rPr>
       </w:pPr>
-      <w:bookmarkStart w:id="10" w:name="_Toc3046"/>
+      <w:bookmarkStart w:id="10" w:name="_Toc5563"/>
       <w:r>
         <w:rPr>
           <w:rFonts w:hint="eastAsia"/>
@@ -12548,6 +12475,12 @@
             <w:insideH w:val="single" w:color="auto" w:sz="4" w:space="0"/>
             <w:insideV w:val="single" w:color="auto" w:sz="4" w:space="0"/>
           </w:tblBorders>
+          <w:tblCellMar>
+            <w:top w:w="0" w:type="dxa"/>
+            <w:left w:w="28" w:type="dxa"/>
+            <w:bottom w:w="0" w:type="dxa"/>
+            <w:right w:w="28" w:type="dxa"/>
+          </w:tblCellMar>
         </w:tblPrEx>
         <w:tc>
           <w:tcPr>
@@ -12677,7 +12610,7 @@
             </w:pPr>
             <w:r>
               <w:object>
-                <v:shape id="_x0000_i1031" o:spt="75" alt="" type="#_x0000_t75" style="height:250.35pt;width:324.85pt;" o:ole="t" filled="f" o:preferrelative="t" stroked="f" coordsize="21600,21600">
+                <v:shape id="_x0000_i1029" o:spt="75" type="#_x0000_t75" style="height:250.35pt;width:324.85pt;" o:ole="t" filled="f" o:preferrelative="t" stroked="f" coordsize="21600,21600">
                   <v:path/>
                   <v:fill on="f" focussize="0,0"/>
                   <v:stroke on="f"/>
@@ -12686,7 +12619,7 @@
                   <w10:wrap type="none"/>
                   <w10:anchorlock/>
                 </v:shape>
-                <o:OLEObject Type="Embed" ProgID="Visio.Drawing.15" ShapeID="_x0000_i1031" DrawAspect="Content" ObjectID="_1468075729" r:id="rId18">
+                <o:OLEObject Type="Embed" ProgID="Visio.Drawing.15" ShapeID="_x0000_i1029" DrawAspect="Content" ObjectID="_1468075729" r:id="rId18">
                   <o:LockedField>false</o:LockedField>
                 </o:OLEObject>
               </w:object>
@@ -12883,7 +12816,7 @@
           <w:lang w:val="en-US" w:eastAsia="zh-CN"/>
         </w:rPr>
       </w:pPr>
-      <w:bookmarkStart w:id="13" w:name="_Toc3773"/>
+      <w:bookmarkStart w:id="13" w:name="_Toc15479"/>
       <w:r>
         <w:rPr>
           <w:rFonts w:hint="eastAsia"/>
@@ -13327,7 +13260,7 @@
           <w:lang w:val="de-DE"/>
         </w:rPr>
       </w:pPr>
-      <w:bookmarkStart w:id="14" w:name="_Toc9588"/>
+      <w:bookmarkStart w:id="14" w:name="_Toc8858"/>
       <w:r>
         <w:rPr>
           <w:rFonts w:hint="eastAsia"/>
@@ -13768,7 +13701,7 @@
           <w:lang w:val="de-DE"/>
         </w:rPr>
       </w:pPr>
-      <w:bookmarkStart w:id="15" w:name="_Toc1542"/>
+      <w:bookmarkStart w:id="15" w:name="_Toc17311"/>
       <w:r>
         <w:rPr>
           <w:rFonts w:hint="eastAsia"/>
@@ -15233,13 +15166,20 @@
           <w:lang w:val="en-US" w:eastAsia="zh-CN"/>
         </w:rPr>
       </w:pPr>
-      <w:bookmarkStart w:id="16" w:name="_Toc27294"/>
       <w:r>
         <w:rPr>
           <w:rFonts w:hint="eastAsia"/>
           <w:lang w:val="en-US" w:eastAsia="zh-CN"/>
         </w:rPr>
-        <w:t xml:space="preserve"> 模块通信</w:t>
+        <w:t xml:space="preserve"> </w:t>
+      </w:r>
+      <w:bookmarkStart w:id="16" w:name="_Toc32502"/>
+      <w:r>
+        <w:rPr>
+          <w:rFonts w:hint="eastAsia"/>
+          <w:lang w:val="en-US" w:eastAsia="zh-CN"/>
+        </w:rPr>
+        <w:t>模块通信</w:t>
       </w:r>
       <w:r>
         <w:rPr>
@@ -15258,7 +15198,7 @@
           <w:lang w:val="en-US" w:eastAsia="zh-CN"/>
         </w:rPr>
       </w:pPr>
-      <w:bookmarkStart w:id="17" w:name="_Toc30725"/>
+      <w:bookmarkStart w:id="17" w:name="_Toc26546"/>
       <w:r>
         <w:rPr>
           <w:rFonts w:hint="eastAsia"/>
@@ -15304,6 +15244,12 @@
             <w:insideH w:val="single" w:color="auto" w:sz="4" w:space="0"/>
             <w:insideV w:val="single" w:color="auto" w:sz="4" w:space="0"/>
           </w:tblBorders>
+          <w:tblCellMar>
+            <w:top w:w="0" w:type="dxa"/>
+            <w:left w:w="28" w:type="dxa"/>
+            <w:bottom w:w="0" w:type="dxa"/>
+            <w:right w:w="28" w:type="dxa"/>
+          </w:tblCellMar>
         </w:tblPrEx>
         <w:tc>
           <w:tcPr>
@@ -15753,7 +15699,7 @@
           <w:lang w:val="en-US" w:eastAsia="zh-CN"/>
         </w:rPr>
       </w:pPr>
-      <w:bookmarkStart w:id="18" w:name="_Toc5726"/>
+      <w:bookmarkStart w:id="18" w:name="_Toc15209"/>
       <w:r>
         <w:rPr>
           <w:rFonts w:hint="eastAsia"/>
@@ -16258,7 +16204,7 @@
           <w:color w:val="auto"/>
         </w:rPr>
       </w:pPr>
-      <w:bookmarkStart w:id="19" w:name="_Toc9299"/>
+      <w:bookmarkStart w:id="19" w:name="_Toc15348"/>
       <w:r>
         <w:rPr>
           <w:rFonts w:hint="eastAsia"/>
@@ -16705,7 +16651,7 @@
           <w:color w:val="auto"/>
         </w:rPr>
       </w:pPr>
-      <w:bookmarkStart w:id="20" w:name="_Toc13130"/>
+      <w:bookmarkStart w:id="20" w:name="_Toc5874"/>
       <w:r>
         <w:rPr>
           <w:rFonts w:hint="eastAsia"/>
@@ -17161,7 +17107,7 @@
           <w:color w:val="auto"/>
         </w:rPr>
       </w:pPr>
-      <w:bookmarkStart w:id="21" w:name="_Toc26645"/>
+      <w:bookmarkStart w:id="21" w:name="_Toc16650"/>
       <w:r>
         <w:rPr>
           <w:rFonts w:hint="eastAsia"/>
@@ -17617,7 +17563,7 @@
           <w:color w:val="auto"/>
         </w:rPr>
       </w:pPr>
-      <w:bookmarkStart w:id="22" w:name="_Toc16404"/>
+      <w:bookmarkStart w:id="22" w:name="_Toc24252"/>
       <w:r>
         <w:rPr>
           <w:rFonts w:hint="eastAsia"/>
@@ -18073,7 +18019,7 @@
           <w:color w:val="auto"/>
         </w:rPr>
       </w:pPr>
-      <w:bookmarkStart w:id="23" w:name="_Toc17063"/>
+      <w:bookmarkStart w:id="23" w:name="_Toc2598"/>
       <w:r>
         <w:rPr>
           <w:rFonts w:hint="eastAsia"/>
@@ -18526,7 +18472,7 @@
           <w:rFonts w:hint="eastAsia"/>
         </w:rPr>
       </w:pPr>
-      <w:bookmarkStart w:id="24" w:name="_Toc4649"/>
+      <w:bookmarkStart w:id="24" w:name="_Toc12574"/>
       <w:r>
         <w:rPr>
           <w:rFonts w:hint="eastAsia"/>
@@ -19024,7 +18970,7 @@
           <w:color w:val="auto"/>
         </w:rPr>
       </w:pPr>
-      <w:bookmarkStart w:id="25" w:name="_Toc5668"/>
+      <w:bookmarkStart w:id="25" w:name="_Toc23682"/>
       <w:r>
         <w:rPr>
           <w:rFonts w:hint="eastAsia"/>
@@ -19478,7 +19424,7 @@
           <w:color w:val="auto"/>
         </w:rPr>
       </w:pPr>
-      <w:bookmarkStart w:id="26" w:name="_Toc23521"/>
+      <w:bookmarkStart w:id="26" w:name="_Toc26013"/>
       <w:r>
         <w:rPr>
           <w:rFonts w:hint="eastAsia"/>
@@ -19983,7 +19929,7 @@
           <w:color w:val="auto"/>
         </w:rPr>
       </w:pPr>
-      <w:bookmarkStart w:id="27" w:name="_Toc24610"/>
+      <w:bookmarkStart w:id="27" w:name="_Toc9189"/>
       <w:r>
         <w:rPr>
           <w:rFonts w:hint="eastAsia"/>
@@ -19991,520 +19937,6 @@
           <w:lang w:val="en-US" w:eastAsia="zh-CN"/>
         </w:rPr>
         <w:t>CPU3与CPU4通信串口</w:t>
-      </w:r>
-    </w:p>
-    <w:tbl>
-      <w:tblPr>
-        <w:tblStyle w:val="23"/>
-        <w:tblW w:w="5000" w:type="pct"/>
-        <w:tblInd w:w="0" w:type="dxa"/>
-        <w:tblBorders>
-          <w:top w:val="single" w:color="auto" w:sz="4" w:space="0"/>
-          <w:left w:val="single" w:color="auto" w:sz="4" w:space="0"/>
-          <w:bottom w:val="single" w:color="auto" w:sz="4" w:space="0"/>
-          <w:right w:val="single" w:color="auto" w:sz="4" w:space="0"/>
-          <w:insideH w:val="single" w:color="auto" w:sz="4" w:space="0"/>
-          <w:insideV w:val="single" w:color="auto" w:sz="4" w:space="0"/>
-        </w:tblBorders>
-        <w:tblLayout w:type="autofit"/>
-        <w:tblCellMar>
-          <w:top w:w="0" w:type="dxa"/>
-          <w:left w:w="28" w:type="dxa"/>
-          <w:bottom w:w="0" w:type="dxa"/>
-          <w:right w:w="28" w:type="dxa"/>
-        </w:tblCellMar>
-      </w:tblPr>
-      <w:tblGrid>
-        <w:gridCol w:w="1233"/>
-        <w:gridCol w:w="7135"/>
-      </w:tblGrid>
-      <w:tr>
-        <w:tblPrEx>
-          <w:tblBorders>
-            <w:top w:val="single" w:color="auto" w:sz="4" w:space="0"/>
-            <w:left w:val="single" w:color="auto" w:sz="4" w:space="0"/>
-            <w:bottom w:val="single" w:color="auto" w:sz="4" w:space="0"/>
-            <w:right w:val="single" w:color="auto" w:sz="4" w:space="0"/>
-            <w:insideH w:val="single" w:color="auto" w:sz="4" w:space="0"/>
-            <w:insideV w:val="single" w:color="auto" w:sz="4" w:space="0"/>
-          </w:tblBorders>
-          <w:tblCellMar>
-            <w:top w:w="0" w:type="dxa"/>
-            <w:left w:w="28" w:type="dxa"/>
-            <w:bottom w:w="0" w:type="dxa"/>
-            <w:right w:w="28" w:type="dxa"/>
-          </w:tblCellMar>
-        </w:tblPrEx>
-        <w:tc>
-          <w:tcPr>
-            <w:tcW w:w="737" w:type="pct"/>
-            <w:tcBorders>
-              <w:top w:val="single" w:color="auto" w:sz="4" w:space="0"/>
-              <w:left w:val="single" w:color="auto" w:sz="4" w:space="0"/>
-              <w:bottom w:val="single" w:color="auto" w:sz="4" w:space="0"/>
-              <w:right w:val="single" w:color="auto" w:sz="4" w:space="0"/>
-            </w:tcBorders>
-            <w:noWrap w:val="0"/>
-            <w:vAlign w:val="top"/>
-          </w:tcPr>
-          <w:p>
-            <w:pPr>
-              <w:jc w:val="center"/>
-              <w:rPr>
-                <w:rFonts w:hint="eastAsia"/>
-                <w:color w:val="auto"/>
-              </w:rPr>
-            </w:pPr>
-            <w:r>
-              <w:rPr>
-                <w:color w:val="auto"/>
-              </w:rPr>
-              <w:t>架构编号</w:t>
-            </w:r>
-          </w:p>
-        </w:tc>
-        <w:tc>
-          <w:tcPr>
-            <w:tcW w:w="4263" w:type="pct"/>
-            <w:tcBorders>
-              <w:top w:val="single" w:color="auto" w:sz="4" w:space="0"/>
-              <w:left w:val="single" w:color="auto" w:sz="4" w:space="0"/>
-              <w:bottom w:val="single" w:color="auto" w:sz="4" w:space="0"/>
-              <w:right w:val="single" w:color="auto" w:sz="4" w:space="0"/>
-            </w:tcBorders>
-            <w:noWrap w:val="0"/>
-            <w:vAlign w:val="top"/>
-          </w:tcPr>
-          <w:p>
-            <w:pPr>
-              <w:rPr>
-                <w:rFonts w:hint="default"/>
-                <w:color w:val="auto"/>
-                <w:lang w:val="en-US"/>
-              </w:rPr>
-            </w:pPr>
-            <w:r>
-              <w:rPr>
-                <w:rFonts w:hint="eastAsia"/>
-                <w:color w:val="auto"/>
-                <w:lang w:val="en-US" w:eastAsia="zh-CN"/>
-              </w:rPr>
-              <w:t>ABDSM</w:t>
-            </w:r>
-            <w:r>
-              <w:rPr>
-                <w:rFonts w:hint="eastAsia"/>
-                <w:color w:val="auto"/>
-                <w:lang w:val="de-DE"/>
-              </w:rPr>
-              <w:t>-Arch-SYS-</w:t>
-            </w:r>
-            <w:r>
-              <w:rPr>
-                <w:rFonts w:hint="eastAsia"/>
-                <w:color w:val="auto"/>
-                <w:lang w:val="en-US" w:eastAsia="zh-CN"/>
-              </w:rPr>
-              <w:t>024</w:t>
-            </w:r>
-          </w:p>
-        </w:tc>
-      </w:tr>
-      <w:tr>
-        <w:tblPrEx>
-          <w:tblBorders>
-            <w:top w:val="single" w:color="auto" w:sz="4" w:space="0"/>
-            <w:left w:val="single" w:color="auto" w:sz="4" w:space="0"/>
-            <w:bottom w:val="single" w:color="auto" w:sz="4" w:space="0"/>
-            <w:right w:val="single" w:color="auto" w:sz="4" w:space="0"/>
-            <w:insideH w:val="single" w:color="auto" w:sz="4" w:space="0"/>
-            <w:insideV w:val="single" w:color="auto" w:sz="4" w:space="0"/>
-          </w:tblBorders>
-          <w:tblCellMar>
-            <w:top w:w="0" w:type="dxa"/>
-            <w:left w:w="28" w:type="dxa"/>
-            <w:bottom w:w="0" w:type="dxa"/>
-            <w:right w:w="28" w:type="dxa"/>
-          </w:tblCellMar>
-        </w:tblPrEx>
-        <w:tc>
-          <w:tcPr>
-            <w:tcW w:w="737" w:type="pct"/>
-            <w:tcBorders>
-              <w:top w:val="single" w:color="auto" w:sz="4" w:space="0"/>
-              <w:left w:val="single" w:color="auto" w:sz="4" w:space="0"/>
-              <w:bottom w:val="single" w:color="auto" w:sz="4" w:space="0"/>
-              <w:right w:val="single" w:color="auto" w:sz="4" w:space="0"/>
-            </w:tcBorders>
-            <w:noWrap w:val="0"/>
-            <w:vAlign w:val="top"/>
-          </w:tcPr>
-          <w:p>
-            <w:pPr>
-              <w:jc w:val="center"/>
-              <w:rPr>
-                <w:color w:val="auto"/>
-              </w:rPr>
-            </w:pPr>
-            <w:r>
-              <w:rPr>
-                <w:color w:val="auto"/>
-              </w:rPr>
-              <w:t>架构摘要</w:t>
-            </w:r>
-          </w:p>
-        </w:tc>
-        <w:tc>
-          <w:tcPr>
-            <w:tcW w:w="4263" w:type="pct"/>
-            <w:tcBorders>
-              <w:top w:val="single" w:color="auto" w:sz="4" w:space="0"/>
-              <w:left w:val="single" w:color="auto" w:sz="4" w:space="0"/>
-              <w:bottom w:val="single" w:color="auto" w:sz="4" w:space="0"/>
-              <w:right w:val="single" w:color="auto" w:sz="4" w:space="0"/>
-            </w:tcBorders>
-            <w:noWrap w:val="0"/>
-            <w:vAlign w:val="top"/>
-          </w:tcPr>
-          <w:p>
-            <w:pPr>
-              <w:rPr>
-                <w:rFonts w:hint="default" w:eastAsia="华文楷体"/>
-                <w:color w:val="auto"/>
-                <w:lang w:val="en-US" w:eastAsia="zh-CN"/>
-              </w:rPr>
-            </w:pPr>
-            <w:r>
-              <w:rPr>
-                <w:rFonts w:hint="eastAsia"/>
-                <w:color w:val="auto"/>
-                <w:lang w:val="en-US" w:eastAsia="zh-CN"/>
-              </w:rPr>
-              <w:t>UART串口</w:t>
-            </w:r>
-          </w:p>
-        </w:tc>
-      </w:tr>
-      <w:tr>
-        <w:tblPrEx>
-          <w:tblBorders>
-            <w:top w:val="single" w:color="auto" w:sz="4" w:space="0"/>
-            <w:left w:val="single" w:color="auto" w:sz="4" w:space="0"/>
-            <w:bottom w:val="single" w:color="auto" w:sz="4" w:space="0"/>
-            <w:right w:val="single" w:color="auto" w:sz="4" w:space="0"/>
-            <w:insideH w:val="single" w:color="auto" w:sz="4" w:space="0"/>
-            <w:insideV w:val="single" w:color="auto" w:sz="4" w:space="0"/>
-          </w:tblBorders>
-          <w:tblCellMar>
-            <w:top w:w="0" w:type="dxa"/>
-            <w:left w:w="28" w:type="dxa"/>
-            <w:bottom w:w="0" w:type="dxa"/>
-            <w:right w:w="28" w:type="dxa"/>
-          </w:tblCellMar>
-        </w:tblPrEx>
-        <w:tc>
-          <w:tcPr>
-            <w:tcW w:w="737" w:type="pct"/>
-            <w:tcBorders>
-              <w:top w:val="single" w:color="auto" w:sz="4" w:space="0"/>
-              <w:left w:val="single" w:color="auto" w:sz="4" w:space="0"/>
-              <w:bottom w:val="single" w:color="auto" w:sz="4" w:space="0"/>
-              <w:right w:val="single" w:color="auto" w:sz="4" w:space="0"/>
-            </w:tcBorders>
-            <w:noWrap w:val="0"/>
-            <w:vAlign w:val="top"/>
-          </w:tcPr>
-          <w:p>
-            <w:pPr>
-              <w:jc w:val="center"/>
-              <w:rPr>
-                <w:color w:val="auto"/>
-              </w:rPr>
-            </w:pPr>
-            <w:r>
-              <w:rPr>
-                <w:color w:val="auto"/>
-              </w:rPr>
-              <w:t>架构描述</w:t>
-            </w:r>
-          </w:p>
-        </w:tc>
-        <w:tc>
-          <w:tcPr>
-            <w:tcW w:w="4263" w:type="pct"/>
-            <w:tcBorders>
-              <w:top w:val="single" w:color="auto" w:sz="4" w:space="0"/>
-              <w:left w:val="single" w:color="auto" w:sz="4" w:space="0"/>
-              <w:bottom w:val="single" w:color="auto" w:sz="4" w:space="0"/>
-              <w:right w:val="single" w:color="auto" w:sz="4" w:space="0"/>
-            </w:tcBorders>
-            <w:noWrap w:val="0"/>
-            <w:vAlign w:val="top"/>
-          </w:tcPr>
-          <w:p>
-            <w:pPr>
-              <w:numPr>
-                <w:ilvl w:val="0"/>
-                <w:numId w:val="0"/>
-              </w:numPr>
-              <w:rPr>
-                <w:rFonts w:hint="default"/>
-                <w:color w:val="auto"/>
-                <w:lang w:val="en-US" w:eastAsia="zh-CN"/>
-              </w:rPr>
-            </w:pPr>
-            <w:r>
-              <w:rPr>
-                <w:rFonts w:hint="eastAsia"/>
-                <w:color w:val="auto"/>
-                <w:lang w:val="en-US" w:eastAsia="zh-CN"/>
-              </w:rPr>
-              <w:t>CPU3与CPU4信息交互串口</w:t>
-            </w:r>
-          </w:p>
-        </w:tc>
-      </w:tr>
-      <w:tr>
-        <w:tblPrEx>
-          <w:tblBorders>
-            <w:top w:val="single" w:color="auto" w:sz="4" w:space="0"/>
-            <w:left w:val="single" w:color="auto" w:sz="4" w:space="0"/>
-            <w:bottom w:val="single" w:color="auto" w:sz="4" w:space="0"/>
-            <w:right w:val="single" w:color="auto" w:sz="4" w:space="0"/>
-            <w:insideH w:val="single" w:color="auto" w:sz="4" w:space="0"/>
-            <w:insideV w:val="single" w:color="auto" w:sz="4" w:space="0"/>
-          </w:tblBorders>
-          <w:tblCellMar>
-            <w:top w:w="0" w:type="dxa"/>
-            <w:left w:w="28" w:type="dxa"/>
-            <w:bottom w:w="0" w:type="dxa"/>
-            <w:right w:w="28" w:type="dxa"/>
-          </w:tblCellMar>
-        </w:tblPrEx>
-        <w:tc>
-          <w:tcPr>
-            <w:tcW w:w="737" w:type="pct"/>
-            <w:tcBorders>
-              <w:top w:val="single" w:color="auto" w:sz="4" w:space="0"/>
-              <w:left w:val="single" w:color="auto" w:sz="4" w:space="0"/>
-              <w:bottom w:val="single" w:color="auto" w:sz="4" w:space="0"/>
-              <w:right w:val="single" w:color="auto" w:sz="4" w:space="0"/>
-            </w:tcBorders>
-            <w:noWrap w:val="0"/>
-            <w:vAlign w:val="top"/>
-          </w:tcPr>
-          <w:p>
-            <w:pPr>
-              <w:jc w:val="center"/>
-              <w:rPr>
-                <w:rFonts w:hint="eastAsia"/>
-                <w:color w:val="auto"/>
-              </w:rPr>
-            </w:pPr>
-            <w:r>
-              <w:rPr>
-                <w:color w:val="auto"/>
-              </w:rPr>
-              <w:t>对应需求</w:t>
-            </w:r>
-          </w:p>
-        </w:tc>
-        <w:tc>
-          <w:tcPr>
-            <w:tcW w:w="4263" w:type="pct"/>
-            <w:tcBorders>
-              <w:top w:val="single" w:color="auto" w:sz="4" w:space="0"/>
-              <w:left w:val="single" w:color="auto" w:sz="4" w:space="0"/>
-              <w:bottom w:val="single" w:color="auto" w:sz="4" w:space="0"/>
-              <w:right w:val="single" w:color="auto" w:sz="4" w:space="0"/>
-            </w:tcBorders>
-            <w:noWrap w:val="0"/>
-            <w:vAlign w:val="top"/>
-          </w:tcPr>
-          <w:p>
-            <w:pPr>
-              <w:rPr>
-                <w:rFonts w:hint="eastAsia"/>
-                <w:color w:val="auto"/>
-                <w:lang w:val="en-US" w:eastAsia="zh-CN"/>
-              </w:rPr>
-            </w:pPr>
-            <w:r>
-              <w:rPr>
-                <w:rFonts w:hint="eastAsia"/>
-                <w:color w:val="auto"/>
-                <w:lang w:val="en-US" w:eastAsia="zh-CN"/>
-              </w:rPr>
-              <w:t>ABDSM-R-005-A、ABDSM-R-006-A、ABDSM-R-007-A、ABDSM-R-015-A;</w:t>
-            </w:r>
-          </w:p>
-        </w:tc>
-      </w:tr>
-      <w:tr>
-        <w:tblPrEx>
-          <w:tblBorders>
-            <w:top w:val="single" w:color="auto" w:sz="4" w:space="0"/>
-            <w:left w:val="single" w:color="auto" w:sz="4" w:space="0"/>
-            <w:bottom w:val="single" w:color="auto" w:sz="4" w:space="0"/>
-            <w:right w:val="single" w:color="auto" w:sz="4" w:space="0"/>
-            <w:insideH w:val="single" w:color="auto" w:sz="4" w:space="0"/>
-            <w:insideV w:val="single" w:color="auto" w:sz="4" w:space="0"/>
-          </w:tblBorders>
-          <w:tblCellMar>
-            <w:top w:w="0" w:type="dxa"/>
-            <w:left w:w="28" w:type="dxa"/>
-            <w:bottom w:w="0" w:type="dxa"/>
-            <w:right w:w="28" w:type="dxa"/>
-          </w:tblCellMar>
-        </w:tblPrEx>
-        <w:tc>
-          <w:tcPr>
-            <w:tcW w:w="737" w:type="pct"/>
-            <w:tcBorders>
-              <w:top w:val="single" w:color="auto" w:sz="4" w:space="0"/>
-              <w:left w:val="single" w:color="auto" w:sz="4" w:space="0"/>
-              <w:bottom w:val="single" w:color="auto" w:sz="4" w:space="0"/>
-              <w:right w:val="single" w:color="auto" w:sz="4" w:space="0"/>
-            </w:tcBorders>
-            <w:noWrap w:val="0"/>
-            <w:vAlign w:val="center"/>
-          </w:tcPr>
-          <w:p>
-            <w:pPr>
-              <w:jc w:val="center"/>
-              <w:rPr>
-                <w:rFonts w:hint="eastAsia" w:eastAsia="华文楷体"/>
-                <w:color w:val="auto"/>
-                <w:lang w:val="en-US" w:eastAsia="zh-CN"/>
-              </w:rPr>
-            </w:pPr>
-            <w:r>
-              <w:rPr>
-                <w:rFonts w:hint="eastAsia"/>
-                <w:color w:val="auto"/>
-                <w:lang w:val="en-US" w:eastAsia="zh-CN"/>
-              </w:rPr>
-              <w:t>简介</w:t>
-            </w:r>
-          </w:p>
-        </w:tc>
-        <w:tc>
-          <w:tcPr>
-            <w:tcW w:w="4263" w:type="pct"/>
-            <w:tcBorders>
-              <w:top w:val="single" w:color="auto" w:sz="4" w:space="0"/>
-              <w:left w:val="single" w:color="auto" w:sz="4" w:space="0"/>
-              <w:bottom w:val="single" w:color="auto" w:sz="4" w:space="0"/>
-              <w:right w:val="single" w:color="auto" w:sz="4" w:space="0"/>
-            </w:tcBorders>
-            <w:noWrap w:val="0"/>
-            <w:vAlign w:val="top"/>
-          </w:tcPr>
-          <w:p>
-            <w:pPr>
-              <w:rPr>
-                <w:rFonts w:hint="eastAsia"/>
-                <w:color w:val="auto"/>
-                <w:lang w:val="en-US" w:eastAsia="zh-CN"/>
-              </w:rPr>
-            </w:pPr>
-            <w:r>
-              <w:rPr>
-                <w:rFonts w:hint="eastAsia"/>
-                <w:color w:val="auto"/>
-                <w:lang w:val="en-US" w:eastAsia="zh-CN"/>
-              </w:rPr>
-              <w:t>通过UART串口实现CPU2与CPU3的数据交互，安全功能模式下：CPU3接收CPU2发送的测量信息，为单向通信。</w:t>
-            </w:r>
-          </w:p>
-          <w:p>
-            <w:pPr>
-              <w:rPr>
-                <w:rFonts w:hint="eastAsia"/>
-                <w:color w:val="auto"/>
-                <w:lang w:val="en-US" w:eastAsia="zh-CN"/>
-              </w:rPr>
-            </w:pPr>
-            <w:r>
-              <w:rPr>
-                <w:rFonts w:hint="eastAsia"/>
-                <w:color w:val="auto"/>
-                <w:lang w:val="en-US" w:eastAsia="zh-CN"/>
-              </w:rPr>
-              <w:t>在非安全功能模式下，CPU3向CPU2下发测量指令、配置参数，CPU2返回所需信息，为双向通信。</w:t>
-            </w:r>
-          </w:p>
-          <w:p>
-            <w:pPr>
-              <w:rPr>
-                <w:rFonts w:hint="eastAsia"/>
-                <w:color w:val="auto"/>
-                <w:lang w:val="en-US" w:eastAsia="zh-CN"/>
-              </w:rPr>
-            </w:pPr>
-            <w:r>
-              <w:rPr>
-                <w:rFonts w:hint="eastAsia"/>
-                <w:color w:val="auto"/>
-                <w:lang w:val="en-US" w:eastAsia="zh-CN"/>
-              </w:rPr>
-              <w:t>安全功能下，使用内部封装的协议，通过CRC16检验方式诊断通信异常；</w:t>
-            </w:r>
-          </w:p>
-          <w:p>
-            <w:pPr>
-              <w:rPr>
-                <w:rFonts w:hint="default"/>
-                <w:color w:val="auto"/>
-                <w:lang w:val="en-US" w:eastAsia="zh-CN"/>
-              </w:rPr>
-            </w:pPr>
-            <w:r>
-              <w:rPr>
-                <w:rFonts w:hint="eastAsia"/>
-                <w:color w:val="auto"/>
-                <w:lang w:val="en-US" w:eastAsia="zh-CN"/>
-              </w:rPr>
-              <w:t>非安全功能时，使用modbus-RTU协议，通过CRC16检验方式诊断通信异常。</w:t>
-            </w:r>
-          </w:p>
-        </w:tc>
-      </w:tr>
-    </w:tbl>
-    <w:p>
-      <w:pPr>
-        <w:pStyle w:val="3"/>
-        <w:numPr>
-          <w:ilvl w:val="1"/>
-          <w:numId w:val="0"/>
-        </w:numPr>
-        <w:tabs>
-          <w:tab w:val="clear" w:pos="567"/>
-        </w:tabs>
-        <w:ind w:leftChars="0"/>
-        <w:rPr>
-          <w:rFonts w:hint="default"/>
-          <w:color w:val="auto"/>
-          <w:lang w:val="en-US" w:eastAsia="zh-CN"/>
-        </w:rPr>
-      </w:pPr>
-    </w:p>
-    <w:p>
-      <w:pPr>
-        <w:pStyle w:val="3"/>
-        <w:rPr>
-          <w:rFonts w:hint="default"/>
-          <w:color w:val="auto"/>
-          <w:lang w:val="en-US" w:eastAsia="zh-CN"/>
-        </w:rPr>
-      </w:pPr>
-      <w:r>
-        <w:rPr>
-          <w:rFonts w:hint="eastAsia"/>
-          <w:color w:val="auto"/>
-          <w:lang w:val="en-US" w:eastAsia="zh-CN"/>
-        </w:rPr>
-        <w:t>显示屏幕通信接口</w:t>
       </w:r>
       <w:bookmarkEnd w:id="27"/>
     </w:p>
@@ -20550,9 +19982,6 @@
             <w:right w:w="28" w:type="dxa"/>
           </w:tblCellMar>
         </w:tblPrEx>
-        <w:trPr>
-          <w:trHeight w:val="90" w:hRule="atLeast"/>
-        </w:trPr>
         <w:tc>
           <w:tcPr>
             <w:tcW w:w="737" w:type="pct"/>
@@ -20571,15 +20000,11 @@
               <w:rPr>
                 <w:rFonts w:hint="eastAsia"/>
                 <w:color w:val="auto"/>
-                <w:sz w:val="21"/>
-                <w:szCs w:val="21"/>
-              </w:rPr>
-            </w:pPr>
-            <w:r>
-              <w:rPr>
-                <w:color w:val="auto"/>
-                <w:sz w:val="21"/>
-                <w:szCs w:val="21"/>
+              </w:rPr>
+            </w:pPr>
+            <w:r>
+              <w:rPr>
+                <w:color w:val="auto"/>
               </w:rPr>
               <w:t>架构编号</w:t>
             </w:r>
@@ -20602,8 +20027,6 @@
               <w:rPr>
                 <w:rFonts w:hint="default"/>
                 <w:color w:val="auto"/>
-                <w:sz w:val="21"/>
-                <w:szCs w:val="21"/>
                 <w:lang w:val="en-US"/>
               </w:rPr>
             </w:pPr>
@@ -20611,8 +20034,6 @@
               <w:rPr>
                 <w:rFonts w:hint="eastAsia"/>
                 <w:color w:val="auto"/>
-                <w:sz w:val="21"/>
-                <w:szCs w:val="21"/>
                 <w:lang w:val="en-US" w:eastAsia="zh-CN"/>
               </w:rPr>
               <w:t>ABDSM</w:t>
@@ -20621,8 +20042,6 @@
               <w:rPr>
                 <w:rFonts w:hint="eastAsia"/>
                 <w:color w:val="auto"/>
-                <w:sz w:val="21"/>
-                <w:szCs w:val="21"/>
                 <w:lang w:val="de-DE"/>
               </w:rPr>
               <w:t>-Arch-SYS-</w:t>
@@ -20631,11 +20050,9 @@
               <w:rPr>
                 <w:rFonts w:hint="eastAsia"/>
                 <w:color w:val="auto"/>
-                <w:sz w:val="21"/>
-                <w:szCs w:val="21"/>
-                <w:lang w:val="en-US" w:eastAsia="zh-CN"/>
-              </w:rPr>
-              <w:t>025</w:t>
+                <w:lang w:val="en-US" w:eastAsia="zh-CN"/>
+              </w:rPr>
+              <w:t>024</w:t>
             </w:r>
           </w:p>
         </w:tc>
@@ -20674,15 +20091,11 @@
               <w:jc w:val="center"/>
               <w:rPr>
                 <w:color w:val="auto"/>
-                <w:sz w:val="21"/>
-                <w:szCs w:val="21"/>
-              </w:rPr>
-            </w:pPr>
-            <w:r>
-              <w:rPr>
-                <w:color w:val="auto"/>
-                <w:sz w:val="21"/>
-                <w:szCs w:val="21"/>
+              </w:rPr>
+            </w:pPr>
+            <w:r>
+              <w:rPr>
+                <w:color w:val="auto"/>
               </w:rPr>
               <w:t>架构摘要</w:t>
             </w:r>
@@ -20705,20 +20118,16 @@
               <w:rPr>
                 <w:rFonts w:hint="default" w:eastAsia="华文楷体"/>
                 <w:color w:val="auto"/>
-                <w:sz w:val="21"/>
-                <w:szCs w:val="21"/>
-                <w:lang w:val="en-US" w:eastAsia="zh-CN"/>
-              </w:rPr>
-            </w:pPr>
-            <w:r>
-              <w:rPr>
-                <w:rFonts w:hint="eastAsia"/>
-                <w:color w:val="auto"/>
-                <w:sz w:val="21"/>
-                <w:szCs w:val="21"/>
-                <w:lang w:val="en-US" w:eastAsia="zh-CN"/>
-              </w:rPr>
-              <w:t>SPI接口</w:t>
+                <w:lang w:val="en-US" w:eastAsia="zh-CN"/>
+              </w:rPr>
+            </w:pPr>
+            <w:r>
+              <w:rPr>
+                <w:rFonts w:hint="eastAsia"/>
+                <w:color w:val="auto"/>
+                <w:lang w:val="en-US" w:eastAsia="zh-CN"/>
+              </w:rPr>
+              <w:t>UART串口</w:t>
             </w:r>
           </w:p>
         </w:tc>
@@ -20757,15 +20166,11 @@
               <w:jc w:val="center"/>
               <w:rPr>
                 <w:color w:val="auto"/>
-                <w:sz w:val="21"/>
-                <w:szCs w:val="21"/>
-              </w:rPr>
-            </w:pPr>
-            <w:r>
-              <w:rPr>
-                <w:color w:val="auto"/>
-                <w:sz w:val="21"/>
-                <w:szCs w:val="21"/>
+              </w:rPr>
+            </w:pPr>
+            <w:r>
+              <w:rPr>
+                <w:color w:val="auto"/>
               </w:rPr>
               <w:t>架构描述</w:t>
             </w:r>
@@ -20792,20 +20197,16 @@
               <w:rPr>
                 <w:rFonts w:hint="default"/>
                 <w:color w:val="auto"/>
-                <w:sz w:val="21"/>
-                <w:szCs w:val="21"/>
-                <w:lang w:val="en-US" w:eastAsia="zh-CN"/>
-              </w:rPr>
-            </w:pPr>
-            <w:r>
-              <w:rPr>
-                <w:rFonts w:hint="eastAsia"/>
-                <w:color w:val="auto"/>
-                <w:sz w:val="21"/>
-                <w:szCs w:val="21"/>
-                <w:lang w:val="en-US" w:eastAsia="zh-CN"/>
-              </w:rPr>
-              <w:t>控制屏幕显示数据</w:t>
+                <w:lang w:val="en-US" w:eastAsia="zh-CN"/>
+              </w:rPr>
+            </w:pPr>
+            <w:r>
+              <w:rPr>
+                <w:rFonts w:hint="eastAsia"/>
+                <w:color w:val="auto"/>
+                <w:lang w:val="en-US" w:eastAsia="zh-CN"/>
+              </w:rPr>
+              <w:t>CPU3与CPU4信息交互串口</w:t>
             </w:r>
           </w:p>
         </w:tc>
@@ -20845,15 +20246,11 @@
               <w:rPr>
                 <w:rFonts w:hint="eastAsia"/>
                 <w:color w:val="auto"/>
-                <w:sz w:val="21"/>
-                <w:szCs w:val="21"/>
-              </w:rPr>
-            </w:pPr>
-            <w:r>
-              <w:rPr>
-                <w:color w:val="auto"/>
-                <w:sz w:val="21"/>
-                <w:szCs w:val="21"/>
+              </w:rPr>
+            </w:pPr>
+            <w:r>
+              <w:rPr>
+                <w:color w:val="auto"/>
               </w:rPr>
               <w:t>对应需求</w:t>
             </w:r>
@@ -20876,18 +20273,16 @@
               <w:rPr>
                 <w:rFonts w:hint="eastAsia"/>
                 <w:color w:val="auto"/>
-                <w:sz w:val="21"/>
-                <w:szCs w:val="21"/>
-                <w:lang w:val="en-US" w:eastAsia="zh-CN"/>
-              </w:rPr>
-            </w:pPr>
-            <w:r>
-              <w:rPr>
-                <w:rFonts w:hint="eastAsia"/>
-                <w:color w:val="auto"/>
-                <w:lang w:val="en-US" w:eastAsia="zh-CN"/>
-              </w:rPr>
-              <w:t>ABDSM-R-007-A</w:t>
+                <w:lang w:val="en-US" w:eastAsia="zh-CN"/>
+              </w:rPr>
+            </w:pPr>
+            <w:r>
+              <w:rPr>
+                <w:rFonts w:hint="eastAsia"/>
+                <w:color w:val="auto"/>
+                <w:lang w:val="en-US" w:eastAsia="zh-CN"/>
+              </w:rPr>
+              <w:t>ABDSM-R-005-A、ABDSM-R-006-A、ABDSM-R-007-A、ABDSM-R-015-A;</w:t>
             </w:r>
           </w:p>
         </w:tc>
@@ -20909,9 +20304,6 @@
             <w:right w:w="28" w:type="dxa"/>
           </w:tblCellMar>
         </w:tblPrEx>
-        <w:trPr>
-          <w:trHeight w:val="959" w:hRule="atLeast"/>
-        </w:trPr>
         <w:tc>
           <w:tcPr>
             <w:tcW w:w="737" w:type="pct"/>
@@ -20930,17 +20322,13 @@
               <w:rPr>
                 <w:rFonts w:hint="eastAsia" w:eastAsia="华文楷体"/>
                 <w:color w:val="auto"/>
-                <w:sz w:val="21"/>
-                <w:szCs w:val="21"/>
-                <w:lang w:val="en-US" w:eastAsia="zh-CN"/>
-              </w:rPr>
-            </w:pPr>
-            <w:r>
-              <w:rPr>
-                <w:rFonts w:hint="eastAsia"/>
-                <w:color w:val="auto"/>
-                <w:sz w:val="21"/>
-                <w:szCs w:val="21"/>
+                <w:lang w:val="en-US" w:eastAsia="zh-CN"/>
+              </w:rPr>
+            </w:pPr>
+            <w:r>
+              <w:rPr>
+                <w:rFonts w:hint="eastAsia"/>
+                <w:color w:val="auto"/>
                 <w:lang w:val="en-US" w:eastAsia="zh-CN"/>
               </w:rPr>
               <w:t>简介</w:t>
@@ -20962,22 +20350,69 @@
           <w:p>
             <w:pPr>
               <w:rPr>
+                <w:rFonts w:hint="eastAsia"/>
+                <w:color w:val="auto"/>
+                <w:lang w:val="en-US" w:eastAsia="zh-CN"/>
+              </w:rPr>
+            </w:pPr>
+            <w:r>
+              <w:rPr>
+                <w:rFonts w:hint="eastAsia"/>
+                <w:color w:val="auto"/>
+                <w:lang w:val="en-US" w:eastAsia="zh-CN"/>
+              </w:rPr>
+              <w:t>通过UART串口实现CPU2与CPU3的数据交互，安全功能模式下：CPU3接收CPU2发送的测量信息，为单向通信。</w:t>
+            </w:r>
+          </w:p>
+          <w:p>
+            <w:pPr>
+              <w:rPr>
+                <w:rFonts w:hint="eastAsia"/>
+                <w:color w:val="auto"/>
+                <w:lang w:val="en-US" w:eastAsia="zh-CN"/>
+              </w:rPr>
+            </w:pPr>
+            <w:r>
+              <w:rPr>
+                <w:rFonts w:hint="eastAsia"/>
+                <w:color w:val="auto"/>
+                <w:lang w:val="en-US" w:eastAsia="zh-CN"/>
+              </w:rPr>
+              <w:t>在非安全功能模式下，CPU3向CPU2下发测量指令、配置参数，CPU2返回所需信息，为双向通信。</w:t>
+            </w:r>
+          </w:p>
+          <w:p>
+            <w:pPr>
+              <w:rPr>
+                <w:rFonts w:hint="eastAsia"/>
+                <w:color w:val="auto"/>
+                <w:lang w:val="en-US" w:eastAsia="zh-CN"/>
+              </w:rPr>
+            </w:pPr>
+            <w:r>
+              <w:rPr>
+                <w:rFonts w:hint="eastAsia"/>
+                <w:color w:val="auto"/>
+                <w:lang w:val="en-US" w:eastAsia="zh-CN"/>
+              </w:rPr>
+              <w:t>安全功能下，使用内部封装的协议，通过CRC16检验方式诊断通信异常；</w:t>
+            </w:r>
+          </w:p>
+          <w:p>
+            <w:pPr>
+              <w:rPr>
                 <w:rFonts w:hint="default"/>
                 <w:color w:val="auto"/>
-                <w:sz w:val="21"/>
-                <w:szCs w:val="21"/>
-                <w:lang w:val="en-US" w:eastAsia="zh-CN"/>
-              </w:rPr>
-            </w:pPr>
-            <w:r>
-              <w:rPr>
-                <w:rFonts w:hint="eastAsia"/>
-                <w:color w:val="auto"/>
-                <w:sz w:val="21"/>
-                <w:szCs w:val="21"/>
-                <w:lang w:val="en-US" w:eastAsia="zh-CN"/>
-              </w:rPr>
-              <w:t>通过SPI接口与屏幕中的芯片进行通信，实现测量数据的显示及信息录入，接口为双向通信，使用封装的SPI协议，过程无检验。</w:t>
+                <w:lang w:val="en-US" w:eastAsia="zh-CN"/>
+              </w:rPr>
+            </w:pPr>
+            <w:r>
+              <w:rPr>
+                <w:rFonts w:hint="eastAsia"/>
+                <w:color w:val="auto"/>
+                <w:lang w:val="en-US" w:eastAsia="zh-CN"/>
+              </w:rPr>
+              <w:t>非安全功能时，使用modbus-RTU协议，通过CRC16检验方式诊断通信异常。</w:t>
             </w:r>
           </w:p>
         </w:tc>
@@ -20986,20 +20421,38 @@
     <w:p>
       <w:pPr>
         <w:pStyle w:val="3"/>
+        <w:numPr>
+          <w:ilvl w:val="1"/>
+          <w:numId w:val="0"/>
+        </w:numPr>
+        <w:tabs>
+          <w:tab w:val="clear" w:pos="567"/>
+        </w:tabs>
+        <w:ind w:leftChars="0"/>
         <w:rPr>
           <w:rFonts w:hint="default"/>
           <w:color w:val="auto"/>
           <w:lang w:val="en-US" w:eastAsia="zh-CN"/>
         </w:rPr>
       </w:pPr>
-      <w:bookmarkStart w:id="28" w:name="_Toc32425"/>
+    </w:p>
+    <w:p>
+      <w:pPr>
+        <w:pStyle w:val="3"/>
+        <w:rPr>
+          <w:rFonts w:hint="default"/>
+          <w:color w:val="auto"/>
+          <w:lang w:val="en-US" w:eastAsia="zh-CN"/>
+        </w:rPr>
+      </w:pPr>
+      <w:bookmarkStart w:id="28" w:name="_Toc10740"/>
       <w:r>
         <w:rPr>
           <w:rFonts w:hint="eastAsia"/>
           <w:color w:val="auto"/>
           <w:lang w:val="en-US" w:eastAsia="zh-CN"/>
         </w:rPr>
-        <w:t>按键通信接口</w:t>
+        <w:t>显示屏幕通信接口</w:t>
       </w:r>
       <w:bookmarkEnd w:id="28"/>
     </w:p>
@@ -21130,7 +20583,7 @@
                 <w:szCs w:val="21"/>
                 <w:lang w:val="en-US" w:eastAsia="zh-CN"/>
               </w:rPr>
-              <w:t>026</w:t>
+              <w:t>025</w:t>
             </w:r>
           </w:p>
         </w:tc>
@@ -21185,7 +20638,7 @@
         </w:tc>
         <w:tc>
           <w:tcPr>
-            <w:tcW w:w="7135" w:type="dxa"/>
+            <w:tcW w:w="4263" w:type="pct"/>
             <w:tcBorders>
               <w:top w:val="single" w:color="auto" w:sz="4" w:space="0"/>
               <w:left w:val="single" w:color="auto" w:sz="4" w:space="0"/>
@@ -21209,9 +20662,11 @@
               <w:rPr>
                 <w:rFonts w:hint="eastAsia"/>
                 <w:color w:val="auto"/>
-                <w:lang w:val="en-US" w:eastAsia="zh-CN"/>
-              </w:rPr>
-              <w:t>按键输入；</w:t>
+                <w:sz w:val="21"/>
+                <w:szCs w:val="21"/>
+                <w:lang w:val="en-US" w:eastAsia="zh-CN"/>
+              </w:rPr>
+              <w:t>SPI接口</w:t>
             </w:r>
           </w:p>
         </w:tc>
@@ -21266,7 +20721,7 @@
         </w:tc>
         <w:tc>
           <w:tcPr>
-            <w:tcW w:w="7135" w:type="dxa"/>
+            <w:tcW w:w="4263" w:type="pct"/>
             <w:tcBorders>
               <w:top w:val="single" w:color="auto" w:sz="4" w:space="0"/>
               <w:left w:val="single" w:color="auto" w:sz="4" w:space="0"/>
@@ -21278,6 +20733,10 @@
           </w:tcPr>
           <w:p>
             <w:pPr>
+              <w:numPr>
+                <w:ilvl w:val="0"/>
+                <w:numId w:val="0"/>
+              </w:numPr>
               <w:rPr>
                 <w:rFonts w:hint="default"/>
                 <w:color w:val="auto"/>
@@ -21290,9 +20749,11 @@
               <w:rPr>
                 <w:rFonts w:hint="eastAsia"/>
                 <w:color w:val="auto"/>
-                <w:lang w:val="en-US" w:eastAsia="zh-CN"/>
-              </w:rPr>
-              <w:t>进行设备操作；</w:t>
+                <w:sz w:val="21"/>
+                <w:szCs w:val="21"/>
+                <w:lang w:val="en-US" w:eastAsia="zh-CN"/>
+              </w:rPr>
+              <w:t>控制屏幕显示数据</w:t>
             </w:r>
           </w:p>
         </w:tc>
@@ -21348,7 +20809,7 @@
         </w:tc>
         <w:tc>
           <w:tcPr>
-            <w:tcW w:w="7135" w:type="dxa"/>
+            <w:tcW w:w="4263" w:type="pct"/>
             <w:tcBorders>
               <w:top w:val="single" w:color="auto" w:sz="4" w:space="0"/>
               <w:left w:val="single" w:color="auto" w:sz="4" w:space="0"/>
@@ -21374,7 +20835,7 @@
                 <w:color w:val="auto"/>
                 <w:lang w:val="en-US" w:eastAsia="zh-CN"/>
               </w:rPr>
-              <w:t>ABDSM-R-006-A</w:t>
+              <w:t>ABDSM-R-007-A</w:t>
             </w:r>
           </w:p>
         </w:tc>
@@ -21436,6 +20897,242 @@
         </w:tc>
         <w:tc>
           <w:tcPr>
+            <w:tcW w:w="4263" w:type="pct"/>
+            <w:tcBorders>
+              <w:top w:val="single" w:color="auto" w:sz="4" w:space="0"/>
+              <w:left w:val="single" w:color="auto" w:sz="4" w:space="0"/>
+              <w:bottom w:val="single" w:color="auto" w:sz="4" w:space="0"/>
+              <w:right w:val="single" w:color="auto" w:sz="4" w:space="0"/>
+            </w:tcBorders>
+            <w:noWrap w:val="0"/>
+            <w:vAlign w:val="top"/>
+          </w:tcPr>
+          <w:p>
+            <w:pPr>
+              <w:rPr>
+                <w:rFonts w:hint="default"/>
+                <w:color w:val="auto"/>
+                <w:sz w:val="21"/>
+                <w:szCs w:val="21"/>
+                <w:lang w:val="en-US" w:eastAsia="zh-CN"/>
+              </w:rPr>
+            </w:pPr>
+            <w:r>
+              <w:rPr>
+                <w:rFonts w:hint="eastAsia"/>
+                <w:color w:val="auto"/>
+                <w:sz w:val="21"/>
+                <w:szCs w:val="21"/>
+                <w:lang w:val="en-US" w:eastAsia="zh-CN"/>
+              </w:rPr>
+              <w:t>通过SPI接口与屏幕中的芯片进行通信，实现测量数据的显示及信息录入，接口为双向通信，使用封装的SPI协议，过程无检验。</w:t>
+            </w:r>
+          </w:p>
+        </w:tc>
+      </w:tr>
+    </w:tbl>
+    <w:p>
+      <w:pPr>
+        <w:pStyle w:val="3"/>
+        <w:rPr>
+          <w:rFonts w:hint="default"/>
+          <w:color w:val="auto"/>
+          <w:lang w:val="en-US" w:eastAsia="zh-CN"/>
+        </w:rPr>
+      </w:pPr>
+      <w:bookmarkStart w:id="29" w:name="_Toc11261"/>
+      <w:r>
+        <w:rPr>
+          <w:rFonts w:hint="eastAsia"/>
+          <w:color w:val="auto"/>
+          <w:lang w:val="en-US" w:eastAsia="zh-CN"/>
+        </w:rPr>
+        <w:t>按键通信接口</w:t>
+      </w:r>
+      <w:bookmarkEnd w:id="29"/>
+    </w:p>
+    <w:tbl>
+      <w:tblPr>
+        <w:tblStyle w:val="23"/>
+        <w:tblW w:w="5000" w:type="pct"/>
+        <w:tblInd w:w="0" w:type="dxa"/>
+        <w:tblBorders>
+          <w:top w:val="single" w:color="auto" w:sz="4" w:space="0"/>
+          <w:left w:val="single" w:color="auto" w:sz="4" w:space="0"/>
+          <w:bottom w:val="single" w:color="auto" w:sz="4" w:space="0"/>
+          <w:right w:val="single" w:color="auto" w:sz="4" w:space="0"/>
+          <w:insideH w:val="single" w:color="auto" w:sz="4" w:space="0"/>
+          <w:insideV w:val="single" w:color="auto" w:sz="4" w:space="0"/>
+        </w:tblBorders>
+        <w:tblLayout w:type="autofit"/>
+        <w:tblCellMar>
+          <w:top w:w="0" w:type="dxa"/>
+          <w:left w:w="28" w:type="dxa"/>
+          <w:bottom w:w="0" w:type="dxa"/>
+          <w:right w:w="28" w:type="dxa"/>
+        </w:tblCellMar>
+      </w:tblPr>
+      <w:tblGrid>
+        <w:gridCol w:w="1233"/>
+        <w:gridCol w:w="7135"/>
+      </w:tblGrid>
+      <w:tr>
+        <w:tblPrEx>
+          <w:tblBorders>
+            <w:top w:val="single" w:color="auto" w:sz="4" w:space="0"/>
+            <w:left w:val="single" w:color="auto" w:sz="4" w:space="0"/>
+            <w:bottom w:val="single" w:color="auto" w:sz="4" w:space="0"/>
+            <w:right w:val="single" w:color="auto" w:sz="4" w:space="0"/>
+            <w:insideH w:val="single" w:color="auto" w:sz="4" w:space="0"/>
+            <w:insideV w:val="single" w:color="auto" w:sz="4" w:space="0"/>
+          </w:tblBorders>
+          <w:tblCellMar>
+            <w:top w:w="0" w:type="dxa"/>
+            <w:left w:w="28" w:type="dxa"/>
+            <w:bottom w:w="0" w:type="dxa"/>
+            <w:right w:w="28" w:type="dxa"/>
+          </w:tblCellMar>
+        </w:tblPrEx>
+        <w:trPr>
+          <w:trHeight w:val="90" w:hRule="atLeast"/>
+        </w:trPr>
+        <w:tc>
+          <w:tcPr>
+            <w:tcW w:w="737" w:type="pct"/>
+            <w:tcBorders>
+              <w:top w:val="single" w:color="auto" w:sz="4" w:space="0"/>
+              <w:left w:val="single" w:color="auto" w:sz="4" w:space="0"/>
+              <w:bottom w:val="single" w:color="auto" w:sz="4" w:space="0"/>
+              <w:right w:val="single" w:color="auto" w:sz="4" w:space="0"/>
+            </w:tcBorders>
+            <w:noWrap w:val="0"/>
+            <w:vAlign w:val="top"/>
+          </w:tcPr>
+          <w:p>
+            <w:pPr>
+              <w:jc w:val="center"/>
+              <w:rPr>
+                <w:rFonts w:hint="eastAsia"/>
+                <w:color w:val="auto"/>
+                <w:sz w:val="21"/>
+                <w:szCs w:val="21"/>
+              </w:rPr>
+            </w:pPr>
+            <w:r>
+              <w:rPr>
+                <w:color w:val="auto"/>
+                <w:sz w:val="21"/>
+                <w:szCs w:val="21"/>
+              </w:rPr>
+              <w:t>架构编号</w:t>
+            </w:r>
+          </w:p>
+        </w:tc>
+        <w:tc>
+          <w:tcPr>
+            <w:tcW w:w="4263" w:type="pct"/>
+            <w:tcBorders>
+              <w:top w:val="single" w:color="auto" w:sz="4" w:space="0"/>
+              <w:left w:val="single" w:color="auto" w:sz="4" w:space="0"/>
+              <w:bottom w:val="single" w:color="auto" w:sz="4" w:space="0"/>
+              <w:right w:val="single" w:color="auto" w:sz="4" w:space="0"/>
+            </w:tcBorders>
+            <w:noWrap w:val="0"/>
+            <w:vAlign w:val="top"/>
+          </w:tcPr>
+          <w:p>
+            <w:pPr>
+              <w:rPr>
+                <w:rFonts w:hint="default"/>
+                <w:color w:val="auto"/>
+                <w:sz w:val="21"/>
+                <w:szCs w:val="21"/>
+                <w:lang w:val="en-US"/>
+              </w:rPr>
+            </w:pPr>
+            <w:r>
+              <w:rPr>
+                <w:rFonts w:hint="eastAsia"/>
+                <w:color w:val="auto"/>
+                <w:sz w:val="21"/>
+                <w:szCs w:val="21"/>
+                <w:lang w:val="en-US" w:eastAsia="zh-CN"/>
+              </w:rPr>
+              <w:t>ABDSM</w:t>
+            </w:r>
+            <w:r>
+              <w:rPr>
+                <w:rFonts w:hint="eastAsia"/>
+                <w:color w:val="auto"/>
+                <w:sz w:val="21"/>
+                <w:szCs w:val="21"/>
+                <w:lang w:val="de-DE"/>
+              </w:rPr>
+              <w:t>-Arch-SYS-</w:t>
+            </w:r>
+            <w:r>
+              <w:rPr>
+                <w:rFonts w:hint="eastAsia"/>
+                <w:color w:val="auto"/>
+                <w:sz w:val="21"/>
+                <w:szCs w:val="21"/>
+                <w:lang w:val="en-US" w:eastAsia="zh-CN"/>
+              </w:rPr>
+              <w:t>026</w:t>
+            </w:r>
+          </w:p>
+        </w:tc>
+      </w:tr>
+      <w:tr>
+        <w:tblPrEx>
+          <w:tblBorders>
+            <w:top w:val="single" w:color="auto" w:sz="4" w:space="0"/>
+            <w:left w:val="single" w:color="auto" w:sz="4" w:space="0"/>
+            <w:bottom w:val="single" w:color="auto" w:sz="4" w:space="0"/>
+            <w:right w:val="single" w:color="auto" w:sz="4" w:space="0"/>
+            <w:insideH w:val="single" w:color="auto" w:sz="4" w:space="0"/>
+            <w:insideV w:val="single" w:color="auto" w:sz="4" w:space="0"/>
+          </w:tblBorders>
+          <w:tblCellMar>
+            <w:top w:w="0" w:type="dxa"/>
+            <w:left w:w="28" w:type="dxa"/>
+            <w:bottom w:w="0" w:type="dxa"/>
+            <w:right w:w="28" w:type="dxa"/>
+          </w:tblCellMar>
+        </w:tblPrEx>
+        <w:tc>
+          <w:tcPr>
+            <w:tcW w:w="737" w:type="pct"/>
+            <w:tcBorders>
+              <w:top w:val="single" w:color="auto" w:sz="4" w:space="0"/>
+              <w:left w:val="single" w:color="auto" w:sz="4" w:space="0"/>
+              <w:bottom w:val="single" w:color="auto" w:sz="4" w:space="0"/>
+              <w:right w:val="single" w:color="auto" w:sz="4" w:space="0"/>
+            </w:tcBorders>
+            <w:noWrap w:val="0"/>
+            <w:vAlign w:val="top"/>
+          </w:tcPr>
+          <w:p>
+            <w:pPr>
+              <w:jc w:val="center"/>
+              <w:rPr>
+                <w:color w:val="auto"/>
+                <w:sz w:val="21"/>
+                <w:szCs w:val="21"/>
+              </w:rPr>
+            </w:pPr>
+            <w:r>
+              <w:rPr>
+                <w:color w:val="auto"/>
+                <w:sz w:val="21"/>
+                <w:szCs w:val="21"/>
+              </w:rPr>
+              <w:t>架构摘要</w:t>
+            </w:r>
+          </w:p>
+        </w:tc>
+        <w:tc>
+          <w:tcPr>
             <w:tcW w:w="7135" w:type="dxa"/>
             <w:tcBorders>
               <w:top w:val="single" w:color="auto" w:sz="4" w:space="0"/>
@@ -21449,6 +21146,257 @@
           <w:p>
             <w:pPr>
               <w:rPr>
+                <w:rFonts w:hint="default" w:eastAsia="华文楷体"/>
+                <w:color w:val="auto"/>
+                <w:sz w:val="21"/>
+                <w:szCs w:val="21"/>
+                <w:lang w:val="en-US" w:eastAsia="zh-CN"/>
+              </w:rPr>
+            </w:pPr>
+            <w:r>
+              <w:rPr>
+                <w:rFonts w:hint="eastAsia"/>
+                <w:color w:val="auto"/>
+                <w:lang w:val="en-US" w:eastAsia="zh-CN"/>
+              </w:rPr>
+              <w:t>按键输入；</w:t>
+            </w:r>
+          </w:p>
+        </w:tc>
+      </w:tr>
+      <w:tr>
+        <w:tblPrEx>
+          <w:tblBorders>
+            <w:top w:val="single" w:color="auto" w:sz="4" w:space="0"/>
+            <w:left w:val="single" w:color="auto" w:sz="4" w:space="0"/>
+            <w:bottom w:val="single" w:color="auto" w:sz="4" w:space="0"/>
+            <w:right w:val="single" w:color="auto" w:sz="4" w:space="0"/>
+            <w:insideH w:val="single" w:color="auto" w:sz="4" w:space="0"/>
+            <w:insideV w:val="single" w:color="auto" w:sz="4" w:space="0"/>
+          </w:tblBorders>
+          <w:tblCellMar>
+            <w:top w:w="0" w:type="dxa"/>
+            <w:left w:w="28" w:type="dxa"/>
+            <w:bottom w:w="0" w:type="dxa"/>
+            <w:right w:w="28" w:type="dxa"/>
+          </w:tblCellMar>
+        </w:tblPrEx>
+        <w:tc>
+          <w:tcPr>
+            <w:tcW w:w="737" w:type="pct"/>
+            <w:tcBorders>
+              <w:top w:val="single" w:color="auto" w:sz="4" w:space="0"/>
+              <w:left w:val="single" w:color="auto" w:sz="4" w:space="0"/>
+              <w:bottom w:val="single" w:color="auto" w:sz="4" w:space="0"/>
+              <w:right w:val="single" w:color="auto" w:sz="4" w:space="0"/>
+            </w:tcBorders>
+            <w:noWrap w:val="0"/>
+            <w:vAlign w:val="top"/>
+          </w:tcPr>
+          <w:p>
+            <w:pPr>
+              <w:jc w:val="center"/>
+              <w:rPr>
+                <w:color w:val="auto"/>
+                <w:sz w:val="21"/>
+                <w:szCs w:val="21"/>
+              </w:rPr>
+            </w:pPr>
+            <w:r>
+              <w:rPr>
+                <w:color w:val="auto"/>
+                <w:sz w:val="21"/>
+                <w:szCs w:val="21"/>
+              </w:rPr>
+              <w:t>架构描述</w:t>
+            </w:r>
+          </w:p>
+        </w:tc>
+        <w:tc>
+          <w:tcPr>
+            <w:tcW w:w="7135" w:type="dxa"/>
+            <w:tcBorders>
+              <w:top w:val="single" w:color="auto" w:sz="4" w:space="0"/>
+              <w:left w:val="single" w:color="auto" w:sz="4" w:space="0"/>
+              <w:bottom w:val="single" w:color="auto" w:sz="4" w:space="0"/>
+              <w:right w:val="single" w:color="auto" w:sz="4" w:space="0"/>
+            </w:tcBorders>
+            <w:noWrap w:val="0"/>
+            <w:vAlign w:val="top"/>
+          </w:tcPr>
+          <w:p>
+            <w:pPr>
+              <w:rPr>
+                <w:rFonts w:hint="default"/>
+                <w:color w:val="auto"/>
+                <w:sz w:val="21"/>
+                <w:szCs w:val="21"/>
+                <w:lang w:val="en-US" w:eastAsia="zh-CN"/>
+              </w:rPr>
+            </w:pPr>
+            <w:r>
+              <w:rPr>
+                <w:rFonts w:hint="eastAsia"/>
+                <w:color w:val="auto"/>
+                <w:lang w:val="en-US" w:eastAsia="zh-CN"/>
+              </w:rPr>
+              <w:t>进行设备操作；</w:t>
+            </w:r>
+          </w:p>
+        </w:tc>
+      </w:tr>
+      <w:tr>
+        <w:tblPrEx>
+          <w:tblBorders>
+            <w:top w:val="single" w:color="auto" w:sz="4" w:space="0"/>
+            <w:left w:val="single" w:color="auto" w:sz="4" w:space="0"/>
+            <w:bottom w:val="single" w:color="auto" w:sz="4" w:space="0"/>
+            <w:right w:val="single" w:color="auto" w:sz="4" w:space="0"/>
+            <w:insideH w:val="single" w:color="auto" w:sz="4" w:space="0"/>
+            <w:insideV w:val="single" w:color="auto" w:sz="4" w:space="0"/>
+          </w:tblBorders>
+          <w:tblCellMar>
+            <w:top w:w="0" w:type="dxa"/>
+            <w:left w:w="28" w:type="dxa"/>
+            <w:bottom w:w="0" w:type="dxa"/>
+            <w:right w:w="28" w:type="dxa"/>
+          </w:tblCellMar>
+        </w:tblPrEx>
+        <w:tc>
+          <w:tcPr>
+            <w:tcW w:w="737" w:type="pct"/>
+            <w:tcBorders>
+              <w:top w:val="single" w:color="auto" w:sz="4" w:space="0"/>
+              <w:left w:val="single" w:color="auto" w:sz="4" w:space="0"/>
+              <w:bottom w:val="single" w:color="auto" w:sz="4" w:space="0"/>
+              <w:right w:val="single" w:color="auto" w:sz="4" w:space="0"/>
+            </w:tcBorders>
+            <w:noWrap w:val="0"/>
+            <w:vAlign w:val="top"/>
+          </w:tcPr>
+          <w:p>
+            <w:pPr>
+              <w:jc w:val="center"/>
+              <w:rPr>
+                <w:rFonts w:hint="eastAsia"/>
+                <w:color w:val="auto"/>
+                <w:sz w:val="21"/>
+                <w:szCs w:val="21"/>
+              </w:rPr>
+            </w:pPr>
+            <w:r>
+              <w:rPr>
+                <w:color w:val="auto"/>
+                <w:sz w:val="21"/>
+                <w:szCs w:val="21"/>
+              </w:rPr>
+              <w:t>对应需求</w:t>
+            </w:r>
+          </w:p>
+        </w:tc>
+        <w:tc>
+          <w:tcPr>
+            <w:tcW w:w="7135" w:type="dxa"/>
+            <w:tcBorders>
+              <w:top w:val="single" w:color="auto" w:sz="4" w:space="0"/>
+              <w:left w:val="single" w:color="auto" w:sz="4" w:space="0"/>
+              <w:bottom w:val="single" w:color="auto" w:sz="4" w:space="0"/>
+              <w:right w:val="single" w:color="auto" w:sz="4" w:space="0"/>
+            </w:tcBorders>
+            <w:noWrap w:val="0"/>
+            <w:vAlign w:val="top"/>
+          </w:tcPr>
+          <w:p>
+            <w:pPr>
+              <w:rPr>
+                <w:rFonts w:hint="eastAsia"/>
+                <w:color w:val="auto"/>
+                <w:sz w:val="21"/>
+                <w:szCs w:val="21"/>
+                <w:lang w:val="en-US" w:eastAsia="zh-CN"/>
+              </w:rPr>
+            </w:pPr>
+            <w:r>
+              <w:rPr>
+                <w:rFonts w:hint="eastAsia"/>
+                <w:color w:val="auto"/>
+                <w:lang w:val="en-US" w:eastAsia="zh-CN"/>
+              </w:rPr>
+              <w:t>ABDSM-R-006-A</w:t>
+            </w:r>
+          </w:p>
+        </w:tc>
+      </w:tr>
+      <w:tr>
+        <w:tblPrEx>
+          <w:tblBorders>
+            <w:top w:val="single" w:color="auto" w:sz="4" w:space="0"/>
+            <w:left w:val="single" w:color="auto" w:sz="4" w:space="0"/>
+            <w:bottom w:val="single" w:color="auto" w:sz="4" w:space="0"/>
+            <w:right w:val="single" w:color="auto" w:sz="4" w:space="0"/>
+            <w:insideH w:val="single" w:color="auto" w:sz="4" w:space="0"/>
+            <w:insideV w:val="single" w:color="auto" w:sz="4" w:space="0"/>
+          </w:tblBorders>
+          <w:tblCellMar>
+            <w:top w:w="0" w:type="dxa"/>
+            <w:left w:w="28" w:type="dxa"/>
+            <w:bottom w:w="0" w:type="dxa"/>
+            <w:right w:w="28" w:type="dxa"/>
+          </w:tblCellMar>
+        </w:tblPrEx>
+        <w:trPr>
+          <w:trHeight w:val="959" w:hRule="atLeast"/>
+        </w:trPr>
+        <w:tc>
+          <w:tcPr>
+            <w:tcW w:w="737" w:type="pct"/>
+            <w:tcBorders>
+              <w:top w:val="single" w:color="auto" w:sz="4" w:space="0"/>
+              <w:left w:val="single" w:color="auto" w:sz="4" w:space="0"/>
+              <w:bottom w:val="single" w:color="auto" w:sz="4" w:space="0"/>
+              <w:right w:val="single" w:color="auto" w:sz="4" w:space="0"/>
+            </w:tcBorders>
+            <w:noWrap w:val="0"/>
+            <w:vAlign w:val="center"/>
+          </w:tcPr>
+          <w:p>
+            <w:pPr>
+              <w:jc w:val="center"/>
+              <w:rPr>
+                <w:rFonts w:hint="eastAsia" w:eastAsia="华文楷体"/>
+                <w:color w:val="auto"/>
+                <w:sz w:val="21"/>
+                <w:szCs w:val="21"/>
+                <w:lang w:val="en-US" w:eastAsia="zh-CN"/>
+              </w:rPr>
+            </w:pPr>
+            <w:r>
+              <w:rPr>
+                <w:rFonts w:hint="eastAsia"/>
+                <w:color w:val="auto"/>
+                <w:sz w:val="21"/>
+                <w:szCs w:val="21"/>
+                <w:lang w:val="en-US" w:eastAsia="zh-CN"/>
+              </w:rPr>
+              <w:t>简介</w:t>
+            </w:r>
+          </w:p>
+        </w:tc>
+        <w:tc>
+          <w:tcPr>
+            <w:tcW w:w="7135" w:type="dxa"/>
+            <w:tcBorders>
+              <w:top w:val="single" w:color="auto" w:sz="4" w:space="0"/>
+              <w:left w:val="single" w:color="auto" w:sz="4" w:space="0"/>
+              <w:bottom w:val="single" w:color="auto" w:sz="4" w:space="0"/>
+              <w:right w:val="single" w:color="auto" w:sz="4" w:space="0"/>
+            </w:tcBorders>
+            <w:noWrap w:val="0"/>
+            <w:vAlign w:val="top"/>
+          </w:tcPr>
+          <w:p>
+            <w:pPr>
+              <w:rPr>
                 <w:rFonts w:hint="default"/>
                 <w:color w:val="auto"/>
                 <w:sz w:val="21"/>
@@ -21484,7 +21432,7 @@
           <w:color w:val="auto"/>
         </w:rPr>
       </w:pPr>
-      <w:bookmarkStart w:id="29" w:name="_Toc6068"/>
+      <w:bookmarkStart w:id="30" w:name="_Toc9330"/>
       <w:r>
         <w:rPr>
           <w:rFonts w:hint="eastAsia"/>
@@ -21493,7 +21441,7 @@
         </w:rPr>
         <w:t>RS485数字信号通信工程师站</w:t>
       </w:r>
-      <w:bookmarkEnd w:id="29"/>
+      <w:bookmarkEnd w:id="30"/>
     </w:p>
     <w:tbl>
       <w:tblPr>
@@ -21938,7 +21886,7 @@
           <w:color w:val="auto"/>
         </w:rPr>
       </w:pPr>
-      <w:bookmarkStart w:id="30" w:name="_Toc1910"/>
+      <w:bookmarkStart w:id="31" w:name="_Toc19921"/>
       <w:r>
         <w:rPr>
           <w:rFonts w:hint="eastAsia"/>
@@ -21947,6 +21895,7 @@
         </w:rPr>
         <w:t>CPU2_Hart 数字信号通信</w:t>
       </w:r>
+      <w:bookmarkEnd w:id="31"/>
     </w:p>
     <w:tbl>
       <w:tblPr>
@@ -22450,6 +22399,7 @@
           <w:color w:val="auto"/>
         </w:rPr>
       </w:pPr>
+      <w:bookmarkStart w:id="32" w:name="_Toc11820"/>
       <w:r>
         <w:rPr>
           <w:rFonts w:hint="eastAsia"/>
@@ -22458,7 +22408,7 @@
         </w:rPr>
         <w:t>CPU3_Hart 数字信号通信</w:t>
       </w:r>
-      <w:bookmarkEnd w:id="30"/>
+      <w:bookmarkEnd w:id="32"/>
     </w:p>
     <w:tbl>
       <w:tblPr>
@@ -22962,7 +22912,7 @@
           <w:rFonts w:hint="eastAsia"/>
         </w:rPr>
       </w:pPr>
-      <w:bookmarkStart w:id="31" w:name="_Toc13696"/>
+      <w:bookmarkStart w:id="33" w:name="_Toc31140"/>
       <w:r>
         <w:rPr>
           <w:rFonts w:hint="eastAsia"/>
@@ -22970,7 +22920,7 @@
         </w:rPr>
         <w:t>状态转移</w:t>
       </w:r>
-      <w:bookmarkEnd w:id="31"/>
+      <w:bookmarkEnd w:id="33"/>
     </w:p>
     <w:p>
       <w:pPr>
@@ -28059,6 +28009,14 @@
     </w:tblGrid>
     <w:tr>
       <w:tblPrEx>
+        <w:tblBorders>
+          <w:top w:val="single" w:color="FFFFFF" w:sz="4" w:space="0"/>
+          <w:left w:val="single" w:color="FFFFFF" w:sz="4" w:space="0"/>
+          <w:bottom w:val="single" w:color="FFFFFF" w:sz="4" w:space="0"/>
+          <w:right w:val="single" w:color="FFFFFF" w:sz="4" w:space="0"/>
+          <w:insideH w:val="single" w:color="FFFFFF" w:sz="4" w:space="0"/>
+          <w:insideV w:val="single" w:color="FFFFFF" w:sz="4" w:space="0"/>
+        </w:tblBorders>
         <w:tblCellMar>
           <w:top w:w="0" w:type="dxa"/>
           <w:left w:w="28" w:type="dxa"/>
@@ -28202,6 +28160,12 @@
           <w:insideH w:val="single" w:color="FFFFFF" w:sz="4" w:space="0"/>
           <w:insideV w:val="single" w:color="FFFFFF" w:sz="4" w:space="0"/>
         </w:tblBorders>
+        <w:tblCellMar>
+          <w:top w:w="0" w:type="dxa"/>
+          <w:left w:w="28" w:type="dxa"/>
+          <w:bottom w:w="0" w:type="dxa"/>
+          <w:right w:w="28" w:type="dxa"/>
+        </w:tblCellMar>
       </w:tblPrEx>
       <w:tc>
         <w:tcPr>

</xml_diff>

<commit_message>
docs: 更新项目资料索引并纳入WorkBuddy根目录白名单（CPU2 V1.42.7.0 / CPU3 V1.40.1.0）
版本：
- CPU2 V1.42.7.0；CPU3 V1.40.1.0，文档与仓库规则改动不调整固件版本。
协议版本/兼容性：
- 不涉及协议、寄存器或通信兼容性变更。
本次修改：
- 更新构建版本、协议、界面、SIL及总入口文档索引；补充架构设计资料；将 .workbuddy 纳入仓库根目录白名单及忽略规则。
验证：
- 通过提交范围检查、暂存区空白检查、版本标题检查及仓库根目录布局检查。
</commit_message>
<xml_diff>
--- a/docs/06_SIL功能安全认证/02_软件架构/CG01.系统架构设计-V1.2.docx
+++ b/docs/06_SIL功能安全认证/02_软件架构/CG01.系统架构设计-V1.2.docx
@@ -8,8 +8,6 @@
           <w:rFonts w:hint="eastAsia"/>
         </w:rPr>
       </w:pPr>
-      <w:bookmarkStart w:id="34" w:name="_GoBack"/>
-      <w:bookmarkEnd w:id="34"/>
     </w:p>
     <w:p/>
     <w:p/>
@@ -54,7 +52,7 @@
           <w:bCs/>
           <w:lang w:val="en-US" w:eastAsia="zh-CN"/>
         </w:rPr>
-        <w:t>DSM系列储罐在线自动计量仪</w:t>
+        <w:t>DSM-Ⅱ系列储罐在线自动计量仪</w:t>
       </w:r>
     </w:p>
     <w:p>
@@ -326,9 +324,16 @@
             <w:r>
               <w:rPr>
                 <w:rFonts w:hint="eastAsia"/>
+                <w:lang w:val="en-US" w:eastAsia="zh-CN"/>
+              </w:rPr>
+              <w:t>DSM-Ⅱ</w:t>
+            </w:r>
+            <w:r>
+              <w:rPr>
+                <w:rFonts w:hint="eastAsia"/>
                 <w:lang w:eastAsia="zh-CN"/>
               </w:rPr>
-              <w:t>DSM系列储罐在线自动计量仪</w:t>
+              <w:t>系列储罐在线自动计量仪</w:t>
             </w:r>
             <w:r>
               <w:rPr>
@@ -395,41 +400,9 @@
             <w:r>
               <w:rPr>
                 <w:rFonts w:hint="eastAsia"/>
-              </w:rPr>
-              <w:t>20</w:t>
-            </w:r>
-            <w:r>
-              <w:rPr>
-                <w:rFonts w:hint="eastAsia"/>
-                <w:lang w:val="en-US" w:eastAsia="zh-CN"/>
-              </w:rPr>
-              <w:t>23</w:t>
-            </w:r>
-            <w:r>
-              <w:rPr>
-                <w:rFonts w:hint="eastAsia"/>
-              </w:rPr>
-              <w:t>-</w:t>
-            </w:r>
-            <w:r>
-              <w:rPr>
-                <w:rFonts w:hint="eastAsia"/>
-                <w:lang w:val="en-US" w:eastAsia="zh-CN"/>
-              </w:rPr>
-              <w:t>04</w:t>
-            </w:r>
-            <w:r>
-              <w:rPr>
-                <w:rFonts w:hint="eastAsia"/>
-              </w:rPr>
-              <w:t>-</w:t>
-            </w:r>
-            <w:r>
-              <w:rPr>
-                <w:rFonts w:hint="eastAsia"/>
-                <w:lang w:val="en-US" w:eastAsia="zh-CN"/>
-              </w:rPr>
-              <w:t>18</w:t>
+                <w:lang w:val="en-US" w:eastAsia="zh-CN"/>
+              </w:rPr>
+              <w:t>2026.08.25</w:t>
             </w:r>
           </w:p>
         </w:tc>
@@ -510,49 +483,6 @@
                 <w:lang w:val="en-US" w:eastAsia="zh-CN"/>
               </w:rPr>
             </w:pPr>
-            <w:r>
-              <w:rPr>
-                <w:rFonts w:hint="default" w:eastAsia="宋体"/>
-                <w:lang w:val="en-US" w:eastAsia="zh-CN"/>
-              </w:rPr>
-              <w:drawing>
-                <wp:inline distT="0" distB="0" distL="114300" distR="114300">
-                  <wp:extent cx="552450" cy="327025"/>
-                  <wp:effectExtent l="0" t="0" r="0" b="15875"/>
-                  <wp:docPr id="2" name="图片 2" descr="赵国庆"/>
-                  <wp:cNvGraphicFramePr>
-                    <a:graphicFrameLocks xmlns:a="http://schemas.openxmlformats.org/drawingml/2006/main" noChangeAspect="1"/>
-                  </wp:cNvGraphicFramePr>
-                  <a:graphic xmlns:a="http://schemas.openxmlformats.org/drawingml/2006/main">
-                    <a:graphicData uri="http://schemas.openxmlformats.org/drawingml/2006/picture">
-                      <pic:pic xmlns:pic="http://schemas.openxmlformats.org/drawingml/2006/picture">
-                        <pic:nvPicPr>
-                          <pic:cNvPr id="2" name="图片 2" descr="赵国庆"/>
-                          <pic:cNvPicPr>
-                            <a:picLocks noChangeAspect="1"/>
-                          </pic:cNvPicPr>
-                        </pic:nvPicPr>
-                        <pic:blipFill>
-                          <a:blip r:embed="rId8"/>
-                          <a:stretch>
-                            <a:fillRect/>
-                          </a:stretch>
-                        </pic:blipFill>
-                        <pic:spPr>
-                          <a:xfrm>
-                            <a:off x="0" y="0"/>
-                            <a:ext cx="552450" cy="327025"/>
-                          </a:xfrm>
-                          <a:prstGeom prst="rect">
-                            <a:avLst/>
-                          </a:prstGeom>
-                        </pic:spPr>
-                      </pic:pic>
-                    </a:graphicData>
-                  </a:graphic>
-                </wp:inline>
-              </w:drawing>
-            </w:r>
           </w:p>
         </w:tc>
         <w:tc>
@@ -609,49 +539,6 @@
                 <w:lang w:val="en-US" w:eastAsia="zh-CN"/>
               </w:rPr>
             </w:pPr>
-            <w:r>
-              <w:rPr>
-                <w:rFonts w:hint="eastAsia" w:eastAsia="华文楷体"/>
-                <w:lang w:val="en-US" w:eastAsia="zh-CN"/>
-              </w:rPr>
-              <w:drawing>
-                <wp:inline distT="0" distB="0" distL="114300" distR="114300">
-                  <wp:extent cx="817880" cy="313690"/>
-                  <wp:effectExtent l="0" t="0" r="1270" b="10795"/>
-                  <wp:docPr id="3" name="图片 3" descr="WPS图片(1)"/>
-                  <wp:cNvGraphicFramePr>
-                    <a:graphicFrameLocks xmlns:a="http://schemas.openxmlformats.org/drawingml/2006/main" noChangeAspect="1"/>
-                  </wp:cNvGraphicFramePr>
-                  <a:graphic xmlns:a="http://schemas.openxmlformats.org/drawingml/2006/main">
-                    <a:graphicData uri="http://schemas.openxmlformats.org/drawingml/2006/picture">
-                      <pic:pic xmlns:pic="http://schemas.openxmlformats.org/drawingml/2006/picture">
-                        <pic:nvPicPr>
-                          <pic:cNvPr id="3" name="图片 3" descr="WPS图片(1)"/>
-                          <pic:cNvPicPr>
-                            <a:picLocks noChangeAspect="1"/>
-                          </pic:cNvPicPr>
-                        </pic:nvPicPr>
-                        <pic:blipFill>
-                          <a:blip r:embed="rId9"/>
-                          <a:stretch>
-                            <a:fillRect/>
-                          </a:stretch>
-                        </pic:blipFill>
-                        <pic:spPr>
-                          <a:xfrm>
-                            <a:off x="0" y="0"/>
-                            <a:ext cx="817880" cy="313690"/>
-                          </a:xfrm>
-                          <a:prstGeom prst="rect">
-                            <a:avLst/>
-                          </a:prstGeom>
-                        </pic:spPr>
-                      </pic:pic>
-                    </a:graphicData>
-                  </a:graphic>
-                </wp:inline>
-              </w:drawing>
-            </w:r>
           </w:p>
         </w:tc>
       </w:tr>
@@ -1191,7 +1078,7 @@
                 <w:rFonts w:hint="eastAsia"/>
                 <w:lang w:val="en-US" w:eastAsia="zh-CN"/>
               </w:rPr>
-              <w:t>赵国庆</w:t>
+              <w:t>段学斌</w:t>
             </w:r>
           </w:p>
         </w:tc>
@@ -1249,7 +1136,7 @@
                 <w:rFonts w:hint="eastAsia"/>
                 <w:lang w:val="en-US" w:eastAsia="zh-CN"/>
               </w:rPr>
-              <w:t>2022.06.21</w:t>
+              <w:t>2026.06.21</w:t>
             </w:r>
           </w:p>
         </w:tc>
@@ -1295,13 +1182,6 @@
                 <w:lang w:val="en-US" w:eastAsia="zh-CN"/>
               </w:rPr>
             </w:pPr>
-            <w:r>
-              <w:rPr>
-                <w:rFonts w:hint="eastAsia"/>
-                <w:lang w:val="en-US" w:eastAsia="zh-CN"/>
-              </w:rPr>
-              <w:t>V1.1</w:t>
-            </w:r>
           </w:p>
         </w:tc>
         <w:tc>
@@ -1322,13 +1202,6 @@
                 <w:lang w:val="en-US" w:eastAsia="zh-CN"/>
               </w:rPr>
             </w:pPr>
-            <w:r>
-              <w:rPr>
-                <w:rFonts w:hint="eastAsia"/>
-                <w:lang w:val="en-US" w:eastAsia="zh-CN"/>
-              </w:rPr>
-              <w:t>增加硬件接口部分内容</w:t>
-            </w:r>
           </w:p>
         </w:tc>
         <w:tc>
@@ -1349,13 +1222,6 @@
                 <w:lang w:val="en-US" w:eastAsia="zh-CN"/>
               </w:rPr>
             </w:pPr>
-            <w:r>
-              <w:rPr>
-                <w:rFonts w:hint="eastAsia"/>
-                <w:lang w:val="en-US" w:eastAsia="zh-CN"/>
-              </w:rPr>
-              <w:t>赵国庆</w:t>
-            </w:r>
           </w:p>
         </w:tc>
         <w:tc>
@@ -1378,13 +1244,6 @@
                 <w:lang w:val="en-US" w:eastAsia="zh-CN"/>
               </w:rPr>
             </w:pPr>
-            <w:r>
-              <w:rPr>
-                <w:rFonts w:hint="eastAsia"/>
-                <w:lang w:val="en-US" w:eastAsia="zh-CN"/>
-              </w:rPr>
-              <w:t>崔桂亮</w:t>
-            </w:r>
           </w:p>
         </w:tc>
         <w:tc>
@@ -1407,13 +1266,6 @@
                 <w:lang w:val="en-US" w:eastAsia="zh-CN"/>
               </w:rPr>
             </w:pPr>
-            <w:r>
-              <w:rPr>
-                <w:rFonts w:hint="eastAsia"/>
-                <w:lang w:val="en-US" w:eastAsia="zh-CN"/>
-              </w:rPr>
-              <w:t>2022.10.24</w:t>
-            </w:r>
           </w:p>
         </w:tc>
       </w:tr>
@@ -1458,13 +1310,6 @@
                 <w:lang w:val="en-US" w:eastAsia="zh-CN"/>
               </w:rPr>
             </w:pPr>
-            <w:r>
-              <w:rPr>
-                <w:rFonts w:hint="eastAsia"/>
-                <w:lang w:val="en-US" w:eastAsia="zh-CN"/>
-              </w:rPr>
-              <w:t>V1.2</w:t>
-            </w:r>
           </w:p>
         </w:tc>
         <w:tc>
@@ -1485,31 +1330,6 @@
                 <w:lang w:val="en-US" w:eastAsia="zh-CN"/>
               </w:rPr>
             </w:pPr>
-            <w:r>
-              <w:rPr>
-                <w:rFonts w:hint="eastAsia"/>
-                <w:lang w:val="en-US" w:eastAsia="zh-CN"/>
-              </w:rPr>
-              <w:t>更新硬件接口描述中对应的</w:t>
-            </w:r>
-            <w:r>
-              <w:rPr>
-                <w:color w:val="auto"/>
-                <w:sz w:val="21"/>
-                <w:szCs w:val="21"/>
-              </w:rPr>
-              <w:t>架构编号</w:t>
-            </w:r>
-            <w:r>
-              <w:rPr>
-                <w:rFonts w:hint="eastAsia"/>
-                <w:color w:val="auto"/>
-                <w:sz w:val="21"/>
-                <w:szCs w:val="21"/>
-                <w:lang w:val="en-US" w:eastAsia="zh-CN"/>
-              </w:rPr>
-              <w:t>和需求响应编号</w:t>
-            </w:r>
           </w:p>
         </w:tc>
         <w:tc>
@@ -1530,13 +1350,6 @@
                 <w:lang w:val="en-US" w:eastAsia="zh-CN"/>
               </w:rPr>
             </w:pPr>
-            <w:r>
-              <w:rPr>
-                <w:rFonts w:hint="eastAsia"/>
-                <w:lang w:val="en-US" w:eastAsia="zh-CN"/>
-              </w:rPr>
-              <w:t>赵国庆</w:t>
-            </w:r>
           </w:p>
         </w:tc>
         <w:tc>
@@ -1559,13 +1372,6 @@
                 <w:lang w:val="en-US" w:eastAsia="zh-CN"/>
               </w:rPr>
             </w:pPr>
-            <w:r>
-              <w:rPr>
-                <w:rFonts w:hint="eastAsia"/>
-                <w:lang w:val="en-US" w:eastAsia="zh-CN"/>
-              </w:rPr>
-              <w:t>崔桂亮</w:t>
-            </w:r>
           </w:p>
         </w:tc>
         <w:tc>
@@ -1588,13 +1394,6 @@
                 <w:lang w:val="en-US" w:eastAsia="zh-CN"/>
               </w:rPr>
             </w:pPr>
-            <w:r>
-              <w:rPr>
-                <w:rFonts w:hint="eastAsia"/>
-                <w:lang w:val="en-US" w:eastAsia="zh-CN"/>
-              </w:rPr>
-              <w:t>2023.04.18</w:t>
-            </w:r>
           </w:p>
         </w:tc>
       </w:tr>
@@ -1641,46 +1440,28 @@
                 <w:lang w:eastAsia="zh-CN"/>
               </w:rPr>
             </w:pPr>
-            <w:r>
+          </w:p>
+        </w:tc>
+        <w:tc>
+          <w:tcPr>
+            <w:tcW w:w="2456" w:type="pct"/>
+            <w:tcBorders>
+              <w:left w:val="single" w:color="auto" w:sz="6" w:space="0"/>
+              <w:right w:val="single" w:color="auto" w:sz="4" w:space="0"/>
+            </w:tcBorders>
+            <w:noWrap w:val="0"/>
+            <w:vAlign w:val="center"/>
+          </w:tcPr>
+          <w:p>
+            <w:pPr>
+              <w:jc w:val="left"/>
               <w:rPr>
                 <w:rFonts w:hint="eastAsia" w:eastAsia="华文楷体"/>
                 <w:b w:val="0"/>
                 <w:sz w:val="21"/>
                 <w:lang w:eastAsia="zh-CN"/>
               </w:rPr>
-              <w:t>V1.2-R1</w:t>
-            </w:r>
-          </w:p>
-        </w:tc>
-        <w:tc>
-          <w:tcPr>
-            <w:tcW w:w="2456" w:type="pct"/>
-            <w:tcBorders>
-              <w:left w:val="single" w:color="auto" w:sz="6" w:space="0"/>
-              <w:right w:val="single" w:color="auto" w:sz="4" w:space="0"/>
-            </w:tcBorders>
-            <w:noWrap w:val="0"/>
-            <w:vAlign w:val="center"/>
-          </w:tcPr>
-          <w:p>
-            <w:pPr>
-              <w:jc w:val="left"/>
-              <w:rPr>
-                <w:rFonts w:hint="eastAsia" w:eastAsia="华文楷体"/>
-                <w:b w:val="0"/>
-                <w:sz w:val="21"/>
-                <w:lang w:eastAsia="zh-CN"/>
-              </w:rPr>
-            </w:pPr>
-            <w:r>
-              <w:rPr>
-                <w:rFonts w:hint="eastAsia" w:eastAsia="华文楷体"/>
-                <w:b w:val="0"/>
-                <w:sz w:val="21"/>
-                <w:lang w:eastAsia="zh-CN"/>
-              </w:rPr>
-              <w:t>更新状态转移设计：配置模式作为默认待命，分离界位安全测量与非安全流程（待签审）</w:t>
-            </w:r>
+            </w:pPr>
           </w:p>
         </w:tc>
         <w:tc>
@@ -1751,15 +1532,6 @@
                 <w:lang w:eastAsia="zh-CN"/>
               </w:rPr>
             </w:pPr>
-            <w:r>
-              <w:rPr>
-                <w:rFonts w:hint="eastAsia" w:eastAsia="华文楷体"/>
-                <w:b w:val="0"/>
-                <w:sz w:val="21"/>
-                <w:lang w:eastAsia="zh-CN"/>
-              </w:rPr>
-              <w:t>2026.08.07</w:t>
-            </w:r>
           </w:p>
         </w:tc>
       </w:tr>
@@ -1806,20 +1578,33 @@
                 <w:lang w:eastAsia="zh-CN"/>
               </w:rPr>
             </w:pPr>
-            <w:r>
+          </w:p>
+        </w:tc>
+        <w:tc>
+          <w:tcPr>
+            <w:tcW w:w="2456" w:type="pct"/>
+            <w:tcBorders>
+              <w:left w:val="single" w:color="auto" w:sz="6" w:space="0"/>
+              <w:right w:val="single" w:color="auto" w:sz="4" w:space="0"/>
+            </w:tcBorders>
+            <w:noWrap w:val="0"/>
+            <w:vAlign w:val="center"/>
+          </w:tcPr>
+          <w:p>
+            <w:pPr>
+              <w:jc w:val="left"/>
               <w:rPr>
                 <w:rFonts w:hint="eastAsia" w:eastAsia="华文楷体"/>
                 <w:b w:val="0"/>
                 <w:sz w:val="21"/>
                 <w:lang w:eastAsia="zh-CN"/>
               </w:rPr>
-              <w:t>V1.2-R2</w:t>
-            </w:r>
-          </w:p>
-        </w:tc>
-        <w:tc>
-          <w:tcPr>
-            <w:tcW w:w="2456" w:type="pct"/>
+            </w:pPr>
+          </w:p>
+        </w:tc>
+        <w:tc>
+          <w:tcPr>
+            <w:tcW w:w="703" w:type="pct"/>
             <w:tcBorders>
               <w:left w:val="single" w:color="auto" w:sz="6" w:space="0"/>
               <w:right w:val="single" w:color="auto" w:sz="4" w:space="0"/>
@@ -1829,7 +1614,7 @@
           </w:tcPr>
           <w:p>
             <w:pPr>
-              <w:jc w:val="left"/>
+              <w:jc w:val="center"/>
               <w:rPr>
                 <w:rFonts w:hint="eastAsia" w:eastAsia="华文楷体"/>
                 <w:b w:val="0"/>
@@ -1837,46 +1622,6 @@
                 <w:lang w:eastAsia="zh-CN"/>
               </w:rPr>
             </w:pPr>
-            <w:r>
-              <w:rPr>
-                <w:rFonts w:hint="eastAsia" w:eastAsia="华文楷体"/>
-                <w:b w:val="0"/>
-                <w:sz w:val="21"/>
-                <w:lang w:eastAsia="zh-CN"/>
-              </w:rPr>
-              <w:t>细化状态架构：界位安全测量、受控维护、独立安全监督及故障分级（待签审）</w:t>
-            </w:r>
-          </w:p>
-        </w:tc>
-        <w:tc>
-          <w:tcPr>
-            <w:tcW w:w="703" w:type="pct"/>
-            <w:tcBorders>
-              <w:left w:val="single" w:color="auto" w:sz="6" w:space="0"/>
-              <w:right w:val="single" w:color="auto" w:sz="4" w:space="0"/>
-            </w:tcBorders>
-            <w:noWrap w:val="0"/>
-            <w:vAlign w:val="center"/>
-          </w:tcPr>
-          <w:p>
-            <w:pPr>
-              <w:jc w:val="center"/>
-              <w:rPr>
-                <w:rFonts w:hint="eastAsia" w:eastAsia="华文楷体"/>
-                <w:b w:val="0"/>
-                <w:sz w:val="21"/>
-                <w:lang w:eastAsia="zh-CN"/>
-              </w:rPr>
-            </w:pPr>
-            <w:r>
-              <w:rPr>
-                <w:rFonts w:hint="eastAsia" w:eastAsia="华文楷体"/>
-                <w:b w:val="0"/>
-                <w:sz w:val="21"/>
-                <w:lang w:eastAsia="zh-CN"/>
-              </w:rPr>
-              <w:t>软件设计组</w:t>
-            </w:r>
           </w:p>
         </w:tc>
         <w:tc>
@@ -1925,15 +1670,6 @@
                 <w:lang w:eastAsia="zh-CN"/>
               </w:rPr>
             </w:pPr>
-            <w:r>
-              <w:rPr>
-                <w:rFonts w:hint="eastAsia" w:eastAsia="华文楷体"/>
-                <w:b w:val="0"/>
-                <w:sz w:val="21"/>
-                <w:lang w:eastAsia="zh-CN"/>
-              </w:rPr>
-              <w:t>2026.08.08</w:t>
-            </w:r>
           </w:p>
         </w:tc>
       </w:tr>
@@ -2882,7 +2618,7 @@
         <w:rPr>
           <w:szCs w:val="24"/>
         </w:rPr>
-        <w:instrText xml:space="preserve"> HYPERLINK \l _Toc12917 </w:instrText>
+        <w:instrText xml:space="preserve"> HYPERLINK \l _Toc12185 </w:instrText>
       </w:r>
       <w:r>
         <w:rPr>
@@ -2903,7 +2639,7 @@
         <w:fldChar w:fldCharType="begin"/>
       </w:r>
       <w:r>
-        <w:instrText xml:space="preserve"> PAGEREF _Toc12917 \h </w:instrText>
+        <w:instrText xml:space="preserve"> PAGEREF _Toc12185 \h </w:instrText>
       </w:r>
       <w:r>
         <w:fldChar w:fldCharType="separate"/>
@@ -2940,7 +2676,7 @@
         <w:rPr>
           <w:szCs w:val="24"/>
         </w:rPr>
-        <w:instrText xml:space="preserve"> HYPERLINK \l _Toc15411 </w:instrText>
+        <w:instrText xml:space="preserve"> HYPERLINK \l _Toc20633 </w:instrText>
       </w:r>
       <w:r>
         <w:rPr>
@@ -2961,7 +2697,7 @@
         <w:fldChar w:fldCharType="begin"/>
       </w:r>
       <w:r>
-        <w:instrText xml:space="preserve"> PAGEREF _Toc15411 \h </w:instrText>
+        <w:instrText xml:space="preserve"> PAGEREF _Toc20633 \h </w:instrText>
       </w:r>
       <w:r>
         <w:fldChar w:fldCharType="separate"/>
@@ -2998,7 +2734,7 @@
         <w:rPr>
           <w:szCs w:val="24"/>
         </w:rPr>
-        <w:instrText xml:space="preserve"> HYPERLINK \l _Toc7508 </w:instrText>
+        <w:instrText xml:space="preserve"> HYPERLINK \l _Toc12557 </w:instrText>
       </w:r>
       <w:r>
         <w:rPr>
@@ -3019,7 +2755,7 @@
         <w:fldChar w:fldCharType="begin"/>
       </w:r>
       <w:r>
-        <w:instrText xml:space="preserve"> PAGEREF _Toc7508 \h </w:instrText>
+        <w:instrText xml:space="preserve"> PAGEREF _Toc12557 \h </w:instrText>
       </w:r>
       <w:r>
         <w:fldChar w:fldCharType="separate"/>
@@ -3056,7 +2792,7 @@
         <w:rPr>
           <w:szCs w:val="24"/>
         </w:rPr>
-        <w:instrText xml:space="preserve"> HYPERLINK \l _Toc12950 </w:instrText>
+        <w:instrText xml:space="preserve"> HYPERLINK \l _Toc10122 </w:instrText>
       </w:r>
       <w:r>
         <w:rPr>
@@ -3077,7 +2813,7 @@
         <w:fldChar w:fldCharType="begin"/>
       </w:r>
       <w:r>
-        <w:instrText xml:space="preserve"> PAGEREF _Toc12950 \h </w:instrText>
+        <w:instrText xml:space="preserve"> PAGEREF _Toc10122 \h </w:instrText>
       </w:r>
       <w:r>
         <w:fldChar w:fldCharType="separate"/>
@@ -3112,7 +2848,7 @@
         <w:rPr>
           <w:szCs w:val="24"/>
         </w:rPr>
-        <w:instrText xml:space="preserve"> HYPERLINK \l _Toc28112 </w:instrText>
+        <w:instrText xml:space="preserve"> HYPERLINK \l _Toc5627 </w:instrText>
       </w:r>
       <w:r>
         <w:rPr>
@@ -3133,7 +2869,7 @@
         <w:fldChar w:fldCharType="begin"/>
       </w:r>
       <w:r>
-        <w:instrText xml:space="preserve"> PAGEREF _Toc28112 \h </w:instrText>
+        <w:instrText xml:space="preserve"> PAGEREF _Toc5627 \h </w:instrText>
       </w:r>
       <w:r>
         <w:fldChar w:fldCharType="separate"/>
@@ -3170,7 +2906,7 @@
         <w:rPr>
           <w:szCs w:val="24"/>
         </w:rPr>
-        <w:instrText xml:space="preserve"> HYPERLINK \l _Toc7243 </w:instrText>
+        <w:instrText xml:space="preserve"> HYPERLINK \l _Toc18587 </w:instrText>
       </w:r>
       <w:r>
         <w:rPr>
@@ -3192,7 +2928,7 @@
         <w:fldChar w:fldCharType="begin"/>
       </w:r>
       <w:r>
-        <w:instrText xml:space="preserve"> PAGEREF _Toc7243 \h </w:instrText>
+        <w:instrText xml:space="preserve"> PAGEREF _Toc18587 \h </w:instrText>
       </w:r>
       <w:r>
         <w:fldChar w:fldCharType="separate"/>
@@ -3229,7 +2965,7 @@
         <w:rPr>
           <w:szCs w:val="24"/>
         </w:rPr>
-        <w:instrText xml:space="preserve"> HYPERLINK \l _Toc15570 </w:instrText>
+        <w:instrText xml:space="preserve"> HYPERLINK \l _Toc7119 </w:instrText>
       </w:r>
       <w:r>
         <w:rPr>
@@ -3251,7 +2987,7 @@
         <w:fldChar w:fldCharType="begin"/>
       </w:r>
       <w:r>
-        <w:instrText xml:space="preserve"> PAGEREF _Toc15570 \h </w:instrText>
+        <w:instrText xml:space="preserve"> PAGEREF _Toc7119 \h </w:instrText>
       </w:r>
       <w:r>
         <w:fldChar w:fldCharType="separate"/>
@@ -3288,7 +3024,7 @@
         <w:rPr>
           <w:szCs w:val="24"/>
         </w:rPr>
-        <w:instrText xml:space="preserve"> HYPERLINK \l _Toc12810 </w:instrText>
+        <w:instrText xml:space="preserve"> HYPERLINK \l _Toc29228 </w:instrText>
       </w:r>
       <w:r>
         <w:rPr>
@@ -3310,7 +3046,7 @@
         <w:fldChar w:fldCharType="begin"/>
       </w:r>
       <w:r>
-        <w:instrText xml:space="preserve"> PAGEREF _Toc12810 \h </w:instrText>
+        <w:instrText xml:space="preserve"> PAGEREF _Toc29228 \h </w:instrText>
       </w:r>
       <w:r>
         <w:fldChar w:fldCharType="separate"/>
@@ -3347,7 +3083,7 @@
         <w:rPr>
           <w:szCs w:val="24"/>
         </w:rPr>
-        <w:instrText xml:space="preserve"> HYPERLINK \l _Toc32240 </w:instrText>
+        <w:instrText xml:space="preserve"> HYPERLINK \l _Toc2970 </w:instrText>
       </w:r>
       <w:r>
         <w:rPr>
@@ -3369,7 +3105,7 @@
         <w:fldChar w:fldCharType="begin"/>
       </w:r>
       <w:r>
-        <w:instrText xml:space="preserve"> PAGEREF _Toc32240 \h </w:instrText>
+        <w:instrText xml:space="preserve"> PAGEREF _Toc2970 \h </w:instrText>
       </w:r>
       <w:r>
         <w:fldChar w:fldCharType="separate"/>
@@ -3404,7 +3140,7 @@
         <w:rPr>
           <w:szCs w:val="24"/>
         </w:rPr>
-        <w:instrText xml:space="preserve"> HYPERLINK \l _Toc18371 </w:instrText>
+        <w:instrText xml:space="preserve"> HYPERLINK \l _Toc1132 </w:instrText>
       </w:r>
       <w:r>
         <w:rPr>
@@ -3426,7 +3162,7 @@
         <w:fldChar w:fldCharType="begin"/>
       </w:r>
       <w:r>
-        <w:instrText xml:space="preserve"> PAGEREF _Toc18371 \h </w:instrText>
+        <w:instrText xml:space="preserve"> PAGEREF _Toc1132 \h </w:instrText>
       </w:r>
       <w:r>
         <w:fldChar w:fldCharType="separate"/>
@@ -3463,7 +3199,7 @@
         <w:rPr>
           <w:szCs w:val="24"/>
         </w:rPr>
-        <w:instrText xml:space="preserve"> HYPERLINK \l _Toc4394 </w:instrText>
+        <w:instrText xml:space="preserve"> HYPERLINK \l _Toc14996 </w:instrText>
       </w:r>
       <w:r>
         <w:rPr>
@@ -3485,7 +3221,7 @@
         <w:fldChar w:fldCharType="begin"/>
       </w:r>
       <w:r>
-        <w:instrText xml:space="preserve"> PAGEREF _Toc4394 \h </w:instrText>
+        <w:instrText xml:space="preserve"> PAGEREF _Toc14996 \h </w:instrText>
       </w:r>
       <w:r>
         <w:fldChar w:fldCharType="separate"/>
@@ -3522,7 +3258,7 @@
         <w:rPr>
           <w:szCs w:val="24"/>
         </w:rPr>
-        <w:instrText xml:space="preserve"> HYPERLINK \l _Toc29186 </w:instrText>
+        <w:instrText xml:space="preserve"> HYPERLINK \l _Toc9841 </w:instrText>
       </w:r>
       <w:r>
         <w:rPr>
@@ -3544,7 +3280,7 @@
         <w:fldChar w:fldCharType="begin"/>
       </w:r>
       <w:r>
-        <w:instrText xml:space="preserve"> PAGEREF _Toc29186 \h </w:instrText>
+        <w:instrText xml:space="preserve"> PAGEREF _Toc9841 \h </w:instrText>
       </w:r>
       <w:r>
         <w:fldChar w:fldCharType="separate"/>
@@ -3581,7 +3317,7 @@
         <w:rPr>
           <w:szCs w:val="24"/>
         </w:rPr>
-        <w:instrText xml:space="preserve"> HYPERLINK \l _Toc17218 </w:instrText>
+        <w:instrText xml:space="preserve"> HYPERLINK \l _Toc10058 </w:instrText>
       </w:r>
       <w:r>
         <w:rPr>
@@ -3603,7 +3339,7 @@
         <w:fldChar w:fldCharType="begin"/>
       </w:r>
       <w:r>
-        <w:instrText xml:space="preserve"> PAGEREF _Toc17218 \h </w:instrText>
+        <w:instrText xml:space="preserve"> PAGEREF _Toc10058 \h </w:instrText>
       </w:r>
       <w:r>
         <w:fldChar w:fldCharType="separate"/>
@@ -3640,7 +3376,7 @@
         <w:rPr>
           <w:szCs w:val="24"/>
         </w:rPr>
-        <w:instrText xml:space="preserve"> HYPERLINK \l _Toc13151 </w:instrText>
+        <w:instrText xml:space="preserve"> HYPERLINK \l _Toc18717 </w:instrText>
       </w:r>
       <w:r>
         <w:rPr>
@@ -3662,7 +3398,7 @@
         <w:fldChar w:fldCharType="begin"/>
       </w:r>
       <w:r>
-        <w:instrText xml:space="preserve"> PAGEREF _Toc13151 \h </w:instrText>
+        <w:instrText xml:space="preserve"> PAGEREF _Toc18717 \h </w:instrText>
       </w:r>
       <w:r>
         <w:fldChar w:fldCharType="separate"/>
@@ -3697,7 +3433,7 @@
         <w:rPr>
           <w:szCs w:val="24"/>
         </w:rPr>
-        <w:instrText xml:space="preserve"> HYPERLINK \l _Toc14814 </w:instrText>
+        <w:instrText xml:space="preserve"> HYPERLINK \l _Toc24955 </w:instrText>
       </w:r>
       <w:r>
         <w:rPr>
@@ -3725,7 +3461,7 @@
         <w:fldChar w:fldCharType="begin"/>
       </w:r>
       <w:r>
-        <w:instrText xml:space="preserve"> PAGEREF _Toc14814 \h </w:instrText>
+        <w:instrText xml:space="preserve"> PAGEREF _Toc24955 \h </w:instrText>
       </w:r>
       <w:r>
         <w:fldChar w:fldCharType="separate"/>
@@ -3762,7 +3498,7 @@
         <w:rPr>
           <w:szCs w:val="24"/>
         </w:rPr>
-        <w:instrText xml:space="preserve"> HYPERLINK \l _Toc23181 </w:instrText>
+        <w:instrText xml:space="preserve"> HYPERLINK \l _Toc7694 </w:instrText>
       </w:r>
       <w:r>
         <w:rPr>
@@ -3784,7 +3520,7 @@
         <w:fldChar w:fldCharType="begin"/>
       </w:r>
       <w:r>
-        <w:instrText xml:space="preserve"> PAGEREF _Toc23181 \h </w:instrText>
+        <w:instrText xml:space="preserve"> PAGEREF _Toc7694 \h </w:instrText>
       </w:r>
       <w:r>
         <w:fldChar w:fldCharType="separate"/>
@@ -3821,7 +3557,7 @@
         <w:rPr>
           <w:szCs w:val="24"/>
         </w:rPr>
-        <w:instrText xml:space="preserve"> HYPERLINK \l _Toc29162 </w:instrText>
+        <w:instrText xml:space="preserve"> HYPERLINK \l _Toc6589 </w:instrText>
       </w:r>
       <w:r>
         <w:rPr>
@@ -3843,7 +3579,7 @@
         <w:fldChar w:fldCharType="begin"/>
       </w:r>
       <w:r>
-        <w:instrText xml:space="preserve"> PAGEREF _Toc29162 \h </w:instrText>
+        <w:instrText xml:space="preserve"> PAGEREF _Toc6589 \h </w:instrText>
       </w:r>
       <w:r>
         <w:fldChar w:fldCharType="separate"/>
@@ -3880,7 +3616,7 @@
         <w:rPr>
           <w:szCs w:val="24"/>
         </w:rPr>
-        <w:instrText xml:space="preserve"> HYPERLINK \l _Toc15813 </w:instrText>
+        <w:instrText xml:space="preserve"> HYPERLINK \l _Toc2860 </w:instrText>
       </w:r>
       <w:r>
         <w:rPr>
@@ -3908,7 +3644,7 @@
         <w:fldChar w:fldCharType="begin"/>
       </w:r>
       <w:r>
-        <w:instrText xml:space="preserve"> PAGEREF _Toc15813 \h </w:instrText>
+        <w:instrText xml:space="preserve"> PAGEREF _Toc2860 \h </w:instrText>
       </w:r>
       <w:r>
         <w:fldChar w:fldCharType="separate"/>
@@ -3945,7 +3681,7 @@
         <w:rPr>
           <w:szCs w:val="24"/>
         </w:rPr>
-        <w:instrText xml:space="preserve"> HYPERLINK \l _Toc27085 </w:instrText>
+        <w:instrText xml:space="preserve"> HYPERLINK \l _Toc24408 </w:instrText>
       </w:r>
       <w:r>
         <w:rPr>
@@ -3973,7 +3709,7 @@
         <w:fldChar w:fldCharType="begin"/>
       </w:r>
       <w:r>
-        <w:instrText xml:space="preserve"> PAGEREF _Toc27085 \h </w:instrText>
+        <w:instrText xml:space="preserve"> PAGEREF _Toc24408 \h </w:instrText>
       </w:r>
       <w:r>
         <w:fldChar w:fldCharType="separate"/>
@@ -4010,7 +3746,7 @@
         <w:rPr>
           <w:szCs w:val="24"/>
         </w:rPr>
-        <w:instrText xml:space="preserve"> HYPERLINK \l _Toc9885 </w:instrText>
+        <w:instrText xml:space="preserve"> HYPERLINK \l _Toc10136 </w:instrText>
       </w:r>
       <w:r>
         <w:rPr>
@@ -4038,7 +3774,7 @@
         <w:fldChar w:fldCharType="begin"/>
       </w:r>
       <w:r>
-        <w:instrText xml:space="preserve"> PAGEREF _Toc9885 \h </w:instrText>
+        <w:instrText xml:space="preserve"> PAGEREF _Toc10136 \h </w:instrText>
       </w:r>
       <w:r>
         <w:fldChar w:fldCharType="separate"/>
@@ -4075,7 +3811,7 @@
         <w:rPr>
           <w:szCs w:val="24"/>
         </w:rPr>
-        <w:instrText xml:space="preserve"> HYPERLINK \l _Toc7782 </w:instrText>
+        <w:instrText xml:space="preserve"> HYPERLINK \l _Toc1537 </w:instrText>
       </w:r>
       <w:r>
         <w:rPr>
@@ -4103,7 +3839,7 @@
         <w:fldChar w:fldCharType="begin"/>
       </w:r>
       <w:r>
-        <w:instrText xml:space="preserve"> PAGEREF _Toc7782 \h </w:instrText>
+        <w:instrText xml:space="preserve"> PAGEREF _Toc1537 \h </w:instrText>
       </w:r>
       <w:r>
         <w:fldChar w:fldCharType="separate"/>
@@ -4140,7 +3876,7 @@
         <w:rPr>
           <w:szCs w:val="24"/>
         </w:rPr>
-        <w:instrText xml:space="preserve"> HYPERLINK \l _Toc6543 </w:instrText>
+        <w:instrText xml:space="preserve"> HYPERLINK \l _Toc29947 </w:instrText>
       </w:r>
       <w:r>
         <w:rPr>
@@ -4168,7 +3904,7 @@
         <w:fldChar w:fldCharType="begin"/>
       </w:r>
       <w:r>
-        <w:instrText xml:space="preserve"> PAGEREF _Toc6543 \h </w:instrText>
+        <w:instrText xml:space="preserve"> PAGEREF _Toc29947 \h </w:instrText>
       </w:r>
       <w:r>
         <w:fldChar w:fldCharType="separate"/>
@@ -4205,7 +3941,7 @@
         <w:rPr>
           <w:szCs w:val="24"/>
         </w:rPr>
-        <w:instrText xml:space="preserve"> HYPERLINK \l _Toc30969 </w:instrText>
+        <w:instrText xml:space="preserve"> HYPERLINK \l _Toc14935 </w:instrText>
       </w:r>
       <w:r>
         <w:rPr>
@@ -4233,7 +3969,7 @@
         <w:fldChar w:fldCharType="begin"/>
       </w:r>
       <w:r>
-        <w:instrText xml:space="preserve"> PAGEREF _Toc30969 \h </w:instrText>
+        <w:instrText xml:space="preserve"> PAGEREF _Toc14935 \h </w:instrText>
       </w:r>
       <w:r>
         <w:fldChar w:fldCharType="separate"/>
@@ -4270,7 +4006,7 @@
         <w:rPr>
           <w:szCs w:val="24"/>
         </w:rPr>
-        <w:instrText xml:space="preserve"> HYPERLINK \l _Toc16057 </w:instrText>
+        <w:instrText xml:space="preserve"> HYPERLINK \l _Toc24728 </w:instrText>
       </w:r>
       <w:r>
         <w:rPr>
@@ -4298,7 +4034,7 @@
         <w:fldChar w:fldCharType="begin"/>
       </w:r>
       <w:r>
-        <w:instrText xml:space="preserve"> PAGEREF _Toc16057 \h </w:instrText>
+        <w:instrText xml:space="preserve"> PAGEREF _Toc24728 \h </w:instrText>
       </w:r>
       <w:r>
         <w:fldChar w:fldCharType="separate"/>
@@ -4335,7 +4071,7 @@
         <w:rPr>
           <w:szCs w:val="24"/>
         </w:rPr>
-        <w:instrText xml:space="preserve"> HYPERLINK \l _Toc32110 </w:instrText>
+        <w:instrText xml:space="preserve"> HYPERLINK \l _Toc17226 </w:instrText>
       </w:r>
       <w:r>
         <w:rPr>
@@ -4363,7 +4099,7 @@
         <w:fldChar w:fldCharType="begin"/>
       </w:r>
       <w:r>
-        <w:instrText xml:space="preserve"> PAGEREF _Toc32110 \h </w:instrText>
+        <w:instrText xml:space="preserve"> PAGEREF _Toc17226 \h </w:instrText>
       </w:r>
       <w:r>
         <w:fldChar w:fldCharType="separate"/>
@@ -4400,7 +4136,7 @@
         <w:rPr>
           <w:szCs w:val="24"/>
         </w:rPr>
-        <w:instrText xml:space="preserve"> HYPERLINK \l _Toc7583 </w:instrText>
+        <w:instrText xml:space="preserve"> HYPERLINK \l _Toc12673 </w:instrText>
       </w:r>
       <w:r>
         <w:rPr>
@@ -4428,7 +4164,7 @@
         <w:fldChar w:fldCharType="begin"/>
       </w:r>
       <w:r>
-        <w:instrText xml:space="preserve"> PAGEREF _Toc7583 \h </w:instrText>
+        <w:instrText xml:space="preserve"> PAGEREF _Toc12673 \h </w:instrText>
       </w:r>
       <w:r>
         <w:fldChar w:fldCharType="separate"/>
@@ -4465,7 +4201,7 @@
         <w:rPr>
           <w:szCs w:val="24"/>
         </w:rPr>
-        <w:instrText xml:space="preserve"> HYPERLINK \l _Toc17293 </w:instrText>
+        <w:instrText xml:space="preserve"> HYPERLINK \l _Toc8162 </w:instrText>
       </w:r>
       <w:r>
         <w:rPr>
@@ -4487,7 +4223,7 @@
         <w:fldChar w:fldCharType="begin"/>
       </w:r>
       <w:r>
-        <w:instrText xml:space="preserve"> PAGEREF _Toc17293 \h </w:instrText>
+        <w:instrText xml:space="preserve"> PAGEREF _Toc8162 \h </w:instrText>
       </w:r>
       <w:r>
         <w:fldChar w:fldCharType="separate"/>
@@ -4524,7 +4260,7 @@
         <w:rPr>
           <w:szCs w:val="24"/>
         </w:rPr>
-        <w:instrText xml:space="preserve"> HYPERLINK \l _Toc11251 </w:instrText>
+        <w:instrText xml:space="preserve"> HYPERLINK \l _Toc30177 </w:instrText>
       </w:r>
       <w:r>
         <w:rPr>
@@ -4546,7 +4282,7 @@
         <w:fldChar w:fldCharType="begin"/>
       </w:r>
       <w:r>
-        <w:instrText xml:space="preserve"> PAGEREF _Toc11251 \h </w:instrText>
+        <w:instrText xml:space="preserve"> PAGEREF _Toc30177 \h </w:instrText>
       </w:r>
       <w:r>
         <w:fldChar w:fldCharType="separate"/>
@@ -4583,7 +4319,7 @@
         <w:rPr>
           <w:szCs w:val="24"/>
         </w:rPr>
-        <w:instrText xml:space="preserve"> HYPERLINK \l _Toc23327 </w:instrText>
+        <w:instrText xml:space="preserve"> HYPERLINK \l _Toc27634 </w:instrText>
       </w:r>
       <w:r>
         <w:rPr>
@@ -4611,7 +4347,7 @@
         <w:fldChar w:fldCharType="begin"/>
       </w:r>
       <w:r>
-        <w:instrText xml:space="preserve"> PAGEREF _Toc23327 \h </w:instrText>
+        <w:instrText xml:space="preserve"> PAGEREF _Toc27634 \h </w:instrText>
       </w:r>
       <w:r>
         <w:fldChar w:fldCharType="separate"/>
@@ -4648,7 +4384,7 @@
         <w:rPr>
           <w:szCs w:val="24"/>
         </w:rPr>
-        <w:instrText xml:space="preserve"> HYPERLINK \l _Toc28594 </w:instrText>
+        <w:instrText xml:space="preserve"> HYPERLINK \l _Toc20288 </w:instrText>
       </w:r>
       <w:r>
         <w:rPr>
@@ -4676,7 +4412,7 @@
         <w:fldChar w:fldCharType="begin"/>
       </w:r>
       <w:r>
-        <w:instrText xml:space="preserve"> PAGEREF _Toc28594 \h </w:instrText>
+        <w:instrText xml:space="preserve"> PAGEREF _Toc20288 \h </w:instrText>
       </w:r>
       <w:r>
         <w:fldChar w:fldCharType="separate"/>
@@ -4713,7 +4449,7 @@
         <w:rPr>
           <w:szCs w:val="24"/>
         </w:rPr>
-        <w:instrText xml:space="preserve"> HYPERLINK \l _Toc31263 </w:instrText>
+        <w:instrText xml:space="preserve"> HYPERLINK \l _Toc3012 </w:instrText>
       </w:r>
       <w:r>
         <w:rPr>
@@ -4741,7 +4477,7 @@
         <w:fldChar w:fldCharType="begin"/>
       </w:r>
       <w:r>
-        <w:instrText xml:space="preserve"> PAGEREF _Toc31263 \h </w:instrText>
+        <w:instrText xml:space="preserve"> PAGEREF _Toc3012 \h </w:instrText>
       </w:r>
       <w:r>
         <w:fldChar w:fldCharType="separate"/>
@@ -4776,7 +4512,7 @@
         <w:rPr>
           <w:szCs w:val="24"/>
         </w:rPr>
-        <w:instrText xml:space="preserve"> HYPERLINK \l _Toc14106 </w:instrText>
+        <w:instrText xml:space="preserve"> HYPERLINK \l _Toc15905 </w:instrText>
       </w:r>
       <w:r>
         <w:rPr>
@@ -4804,7 +4540,7 @@
         <w:fldChar w:fldCharType="begin"/>
       </w:r>
       <w:r>
-        <w:instrText xml:space="preserve"> PAGEREF _Toc14106 \h </w:instrText>
+        <w:instrText xml:space="preserve"> PAGEREF _Toc15905 \h </w:instrText>
       </w:r>
       <w:r>
         <w:fldChar w:fldCharType="separate"/>
@@ -4877,7 +4613,7 @@
           <w:rFonts w:hint="eastAsia"/>
         </w:rPr>
       </w:pPr>
-      <w:bookmarkStart w:id="0" w:name="_Toc12917"/>
+      <w:bookmarkStart w:id="0" w:name="_Toc12185"/>
       <w:r>
         <w:rPr>
           <w:rFonts w:hint="eastAsia"/>
@@ -4893,7 +4629,7 @@
           <w:rFonts w:hint="eastAsia"/>
         </w:rPr>
       </w:pPr>
-      <w:bookmarkStart w:id="1" w:name="_Toc15411"/>
+      <w:bookmarkStart w:id="1" w:name="_Toc20633"/>
       <w:r>
         <w:rPr>
           <w:rFonts w:hint="eastAsia"/>
@@ -4939,7 +4675,21 @@
           <w:rFonts w:hint="eastAsia"/>
           <w:lang w:eastAsia="zh-CN"/>
         </w:rPr>
-        <w:t>DSM系列储罐在线自动计量仪</w:t>
+        <w:t>DSM</w:t>
+      </w:r>
+      <w:r>
+        <w:rPr>
+          <w:rFonts w:hint="eastAsia"/>
+          <w:lang w:val="en-US" w:eastAsia="zh-CN"/>
+        </w:rPr>
+        <w:t>-Ⅱ</w:t>
+      </w:r>
+      <w:r>
+        <w:rPr>
+          <w:rFonts w:hint="eastAsia"/>
+          <w:lang w:eastAsia="zh-CN"/>
+        </w:rPr>
+        <w:t>系列储罐在线自动计量仪</w:t>
       </w:r>
       <w:r>
         <w:rPr>
@@ -4974,7 +4724,7 @@
           <w:rFonts w:hint="eastAsia"/>
         </w:rPr>
       </w:pPr>
-      <w:bookmarkStart w:id="2" w:name="_Toc7508"/>
+      <w:bookmarkStart w:id="2" w:name="_Toc12557"/>
       <w:r>
         <w:rPr>
           <w:rFonts w:hint="eastAsia"/>
@@ -5466,7 +5216,7 @@
           <w:rFonts w:hint="eastAsia"/>
         </w:rPr>
       </w:pPr>
-      <w:bookmarkStart w:id="3" w:name="_Toc12950"/>
+      <w:bookmarkStart w:id="3" w:name="_Toc10122"/>
       <w:r>
         <w:rPr>
           <w:rFonts w:hint="eastAsia"/>
@@ -5506,7 +5256,7 @@
           <w:rFonts w:hint="eastAsia"/>
         </w:rPr>
       </w:pPr>
-      <w:bookmarkStart w:id="4" w:name="_Toc28112"/>
+      <w:bookmarkStart w:id="4" w:name="_Toc5627"/>
       <w:r>
         <w:rPr>
           <w:rFonts w:hint="eastAsia"/>
@@ -5524,7 +5274,7 @@
           <w:lang w:val="en-US" w:eastAsia="zh-CN"/>
         </w:rPr>
       </w:pPr>
-      <w:bookmarkStart w:id="5" w:name="_Toc7243"/>
+      <w:bookmarkStart w:id="5" w:name="_Toc18587"/>
       <w:r>
         <w:rPr>
           <w:rFonts w:hint="eastAsia"/>
@@ -5801,12 +5551,12 @@
                   <v:path/>
                   <v:fill on="f" focussize="0,0"/>
                   <v:stroke on="f"/>
-                  <v:imagedata r:id="rId11" o:title=""/>
+                  <v:imagedata r:id="rId9" o:title=""/>
                   <o:lock v:ext="edit" aspectratio="t"/>
                   <w10:wrap type="none"/>
                   <w10:anchorlock/>
                 </v:shape>
-                <o:OLEObject Type="Embed" ProgID="Visio.Drawing.15" ShapeID="_x0000_i1025" DrawAspect="Content" ObjectID="_1468075725" r:id="rId10">
+                <o:OLEObject Type="Embed" ProgID="Visio.Drawing.15" ShapeID="_x0000_i1025" DrawAspect="Content" ObjectID="_1468075725" r:id="rId8">
                   <o:LockedField>false</o:LockedField>
                 </o:OLEObject>
               </w:object>
@@ -6089,7 +5839,7 @@
           <w:lang w:val="en-US" w:eastAsia="zh-CN"/>
         </w:rPr>
       </w:pPr>
-      <w:bookmarkStart w:id="6" w:name="_Toc15570"/>
+      <w:bookmarkStart w:id="6" w:name="_Toc7119"/>
       <w:r>
         <w:rPr>
           <w:rFonts w:hint="eastAsia"/>
@@ -6515,16 +6265,16 @@
             </w:pPr>
             <w:r>
               <w:object>
-                <v:shape id="_x0000_i1026" o:spt="75" type="#_x0000_t75" style="height:650.05pt;width:353pt;" o:ole="t" filled="f" o:preferrelative="t" stroked="f" coordsize="21600,21600">
+                <v:shape id="_x0000_i1031" o:spt="75" type="#_x0000_t75" style="height:636.65pt;width:352.75pt;" o:ole="t" filled="f" o:preferrelative="t" stroked="f" coordsize="21600,21600">
                   <v:path/>
                   <v:fill on="f" focussize="0,0"/>
                   <v:stroke on="f"/>
-                  <v:imagedata r:id="rId13" o:title=""/>
+                  <v:imagedata r:id="rId11" o:title=""/>
                   <o:lock v:ext="edit" aspectratio="f"/>
                   <w10:wrap type="none"/>
                   <w10:anchorlock/>
                 </v:shape>
-                <o:OLEObject Type="Embed" ProgID="Visio.Drawing.15" ShapeID="_x0000_i1026" DrawAspect="Content" ObjectID="_1468075726" r:id="rId12">
+                <o:OLEObject Type="Embed" ProgID="Visio.Drawing.15" ShapeID="_x0000_i1031" DrawAspect="Content" ObjectID="_1468075726" r:id="rId10">
                   <o:LockedField>false</o:LockedField>
                 </o:OLEObject>
               </w:object>
@@ -6633,7 +6383,7 @@
                 <w:szCs w:val="21"/>
                 <w:lang w:val="en-US" w:eastAsia="zh-CN"/>
               </w:rPr>
-              <w:t>安全功能部分：电源(PWOER)、电压采集(V ACQ)、处理器（CPU2）、铁电（FRAM1）、模拟输出（AO）、数字输出（DO1、DO2）、编码器（ENCODE）、电机和驱动(DRIVER)、电机电流检测（CUR ACQ）、液位/压力的采集（AI）、液位测量（DR/ACQ1、2）、水位测量（WATER）；</w:t>
+              <w:t>安全功能部分：电源(PWOER)、电压采集(V ACQ)、处理器（CPU2）、铁电（FRAM1）、模拟输出（AO）、数字输出（DO1、DO2）、编码器（ENCODE）、电机和驱动(DRIVER)、电机电流检测（CUR ACQ）、液位测量（DR/ACQ1、2）；</w:t>
             </w:r>
           </w:p>
           <w:p>
@@ -6963,6 +6713,7 @@
                   <w:insideH w:val="none" w:color="auto" w:sz="0" w:space="0"/>
                   <w:insideV w:val="none" w:color="auto" w:sz="0" w:space="0"/>
                 </w:tblBorders>
+                <w:shd w:val="clear" w:color="auto" w:fill="auto"/>
                 <w:tblCellMar>
                   <w:top w:w="0" w:type="dxa"/>
                   <w:left w:w="108" w:type="dxa"/>
@@ -7042,6 +6793,7 @@
                   <w:insideH w:val="none" w:color="auto" w:sz="0" w:space="0"/>
                   <w:insideV w:val="none" w:color="auto" w:sz="0" w:space="0"/>
                 </w:tblBorders>
+                <w:shd w:val="clear" w:color="auto" w:fill="auto"/>
                 <w:tblCellMar>
                   <w:top w:w="0" w:type="dxa"/>
                   <w:left w:w="108" w:type="dxa"/>
@@ -7368,6 +7120,7 @@
                   <w:insideH w:val="none" w:color="auto" w:sz="0" w:space="0"/>
                   <w:insideV w:val="none" w:color="auto" w:sz="0" w:space="0"/>
                 </w:tblBorders>
+                <w:shd w:val="clear" w:color="auto" w:fill="auto"/>
                 <w:tblCellMar>
                   <w:top w:w="0" w:type="dxa"/>
                   <w:left w:w="108" w:type="dxa"/>
@@ -7573,6 +7326,7 @@
                   <w:insideH w:val="none" w:color="auto" w:sz="0" w:space="0"/>
                   <w:insideV w:val="none" w:color="auto" w:sz="0" w:space="0"/>
                 </w:tblBorders>
+                <w:shd w:val="clear" w:color="auto" w:fill="auto"/>
                 <w:tblCellMar>
                   <w:top w:w="0" w:type="dxa"/>
                   <w:left w:w="108" w:type="dxa"/>
@@ -8784,6 +8538,7 @@
                   <w:insideH w:val="none" w:color="auto" w:sz="0" w:space="0"/>
                   <w:insideV w:val="none" w:color="auto" w:sz="0" w:space="0"/>
                 </w:tblBorders>
+                <w:shd w:val="clear" w:color="auto" w:fill="auto"/>
                 <w:tblCellMar>
                   <w:top w:w="0" w:type="dxa"/>
                   <w:left w:w="108" w:type="dxa"/>
@@ -8944,6 +8699,7 @@
                   <w:insideH w:val="none" w:color="auto" w:sz="0" w:space="0"/>
                   <w:insideV w:val="none" w:color="auto" w:sz="0" w:space="0"/>
                 </w:tblBorders>
+                <w:shd w:val="clear" w:color="auto" w:fill="auto"/>
                 <w:tblCellMar>
                   <w:top w:w="0" w:type="dxa"/>
                   <w:left w:w="108" w:type="dxa"/>
@@ -9187,6 +8943,7 @@
                   <w:insideH w:val="none" w:color="auto" w:sz="0" w:space="0"/>
                   <w:insideV w:val="none" w:color="auto" w:sz="0" w:space="0"/>
                 </w:tblBorders>
+                <w:shd w:val="clear" w:color="auto" w:fill="auto"/>
                 <w:tblCellMar>
                   <w:top w:w="0" w:type="dxa"/>
                   <w:left w:w="108" w:type="dxa"/>
@@ -9452,6 +9209,7 @@
                   <w:insideH w:val="none" w:color="auto" w:sz="0" w:space="0"/>
                   <w:insideV w:val="none" w:color="auto" w:sz="0" w:space="0"/>
                 </w:tblBorders>
+                <w:shd w:val="clear" w:color="auto" w:fill="auto"/>
                 <w:tblCellMar>
                   <w:top w:w="0" w:type="dxa"/>
                   <w:left w:w="108" w:type="dxa"/>
@@ -9876,6 +9634,7 @@
                   <w:insideH w:val="none" w:color="auto" w:sz="0" w:space="0"/>
                   <w:insideV w:val="none" w:color="auto" w:sz="0" w:space="0"/>
                 </w:tblBorders>
+                <w:shd w:val="clear" w:color="auto" w:fill="auto"/>
                 <w:tblCellMar>
                   <w:top w:w="0" w:type="dxa"/>
                   <w:left w:w="108" w:type="dxa"/>
@@ -10241,6 +10000,7 @@
                   <w:insideH w:val="none" w:color="auto" w:sz="0" w:space="0"/>
                   <w:insideV w:val="none" w:color="auto" w:sz="0" w:space="0"/>
                 </w:tblBorders>
+                <w:shd w:val="clear" w:color="auto" w:fill="auto"/>
                 <w:tblCellMar>
                   <w:top w:w="0" w:type="dxa"/>
                   <w:left w:w="108" w:type="dxa"/>
@@ -10818,7 +10578,7 @@
           <w:lang w:val="en-US" w:eastAsia="zh-CN"/>
         </w:rPr>
       </w:pPr>
-      <w:bookmarkStart w:id="7" w:name="_Toc12810"/>
+      <w:bookmarkStart w:id="7" w:name="_Toc29228"/>
       <w:r>
         <w:rPr>
           <w:rFonts w:hint="eastAsia"/>
@@ -11187,12 +10947,12 @@
                   <v:path/>
                   <v:fill on="f" focussize="0,0"/>
                   <v:stroke on="f"/>
-                  <v:imagedata r:id="rId15" o:title=""/>
+                  <v:imagedata r:id="rId13" o:title=""/>
                   <o:lock v:ext="edit" aspectratio="f"/>
                   <w10:wrap type="none"/>
                   <w10:anchorlock/>
                 </v:shape>
-                <o:OLEObject Type="Embed" ProgID="Visio.Drawing.15" ShapeID="_x0000_i1027" DrawAspect="Content" ObjectID="_1468075727" r:id="rId14">
+                <o:OLEObject Type="Embed" ProgID="Visio.Drawing.15" ShapeID="_x0000_i1027" DrawAspect="Content" ObjectID="_1468075727" r:id="rId12">
                   <o:LockedField>false</o:LockedField>
                 </o:OLEObject>
               </w:object>
@@ -12067,7 +11827,7 @@
           <w:lang w:val="en-US" w:eastAsia="zh-CN"/>
         </w:rPr>
       </w:pPr>
-      <w:bookmarkStart w:id="8" w:name="_Toc32240"/>
+      <w:bookmarkStart w:id="8" w:name="_Toc2970"/>
       <w:r>
         <w:rPr>
           <w:rFonts w:hint="eastAsia"/>
@@ -12308,16 +12068,16 @@
                 <w:rFonts w:hint="eastAsia" w:ascii="华文楷体" w:hAnsi="华文楷体" w:eastAsia="华文楷体" w:cs="华文楷体"/>
               </w:rPr>
               <w:object>
-                <v:shape id="_x0000_i1028" o:spt="75" type="#_x0000_t75" style="height:104.95pt;width:323.45pt;" o:ole="t" filled="f" o:preferrelative="t" stroked="f" coordsize="21600,21600">
+                <v:shape id="_x0000_i1032" o:spt="75" type="#_x0000_t75" style="height:105.15pt;width:323.55pt;" o:ole="t" filled="f" o:preferrelative="t" stroked="f" coordsize="21600,21600">
                   <v:path/>
                   <v:fill on="f" focussize="0,0"/>
                   <v:stroke on="f"/>
-                  <v:imagedata r:id="rId17" o:title=""/>
+                  <v:imagedata r:id="rId15" o:title=""/>
                   <o:lock v:ext="edit" aspectratio="f"/>
                   <w10:wrap type="none"/>
                   <w10:anchorlock/>
                 </v:shape>
-                <o:OLEObject Type="Embed" ProgID="Visio.Drawing.15" ShapeID="_x0000_i1028" DrawAspect="Content" ObjectID="_1468075728" r:id="rId16">
+                <o:OLEObject Type="Embed" ProgID="Visio.Drawing.15" ShapeID="_x0000_i1032" DrawAspect="Content" ObjectID="_1468075728" r:id="rId14">
                   <o:LockedField>false</o:LockedField>
                 </o:OLEObject>
               </w:object>
@@ -12513,7 +12273,7 @@
           <w:lang w:val="de-DE"/>
         </w:rPr>
       </w:pPr>
-      <w:bookmarkStart w:id="9" w:name="_Toc18371"/>
+      <w:bookmarkStart w:id="9" w:name="_Toc1132"/>
       <w:r>
         <w:rPr>
           <w:rFonts w:hint="eastAsia"/>
@@ -12531,7 +12291,7 @@
           <w:lang w:val="de-DE"/>
         </w:rPr>
       </w:pPr>
-      <w:bookmarkStart w:id="10" w:name="_Toc4394"/>
+      <w:bookmarkStart w:id="10" w:name="_Toc14996"/>
       <w:r>
         <w:rPr>
           <w:rFonts w:hint="eastAsia"/>
@@ -12715,12 +12475,12 @@
                   <v:path/>
                   <v:fill on="f" focussize="0,0"/>
                   <v:stroke on="f"/>
-                  <v:imagedata r:id="rId19" cropleft="3052f" croptop="5508f" cropright="4504f" cropbottom="4678f" o:title=""/>
+                  <v:imagedata r:id="rId17" cropleft="3052f" croptop="5508f" cropright="4504f" cropbottom="4678f" o:title=""/>
                   <o:lock v:ext="edit" aspectratio="f"/>
                   <w10:wrap type="none"/>
                   <w10:anchorlock/>
                 </v:shape>
-                <o:OLEObject Type="Embed" ProgID="Visio.Drawing.15" ShapeID="_x0000_i1029" DrawAspect="Content" ObjectID="_1468075729" r:id="rId18">
+                <o:OLEObject Type="Embed" ProgID="Visio.Drawing.15" ShapeID="_x0000_i1029" DrawAspect="Content" ObjectID="_1468075729" r:id="rId16">
                   <o:LockedField>false</o:LockedField>
                 </o:OLEObject>
               </w:object>
@@ -12917,7 +12677,7 @@
           <w:lang w:val="en-US" w:eastAsia="zh-CN"/>
         </w:rPr>
       </w:pPr>
-      <w:bookmarkStart w:id="13" w:name="_Toc29186"/>
+      <w:bookmarkStart w:id="13" w:name="_Toc9841"/>
       <w:r>
         <w:rPr>
           <w:rFonts w:hint="eastAsia"/>
@@ -13361,7 +13121,7 @@
           <w:lang w:val="de-DE"/>
         </w:rPr>
       </w:pPr>
-      <w:bookmarkStart w:id="14" w:name="_Toc17218"/>
+      <w:bookmarkStart w:id="14" w:name="_Toc10058"/>
       <w:r>
         <w:rPr>
           <w:rFonts w:hint="eastAsia"/>
@@ -13802,7 +13562,7 @@
           <w:lang w:val="de-DE"/>
         </w:rPr>
       </w:pPr>
-      <w:bookmarkStart w:id="15" w:name="_Toc13151"/>
+      <w:bookmarkStart w:id="15" w:name="_Toc18717"/>
       <w:r>
         <w:rPr>
           <w:rFonts w:hint="eastAsia"/>
@@ -14989,7 +14749,7 @@
         </w:rPr>
         <w:t xml:space="preserve"> </w:t>
       </w:r>
-      <w:bookmarkStart w:id="16" w:name="_Toc14814"/>
+      <w:bookmarkStart w:id="16" w:name="_Toc24955"/>
       <w:r>
         <w:rPr>
           <w:rFonts w:hint="eastAsia"/>
@@ -15014,7 +14774,7 @@
           <w:lang w:val="en-US" w:eastAsia="zh-CN"/>
         </w:rPr>
       </w:pPr>
-      <w:bookmarkStart w:id="17" w:name="_Toc23181"/>
+      <w:bookmarkStart w:id="17" w:name="_Toc7694"/>
       <w:r>
         <w:rPr>
           <w:rFonts w:hint="eastAsia"/>
@@ -15515,7 +15275,7 @@
           <w:lang w:val="en-US" w:eastAsia="zh-CN"/>
         </w:rPr>
       </w:pPr>
-      <w:bookmarkStart w:id="18" w:name="_Toc29162"/>
+      <w:bookmarkStart w:id="18" w:name="_Toc6589"/>
       <w:r>
         <w:rPr>
           <w:rFonts w:hint="eastAsia"/>
@@ -16020,7 +15780,7 @@
           <w:color w:val="auto"/>
         </w:rPr>
       </w:pPr>
-      <w:bookmarkStart w:id="19" w:name="_Toc15813"/>
+      <w:bookmarkStart w:id="19" w:name="_Toc2860"/>
       <w:r>
         <w:rPr>
           <w:rFonts w:hint="eastAsia"/>
@@ -16467,7 +16227,7 @@
           <w:color w:val="auto"/>
         </w:rPr>
       </w:pPr>
-      <w:bookmarkStart w:id="20" w:name="_Toc27085"/>
+      <w:bookmarkStart w:id="20" w:name="_Toc24408"/>
       <w:r>
         <w:rPr>
           <w:rFonts w:hint="eastAsia"/>
@@ -16923,7 +16683,7 @@
           <w:color w:val="auto"/>
         </w:rPr>
       </w:pPr>
-      <w:bookmarkStart w:id="21" w:name="_Toc9885"/>
+      <w:bookmarkStart w:id="21" w:name="_Toc10136"/>
       <w:r>
         <w:rPr>
           <w:rFonts w:hint="eastAsia"/>
@@ -17379,7 +17139,7 @@
           <w:color w:val="auto"/>
         </w:rPr>
       </w:pPr>
-      <w:bookmarkStart w:id="22" w:name="_Toc7782"/>
+      <w:bookmarkStart w:id="22" w:name="_Toc1537"/>
       <w:r>
         <w:rPr>
           <w:rFonts w:hint="eastAsia"/>
@@ -17835,7 +17595,7 @@
           <w:color w:val="auto"/>
         </w:rPr>
       </w:pPr>
-      <w:bookmarkStart w:id="23" w:name="_Toc6543"/>
+      <w:bookmarkStart w:id="23" w:name="_Toc29947"/>
       <w:r>
         <w:rPr>
           <w:rFonts w:hint="eastAsia"/>
@@ -18288,7 +18048,7 @@
           <w:rFonts w:hint="eastAsia"/>
         </w:rPr>
       </w:pPr>
-      <w:bookmarkStart w:id="24" w:name="_Toc30969"/>
+      <w:bookmarkStart w:id="24" w:name="_Toc14935"/>
       <w:r>
         <w:rPr>
           <w:rFonts w:hint="eastAsia"/>
@@ -18786,7 +18546,7 @@
           <w:color w:val="auto"/>
         </w:rPr>
       </w:pPr>
-      <w:bookmarkStart w:id="25" w:name="_Toc16057"/>
+      <w:bookmarkStart w:id="25" w:name="_Toc24728"/>
       <w:r>
         <w:rPr>
           <w:rFonts w:hint="eastAsia"/>
@@ -19240,7 +19000,7 @@
           <w:color w:val="auto"/>
         </w:rPr>
       </w:pPr>
-      <w:bookmarkStart w:id="26" w:name="_Toc32110"/>
+      <w:bookmarkStart w:id="26" w:name="_Toc17226"/>
       <w:r>
         <w:rPr>
           <w:rFonts w:hint="eastAsia"/>
@@ -19745,7 +19505,7 @@
           <w:color w:val="auto"/>
         </w:rPr>
       </w:pPr>
-      <w:bookmarkStart w:id="27" w:name="_Toc7583"/>
+      <w:bookmarkStart w:id="27" w:name="_Toc12673"/>
       <w:r>
         <w:rPr>
           <w:rFonts w:hint="eastAsia"/>
@@ -20261,7 +20021,7 @@
           <w:lang w:val="en-US" w:eastAsia="zh-CN"/>
         </w:rPr>
       </w:pPr>
-      <w:bookmarkStart w:id="28" w:name="_Toc17293"/>
+      <w:bookmarkStart w:id="28" w:name="_Toc8162"/>
       <w:r>
         <w:rPr>
           <w:rFonts w:hint="eastAsia"/>
@@ -20756,7 +20516,7 @@
           <w:lang w:val="en-US" w:eastAsia="zh-CN"/>
         </w:rPr>
       </w:pPr>
-      <w:bookmarkStart w:id="29" w:name="_Toc11251"/>
+      <w:bookmarkStart w:id="29" w:name="_Toc30177"/>
       <w:r>
         <w:rPr>
           <w:rFonts w:hint="eastAsia"/>
@@ -21248,7 +21008,7 @@
           <w:color w:val="auto"/>
         </w:rPr>
       </w:pPr>
-      <w:bookmarkStart w:id="30" w:name="_Toc23327"/>
+      <w:bookmarkStart w:id="30" w:name="_Toc27634"/>
       <w:r>
         <w:rPr>
           <w:rFonts w:hint="eastAsia"/>
@@ -21702,7 +21462,7 @@
           <w:color w:val="auto"/>
         </w:rPr>
       </w:pPr>
-      <w:bookmarkStart w:id="31" w:name="_Toc28594"/>
+      <w:bookmarkStart w:id="31" w:name="_Toc20288"/>
       <w:r>
         <w:rPr>
           <w:rFonts w:hint="eastAsia"/>
@@ -22215,7 +21975,7 @@
           <w:color w:val="auto"/>
         </w:rPr>
       </w:pPr>
-      <w:bookmarkStart w:id="32" w:name="_Toc31263"/>
+      <w:bookmarkStart w:id="32" w:name="_Toc3012"/>
       <w:r>
         <w:rPr>
           <w:rFonts w:hint="eastAsia"/>
@@ -22728,7 +22488,7 @@
           <w:rFonts w:hint="eastAsia"/>
         </w:rPr>
       </w:pPr>
-      <w:bookmarkStart w:id="33" w:name="_Toc14106"/>
+      <w:bookmarkStart w:id="33" w:name="_Toc15905"/>
       <w:r>
         <w:rPr>
           <w:rFonts w:hint="eastAsia"/>
@@ -22754,7 +22514,7 @@
           <w:szCs w:val="24"/>
           <w:lang w:val="en-US" w:eastAsia="zh-CN"/>
         </w:rPr>
-        <w:t>DSM系列储罐在线自动计量仪的状态定义如下表。各模式的具体电流与继电器值由安全需求及输出接口设计规定，本节仅定义状态关系。</w:t>
+        <w:t>DSM-Ⅱ系列储罐在线自动计量仪的状态定义如下表。各模式的具体电流与继电器值由安全需求及输出接口设计规定，本节仅定义状态关系。</w:t>
       </w:r>
     </w:p>
     <w:tbl>
@@ -23795,20 +23555,21 @@
       </w:pPr>
       <w:r>
         <w:rPr>
-          <w:rFonts w:hint="default"/>
-          <w:lang w:val="en-US" w:eastAsia="zh-CN"/>
+          <w:rFonts w:hint="eastAsia" w:eastAsia="华文楷体"/>
+          <w:color w:val="auto"/>
+          <w:lang w:eastAsia="zh-CN"/>
         </w:rPr>
         <w:object>
-          <v:shape id="_x0000_i1030" o:spt="75" alt="CG01-CPU2-STATE-TRANSITION-V1.2-R2" type="#_x0000_t75" style="height:289.3pt;width:435.6pt;" o:ole="t" filled="f" o:preferrelative="t" stroked="f" coordsize="21600,21600">
+          <v:shape id="_x0000_i1033" o:spt="75" alt="" type="#_x0000_t75" style="height:264.65pt;width:414.05pt;" o:ole="t" filled="f" o:preferrelative="t" stroked="f" coordsize="21600,21600">
             <v:path/>
             <v:fill on="f" focussize="0,0"/>
             <v:stroke on="f"/>
-            <v:imagedata r:id="rId21" o:title=""/>
-            <o:lock v:ext="edit" aspectratio="f"/>
+            <v:imagedata r:id="rId19" o:title=""/>
+            <o:lock v:ext="edit" aspectratio="t"/>
             <w10:wrap type="none"/>
             <w10:anchorlock/>
           </v:shape>
-          <o:OLEObject Type="Embed" ProgID="Visio.Drawing.15" ShapeID="_x0000_i1030" DrawAspect="Content" ObjectID="_1468075730" r:id="rId20">
+          <o:OLEObject Type="Embed" ProgID="Visio.Drawing.15" ShapeID="_x0000_i1033" DrawAspect="Content" ObjectID="_1468075730" r:id="rId18">
             <o:LockedField>false</o:LockedField>
           </o:OLEObject>
         </w:object>
@@ -23889,7 +23650,7 @@
           <w:szCs w:val="32"/>
           <w:lang w:val="en-US" w:eastAsia="zh-CN"/>
         </w:rPr>
-        <w:t>界位安全测量模式：本模式是唯一安全测量模式，用于油水界位定位／跟随。SIL 配置只允许 DM4 安全协议在安全会话有效且入口检查通过后进入；DSM、LTD 及 DM4 非安全协议不得形成安全有效结果。正常结束或受控停止后返回配置模式；安全测量故障时进入安全故障状态。</w:t>
+        <w:t>界位安全测量模式：本模式是唯一安全测量模式，用于油水界位定位／跟随。SIL 配置只允许 DM4 安全协议在安全会话有效且入口检查通过后进入；DM4 非安全协议不得形成安全有效结果。正常结束或受控停止后返回配置模式；安全测量故障时进入安全故障状态。</w:t>
       </w:r>
     </w:p>
     <w:p>
@@ -24538,6 +24299,8 @@
                 <w:lang w:eastAsia="zh-CN"/>
               </w:rPr>
             </w:pPr>
+            <w:bookmarkStart w:id="34" w:name="_GoBack"/>
+            <w:bookmarkEnd w:id="34"/>
             <w:r>
               <w:rPr>
                 <w:rFonts w:hint="eastAsia"/>
@@ -25092,7 +24855,7 @@
                 <w:vertAlign w:val="baseline"/>
                 <w:lang w:eastAsia="zh-CN"/>
               </w:rPr>
-              <w:t>唯一安全测量模式，用于油水界位定位／跟随；DSM、LTD 和 DM4 非安全协议不得形成安全有效结果。</w:t>
+              <w:t>唯一安全测量模式，用于油水界位定位／跟随； DM4 非安全协议不得形成安全有效结果。</w:t>
             </w:r>
           </w:p>
         </w:tc>
@@ -26261,8 +26024,8 @@
     </w:tblPr>
     <w:tblGrid>
       <w:gridCol w:w="2679"/>
-      <w:gridCol w:w="4316"/>
-      <w:gridCol w:w="1373"/>
+      <w:gridCol w:w="4512"/>
+      <w:gridCol w:w="1177"/>
     </w:tblGrid>
     <w:tr>
       <w:tblPrEx>
@@ -26308,13 +26071,13 @@
       </w:tc>
       <w:tc>
         <w:tcPr>
-          <w:tcW w:w="2578" w:type="pct"/>
+          <w:tcW w:w="2695" w:type="pct"/>
           <w:noWrap w:val="0"/>
           <w:vAlign w:val="top"/>
         </w:tcPr>
         <w:p>
           <w:pPr>
-            <w:jc w:val="center"/>
+            <w:jc w:val="both"/>
             <w:rPr>
               <w:rFonts w:hint="default" w:eastAsia="宋体"/>
               <w:lang w:val="en-US" w:eastAsia="zh-CN"/>
@@ -26322,16 +26085,25 @@
           </w:pPr>
           <w:r>
             <w:rPr>
+              <w:rFonts w:hint="default" w:ascii="Arial" w:hAnsi="Arial" w:eastAsia="楷体" w:cs="Arial"/>
+              <w:b w:val="0"/>
+              <w:bCs w:val="0"/>
+              <w:lang w:val="en-US" w:eastAsia="zh-CN"/>
+            </w:rPr>
+            <w:t>DSM-Ⅱ</w:t>
+          </w:r>
+          <w:r>
+            <w:rPr>
               <w:rFonts w:hint="eastAsia" w:ascii="楷体" w:hAnsi="楷体" w:eastAsia="楷体" w:cs="楷体"/>
               <w:lang w:val="en-US" w:eastAsia="zh-CN"/>
             </w:rPr>
-            <w:t>DSM系列储罐在线自动计量仪产品架构规范</w:t>
+            <w:t>系列储罐在线自动计量仪产品架构规范</w:t>
           </w:r>
         </w:p>
       </w:tc>
       <w:tc>
         <w:tcPr>
-          <w:tcW w:w="820" w:type="pct"/>
+          <w:tcW w:w="703" w:type="pct"/>
           <w:noWrap w:val="0"/>
           <w:vAlign w:val="top"/>
         </w:tcPr>

</xml_diff>